<commit_message>
patched a few fixes related to the seed and updated report
</commit_message>
<xml_diff>
--- a/docs/CSCS_Project_Report.docx
+++ b/docs/CSCS_Project_Report.docx
@@ -426,28 +426,28 @@
         </w:tc>
       </w:tr>
     </w:tbl>
-    <w:p xmlns:wp14="http://schemas.microsoft.com/office/word/2010/wordml" wp14:textId="2AA0431A">
-      <w:pPr>
-        <w:spacing w:before="300"/>
-        <w:rPr>
-          <w:b w:val="1"/>
-          <w:bCs w:val="1"/>
-          <w:i w:val="1"/>
-          <w:iCs w:val="1"/>
-          <w:sz w:val="18"/>
-          <w:szCs w:val="18"/>
-        </w:rPr>
-      </w:pPr>
-      <w:r>
+    <w:p xmlns:wp14="http://schemas.microsoft.com/office/word/2010/wordml" wp14:textId="1059F159">
+      <w:pPr>
+        <w:spacing w:before="300" w:after="200"/>
         <w:rPr>
           <w:b w:val="1"/>
           <w:bCs w:val="1"/>
           <w:sz w:val="18"/>
           <w:szCs w:val="18"/>
+          <w:lang w:val="en-US"/>
+        </w:rPr>
+      </w:pPr>
+      <w:r>
+        <w:rPr>
+          <w:b w:val="1"/>
+          <w:bCs w:val="1"/>
+          <w:sz w:val="18"/>
+          <w:szCs w:val="18"/>
+          <w:lang w:val="en-US"/>
         </w:rPr>
         <w:t xml:space="preserve">Repository: </w:t>
       </w:r>
-      <w:hyperlink r:id="Rf17a58e5addd4085">
+      <w:hyperlink r:id="R3bfaa4f934e743c5">
         <w:r>
           <w:rPr>
             <w:rStyle w:val="Hyperlink"/>
@@ -457,20 +457,90 @@
             <w:iCs w:val="1"/>
             <w:sz w:val="18"/>
             <w:szCs w:val="18"/>
+            <w:lang w:val="en-US"/>
           </w:rPr>
           <w:t>cscs-db-353</w:t>
         </w:r>
       </w:hyperlink>
-    </w:p>
-    <w:p xmlns:wp14="http://schemas.microsoft.com/office/word/2010/wordml" wp14:textId="77777777">
+      <w:r>
+        <w:br/>
+      </w:r>
+      <w:r>
+        <w:rPr>
+          <w:b w:val="1"/>
+          <w:bCs w:val="1"/>
+          <w:sz w:val="18"/>
+          <w:szCs w:val="18"/>
+          <w:lang w:val="en-US"/>
+        </w:rPr>
+        <w:t xml:space="preserve">GUI </w:t>
+      </w:r>
+      <w:r>
+        <w:rPr>
+          <w:b w:val="1"/>
+          <w:bCs w:val="1"/>
+          <w:sz w:val="18"/>
+          <w:szCs w:val="18"/>
+          <w:lang w:val="en-US"/>
+        </w:rPr>
+        <w:t>DataBase</w:t>
+      </w:r>
+      <w:r>
+        <w:rPr>
+          <w:b w:val="1"/>
+          <w:bCs w:val="1"/>
+          <w:sz w:val="18"/>
+          <w:szCs w:val="18"/>
+          <w:lang w:val="en-US"/>
+        </w:rPr>
+        <w:t xml:space="preserve"> Link: </w:t>
+      </w:r>
+      <w:hyperlink r:id="Rc9cf8df9d71b47de">
+        <w:r>
+          <w:rPr>
+            <w:rStyle w:val="Hyperlink"/>
+            <w:b w:val="1"/>
+            <w:bCs w:val="1"/>
+            <w:sz w:val="18"/>
+            <w:szCs w:val="18"/>
+            <w:lang w:val="en-US"/>
+          </w:rPr>
+          <w:t>wqc353.encs.concordia</w:t>
+        </w:r>
+      </w:hyperlink>
+      <w:r>
+        <w:br/>
+      </w:r>
+    </w:p>
+    <w:p xmlns:wp14="http://schemas.microsoft.com/office/word/2010/wordml" wp14:textId="2C238D51">
+      <w:pPr>
+        <w:spacing w:before="300" w:after="200"/>
+      </w:pPr>
+      <w:r>
+        <w:rPr>
+          <w:b w:val="1"/>
+          <w:bCs w:val="1"/>
+          <w:i w:val="1"/>
+          <w:iCs w:val="1"/>
+          <w:sz w:val="18"/>
+          <w:szCs w:val="18"/>
+          <w:lang w:val="en-US"/>
+        </w:rPr>
+        <w:t>The forms are signed and attached at the end of the report</w:t>
+      </w:r>
+    </w:p>
+    <w:p xmlns:wp14="http://schemas.microsoft.com/office/word/2010/wordml" wp14:textId="14B9BB85">
+      <w:pPr>
+        <w:spacing w:before="400" w:after="200"/>
+      </w:pPr>
       <w:r>
         <w:br w:type="page"/>
       </w:r>
     </w:p>
-    <w:p xmlns:wp14="http://schemas.microsoft.com/office/word/2010/wordml" wp14:textId="77777777">
+    <w:p xmlns:wp14="http://schemas.microsoft.com/office/word/2010/wordml" wp14:textId="50986973">
       <w:pPr>
         <w:pStyle w:val="Heading1"/>
-        <w:spacing w:before="400" w:after="200"/>
+        <w:spacing w:before="300" w:after="200"/>
       </w:pPr>
       <w:r>
         <w:rPr/>
@@ -600,6 +670,18 @@
         <w:rPr>
           <w:b w:val="1"/>
           <w:bCs w:val="1"/>
+          <w:lang w:val="en-US"/>
+        </w:rPr>
+      </w:pPr>
+    </w:p>
+    <w:p>
+      <w:pPr>
+        <w:pStyle w:val="Normal"/>
+        <w:spacing w:after="150"/>
+        <w:rPr>
+          <w:b w:val="1"/>
+          <w:bCs w:val="1"/>
+          <w:color w:val="0070C0"/>
           <w:lang w:val="en-US"/>
         </w:rPr>
       </w:pPr>
@@ -5499,3460 +5581,583 @@
         <w:t>The eight required queries below are implemented in sql/03_queries.sql. Each corresponds to one item (i–viii) from the project description.</w:t>
       </w:r>
     </w:p>
+    <w:p>
+      <w:pPr>
+        <w:spacing w:after="150"/>
+        <w:rPr>
+          <w:lang w:val="en-US"/>
+        </w:rPr>
+      </w:pPr>
+      <w:r>
+        <w:drawing>
+          <wp:inline wp14:editId="68C4CAEA" wp14:anchorId="696AA18E">
+            <wp:extent cx="6400800" cy="2686050"/>
+            <wp:effectExtent l="0" t="0" r="0" b="0"/>
+            <wp:docPr id="1173577111" name="drawing"/>
+            <wp:cNvGraphicFramePr>
+              <a:graphicFrameLocks noChangeAspect="1"/>
+            </wp:cNvGraphicFramePr>
+            <a:graphic>
+              <a:graphicData xmlns:a="http://schemas.openxmlformats.org/drawingml/2006/main" uri="http://schemas.openxmlformats.org/drawingml/2006/picture">
+                <pic:pic xmlns:pic="http://schemas.openxmlformats.org/drawingml/2006/picture">
+                  <pic:nvPicPr>
+                    <pic:cNvPr id="1173577111" name="Picture 1173577111"/>
+                    <pic:cNvPicPr/>
+                  </pic:nvPicPr>
+                  <pic:blipFill>
+                    <a:blip xmlns:r="http://schemas.openxmlformats.org/officeDocument/2006/relationships" r:embed="rId1492604656">
+                      <a:extLst>
+                        <a:ext uri="{28A0092B-C50C-407E-A947-70E740481C1C}">
+                          <a14:useLocalDpi xmlns:a14="http://schemas.microsoft.com/office/drawing/2010/main"/>
+                        </a:ext>
+                      </a:extLst>
+                    </a:blip>
+                    <a:stretch>
+                      <a:fillRect/>
+                    </a:stretch>
+                  </pic:blipFill>
+                  <pic:spPr>
+                    <a:xfrm>
+                      <a:off x="0" y="0"/>
+                      <a:ext cx="6400800" cy="2686050"/>
+                    </a:xfrm>
+                    <a:prstGeom prst="rect">
+                      <a:avLst/>
+                    </a:prstGeom>
+                  </pic:spPr>
+                </pic:pic>
+              </a:graphicData>
+            </a:graphic>
+          </wp:inline>
+        </w:drawing>
+      </w:r>
+      <w:r>
+        <w:drawing>
+          <wp:inline wp14:editId="414E777D" wp14:anchorId="2C0C5AA1">
+            <wp:extent cx="6400800" cy="4543425"/>
+            <wp:effectExtent l="0" t="0" r="0" b="0"/>
+            <wp:docPr id="1937354981" name="drawing"/>
+            <wp:cNvGraphicFramePr>
+              <a:graphicFrameLocks noChangeAspect="1"/>
+            </wp:cNvGraphicFramePr>
+            <a:graphic>
+              <a:graphicData xmlns:a="http://schemas.openxmlformats.org/drawingml/2006/main" uri="http://schemas.openxmlformats.org/drawingml/2006/picture">
+                <pic:pic xmlns:pic="http://schemas.openxmlformats.org/drawingml/2006/picture">
+                  <pic:nvPicPr>
+                    <pic:cNvPr id="1937354981" name="Picture 1937354981"/>
+                    <pic:cNvPicPr/>
+                  </pic:nvPicPr>
+                  <pic:blipFill>
+                    <a:blip xmlns:r="http://schemas.openxmlformats.org/officeDocument/2006/relationships" r:embed="rId1225353895">
+                      <a:extLst>
+                        <a:ext uri="{28A0092B-C50C-407E-A947-70E740481C1C}">
+                          <a14:useLocalDpi xmlns:a14="http://schemas.microsoft.com/office/drawing/2010/main"/>
+                        </a:ext>
+                      </a:extLst>
+                    </a:blip>
+                    <a:stretch>
+                      <a:fillRect/>
+                    </a:stretch>
+                  </pic:blipFill>
+                  <pic:spPr>
+                    <a:xfrm>
+                      <a:off x="0" y="0"/>
+                      <a:ext cx="6400800" cy="4543425"/>
+                    </a:xfrm>
+                    <a:prstGeom prst="rect">
+                      <a:avLst/>
+                    </a:prstGeom>
+                  </pic:spPr>
+                </pic:pic>
+              </a:graphicData>
+            </a:graphic>
+          </wp:inline>
+        </w:drawing>
+      </w:r>
+    </w:p>
     <w:p xmlns:wp14="http://schemas.microsoft.com/office/word/2010/wordml" wp14:textId="77777777">
-      <w:pPr>
-        <w:shd w:val="clear" w:color="auto" w:fill="F5F5F5"/>
-        <w:spacing w:after="0"/>
-      </w:pPr>
-      <w:r>
-        <w:rPr>
-          <w:rFonts w:ascii="Consolas" w:hAnsi="Consolas" w:eastAsia="Consolas" w:cs="Consolas"/>
-          <w:sz w:val="15"/>
-          <w:szCs w:val="15"/>
-          <w:lang w:val="en-US"/>
-        </w:rPr>
-        <w:t>-- Query (i): Complete details for every location</w:t>
-      </w:r>
-    </w:p>
-    <w:p xmlns:wp14="http://schemas.microsoft.com/office/word/2010/wordml" wp14:textId="77777777">
-      <w:pPr>
-        <w:shd w:val="clear" w:fill="F5F5F5"/>
-        <w:spacing w:after="0"/>
-      </w:pPr>
-      <w:r>
-        <w:rPr>
-          <w:rFonts w:ascii="Consolas" w:hAnsi="Consolas" w:eastAsia="Consolas" w:cs="Consolas"/>
-          <w:sz w:val="15"/>
-          <w:szCs w:val="15"/>
-        </w:rPr>
-        <w:t xml:space="preserve"> </w:t>
-      </w:r>
-    </w:p>
-    <w:p xmlns:wp14="http://schemas.microsoft.com/office/word/2010/wordml" wp14:textId="77777777">
-      <w:pPr>
-        <w:shd w:val="clear" w:fill="F5F5F5"/>
-        <w:spacing w:after="0"/>
-      </w:pPr>
-      <w:r>
-        <w:rPr>
-          <w:rFonts w:ascii="Consolas" w:hAnsi="Consolas" w:eastAsia="Consolas" w:cs="Consolas"/>
-          <w:sz w:val="15"/>
-          <w:szCs w:val="15"/>
-        </w:rPr>
-        <w:t xml:space="preserve">WITH Phones AS (</w:t>
-      </w:r>
-    </w:p>
-    <w:p xmlns:wp14="http://schemas.microsoft.com/office/word/2010/wordml" wp14:textId="77777777">
-      <w:pPr>
-        <w:shd w:val="clear" w:color="auto" w:fill="F5F5F5"/>
-        <w:spacing w:after="0"/>
-      </w:pPr>
-      <w:r>
-        <w:rPr>
-          <w:rFonts w:ascii="Consolas" w:hAnsi="Consolas" w:eastAsia="Consolas" w:cs="Consolas"/>
-          <w:sz w:val="15"/>
-          <w:szCs w:val="15"/>
-          <w:lang w:val="en-US"/>
-        </w:rPr>
-        <w:t xml:space="preserve">    SELECT location_id, GROUP_CONCAT(phone_number SEPARATOR ', ') AS phone_numbers</w:t>
-      </w:r>
-    </w:p>
-    <w:p xmlns:wp14="http://schemas.microsoft.com/office/word/2010/wordml" wp14:textId="77777777">
-      <w:pPr>
-        <w:shd w:val="clear" w:color="auto" w:fill="F5F5F5"/>
-        <w:spacing w:after="0"/>
-      </w:pPr>
-      <w:r>
-        <w:rPr>
-          <w:rFonts w:ascii="Consolas" w:hAnsi="Consolas" w:eastAsia="Consolas" w:cs="Consolas"/>
-          <w:sz w:val="15"/>
-          <w:szCs w:val="15"/>
-          <w:lang w:val="en-US"/>
-        </w:rPr>
-        <w:t xml:space="preserve">    FROM LocationPhone</w:t>
-      </w:r>
-    </w:p>
-    <w:p xmlns:wp14="http://schemas.microsoft.com/office/word/2010/wordml" wp14:textId="77777777">
-      <w:pPr>
-        <w:shd w:val="clear" w:color="auto" w:fill="F5F5F5"/>
-        <w:spacing w:after="0"/>
-      </w:pPr>
-      <w:r>
-        <w:rPr>
-          <w:rFonts w:ascii="Consolas" w:hAnsi="Consolas" w:eastAsia="Consolas" w:cs="Consolas"/>
-          <w:sz w:val="15"/>
-          <w:szCs w:val="15"/>
-          <w:lang w:val="en-US"/>
-        </w:rPr>
-        <w:t xml:space="preserve">    GROUP BY location_id</w:t>
-      </w:r>
-    </w:p>
-    <w:p xmlns:wp14="http://schemas.microsoft.com/office/word/2010/wordml" wp14:textId="77777777">
-      <w:pPr>
-        <w:shd w:val="clear" w:fill="F5F5F5"/>
-        <w:spacing w:after="0"/>
-      </w:pPr>
-      <w:r>
-        <w:rPr>
-          <w:rFonts w:ascii="Consolas" w:hAnsi="Consolas" w:eastAsia="Consolas" w:cs="Consolas"/>
-          <w:sz w:val="15"/>
-          <w:szCs w:val="15"/>
-        </w:rPr>
-        <w:t xml:space="preserve">),</w:t>
-      </w:r>
-    </w:p>
-    <w:p xmlns:wp14="http://schemas.microsoft.com/office/word/2010/wordml" wp14:textId="77777777">
-      <w:pPr>
-        <w:shd w:val="clear" w:fill="F5F5F5"/>
-        <w:spacing w:after="0"/>
-      </w:pPr>
-      <w:r>
-        <w:rPr>
-          <w:rFonts w:ascii="Consolas" w:hAnsi="Consolas" w:eastAsia="Consolas" w:cs="Consolas"/>
-          <w:sz w:val="15"/>
-          <w:szCs w:val="15"/>
-        </w:rPr>
-        <w:t xml:space="preserve">GM AS (</w:t>
-      </w:r>
-    </w:p>
-    <w:p xmlns:wp14="http://schemas.microsoft.com/office/word/2010/wordml" wp14:textId="77777777">
-      <w:pPr>
-        <w:shd w:val="clear" w:color="auto" w:fill="F5F5F5"/>
-        <w:spacing w:after="0"/>
-      </w:pPr>
-      <w:r>
-        <w:rPr>
-          <w:rFonts w:ascii="Consolas" w:hAnsi="Consolas" w:eastAsia="Consolas" w:cs="Consolas"/>
-          <w:sz w:val="15"/>
-          <w:szCs w:val="15"/>
-          <w:lang w:val="en-US"/>
-        </w:rPr>
-        <w:t xml:space="preserve">    SELECT pa.location_id,</w:t>
-      </w:r>
-    </w:p>
-    <w:p xmlns:wp14="http://schemas.microsoft.com/office/word/2010/wordml" wp14:textId="77777777">
-      <w:pPr>
-        <w:shd w:val="clear" w:color="auto" w:fill="F5F5F5"/>
-        <w:spacing w:after="0"/>
-      </w:pPr>
-      <w:r>
-        <w:rPr>
-          <w:rFonts w:ascii="Consolas" w:hAnsi="Consolas" w:eastAsia="Consolas" w:cs="Consolas"/>
-          <w:sz w:val="15"/>
-          <w:szCs w:val="15"/>
-          <w:lang w:val="en-US"/>
-        </w:rPr>
-        <w:t xml:space="preserve">           CONCAT(p.first_name, ' ', p.last_name) AS gm_name</w:t>
-      </w:r>
-    </w:p>
-    <w:p xmlns:wp14="http://schemas.microsoft.com/office/word/2010/wordml" wp14:textId="77777777">
-      <w:pPr>
-        <w:shd w:val="clear" w:fill="F5F5F5"/>
-        <w:spacing w:after="0"/>
-      </w:pPr>
-      <w:r>
-        <w:rPr>
-          <w:rFonts w:ascii="Consolas" w:hAnsi="Consolas" w:eastAsia="Consolas" w:cs="Consolas"/>
-          <w:sz w:val="15"/>
-          <w:szCs w:val="15"/>
-        </w:rPr>
-        <w:t xml:space="preserve">    FROM PersonnelAssignment pa</w:t>
-      </w:r>
-    </w:p>
-    <w:p xmlns:wp14="http://schemas.microsoft.com/office/word/2010/wordml" wp14:textId="77777777">
-      <w:pPr>
-        <w:shd w:val="clear" w:color="auto" w:fill="F5F5F5"/>
-        <w:spacing w:after="0"/>
-      </w:pPr>
-      <w:r>
-        <w:rPr>
-          <w:rFonts w:ascii="Consolas" w:hAnsi="Consolas" w:eastAsia="Consolas" w:cs="Consolas"/>
-          <w:sz w:val="15"/>
-          <w:szCs w:val="15"/>
-          <w:lang w:val="en-US"/>
-        </w:rPr>
-        <w:t xml:space="preserve">    JOIN Personnel p ON p.personnel_id = pa.personnel_id</w:t>
-      </w:r>
-    </w:p>
-    <w:p xmlns:wp14="http://schemas.microsoft.com/office/word/2010/wordml" wp14:textId="77777777">
-      <w:pPr>
-        <w:shd w:val="clear" w:color="auto" w:fill="F5F5F5"/>
-        <w:spacing w:after="0"/>
-      </w:pPr>
-      <w:r>
-        <w:rPr>
-          <w:rFonts w:ascii="Consolas" w:hAnsi="Consolas" w:eastAsia="Consolas" w:cs="Consolas"/>
-          <w:sz w:val="15"/>
-          <w:szCs w:val="15"/>
-          <w:lang w:val="en-US"/>
-        </w:rPr>
-        <w:t xml:space="preserve">    WHERE p.role = 'General Manager'</w:t>
-      </w:r>
-    </w:p>
-    <w:p xmlns:wp14="http://schemas.microsoft.com/office/word/2010/wordml" wp14:textId="77777777">
-      <w:pPr>
-        <w:shd w:val="clear" w:color="auto" w:fill="F5F5F5"/>
-        <w:spacing w:after="0"/>
-      </w:pPr>
-      <w:r>
-        <w:rPr>
-          <w:rFonts w:ascii="Consolas" w:hAnsi="Consolas" w:eastAsia="Consolas" w:cs="Consolas"/>
-          <w:sz w:val="15"/>
-          <w:szCs w:val="15"/>
-          <w:lang w:val="en-US"/>
-        </w:rPr>
-        <w:t xml:space="preserve">      AND pa.end_date IS NULL</w:t>
-      </w:r>
-    </w:p>
-    <w:p xmlns:wp14="http://schemas.microsoft.com/office/word/2010/wordml" wp14:textId="77777777">
-      <w:pPr>
-        <w:shd w:val="clear" w:fill="F5F5F5"/>
-        <w:spacing w:after="0"/>
-      </w:pPr>
-      <w:r>
-        <w:rPr>
-          <w:rFonts w:ascii="Consolas" w:hAnsi="Consolas" w:eastAsia="Consolas" w:cs="Consolas"/>
-          <w:sz w:val="15"/>
-          <w:szCs w:val="15"/>
-        </w:rPr>
-        <w:t xml:space="preserve">),</w:t>
-      </w:r>
-    </w:p>
-    <w:p xmlns:wp14="http://schemas.microsoft.com/office/word/2010/wordml" wp14:textId="77777777">
-      <w:pPr>
-        <w:shd w:val="clear" w:color="auto" w:fill="F5F5F5"/>
-        <w:spacing w:after="0"/>
-      </w:pPr>
-      <w:r>
-        <w:rPr>
-          <w:rFonts w:ascii="Consolas" w:hAnsi="Consolas" w:eastAsia="Consolas" w:cs="Consolas"/>
-          <w:sz w:val="15"/>
-          <w:szCs w:val="15"/>
-          <w:lang w:val="en-US"/>
-        </w:rPr>
-        <w:t>PersonnelCount AS (</w:t>
-      </w:r>
-    </w:p>
-    <w:p xmlns:wp14="http://schemas.microsoft.com/office/word/2010/wordml" wp14:textId="77777777">
-      <w:pPr>
-        <w:shd w:val="clear" w:color="auto" w:fill="F5F5F5"/>
-        <w:spacing w:after="0"/>
-      </w:pPr>
-      <w:r>
-        <w:rPr>
-          <w:rFonts w:ascii="Consolas" w:hAnsi="Consolas" w:eastAsia="Consolas" w:cs="Consolas"/>
-          <w:sz w:val="15"/>
-          <w:szCs w:val="15"/>
-          <w:lang w:val="en-US"/>
-        </w:rPr>
-        <w:t xml:space="preserve">    SELECT location_id, COUNT(DISTINCT personnel_id) AS num_personnel</w:t>
-      </w:r>
-    </w:p>
-    <w:p xmlns:wp14="http://schemas.microsoft.com/office/word/2010/wordml" wp14:textId="77777777">
-      <w:pPr>
-        <w:shd w:val="clear" w:fill="F5F5F5"/>
-        <w:spacing w:after="0"/>
-      </w:pPr>
-      <w:r>
-        <w:rPr>
-          <w:rFonts w:ascii="Consolas" w:hAnsi="Consolas" w:eastAsia="Consolas" w:cs="Consolas"/>
-          <w:sz w:val="15"/>
-          <w:szCs w:val="15"/>
-        </w:rPr>
-        <w:t xml:space="preserve">    FROM PersonnelAssignment</w:t>
-      </w:r>
-    </w:p>
-    <w:p xmlns:wp14="http://schemas.microsoft.com/office/word/2010/wordml" wp14:textId="77777777">
-      <w:pPr>
-        <w:shd w:val="clear" w:color="auto" w:fill="F5F5F5"/>
-        <w:spacing w:after="0"/>
-      </w:pPr>
-      <w:r>
-        <w:rPr>
-          <w:rFonts w:ascii="Consolas" w:hAnsi="Consolas" w:eastAsia="Consolas" w:cs="Consolas"/>
-          <w:sz w:val="15"/>
-          <w:szCs w:val="15"/>
-          <w:lang w:val="en-US"/>
-        </w:rPr>
-        <w:t xml:space="preserve">    WHERE end_date IS NULL</w:t>
-      </w:r>
-    </w:p>
-    <w:p xmlns:wp14="http://schemas.microsoft.com/office/word/2010/wordml" wp14:textId="77777777">
-      <w:pPr>
-        <w:shd w:val="clear" w:color="auto" w:fill="F5F5F5"/>
-        <w:spacing w:after="0"/>
-      </w:pPr>
-      <w:r>
-        <w:rPr>
-          <w:rFonts w:ascii="Consolas" w:hAnsi="Consolas" w:eastAsia="Consolas" w:cs="Consolas"/>
-          <w:sz w:val="15"/>
-          <w:szCs w:val="15"/>
-          <w:lang w:val="en-US"/>
-        </w:rPr>
-        <w:t xml:space="preserve">    GROUP BY location_id</w:t>
-      </w:r>
-    </w:p>
-    <w:p xmlns:wp14="http://schemas.microsoft.com/office/word/2010/wordml" wp14:textId="77777777">
-      <w:pPr>
-        <w:shd w:val="clear" w:fill="F5F5F5"/>
-        <w:spacing w:after="0"/>
-      </w:pPr>
-      <w:r>
-        <w:rPr>
-          <w:rFonts w:ascii="Consolas" w:hAnsi="Consolas" w:eastAsia="Consolas" w:cs="Consolas"/>
-          <w:sz w:val="15"/>
-          <w:szCs w:val="15"/>
-        </w:rPr>
-        <w:t xml:space="preserve">),</w:t>
-      </w:r>
-    </w:p>
-    <w:p xmlns:wp14="http://schemas.microsoft.com/office/word/2010/wordml" wp14:textId="77777777">
-      <w:pPr>
-        <w:shd w:val="clear" w:color="auto" w:fill="F5F5F5"/>
-        <w:spacing w:after="0"/>
-      </w:pPr>
-      <w:r>
-        <w:rPr>
-          <w:rFonts w:ascii="Consolas" w:hAnsi="Consolas" w:eastAsia="Consolas" w:cs="Consolas"/>
-          <w:sz w:val="15"/>
-          <w:szCs w:val="15"/>
-          <w:lang w:val="en-US"/>
-        </w:rPr>
-        <w:t>MemberCount AS (</w:t>
-      </w:r>
-    </w:p>
-    <w:p xmlns:wp14="http://schemas.microsoft.com/office/word/2010/wordml" wp14:textId="77777777">
-      <w:pPr>
-        <w:shd w:val="clear" w:color="auto" w:fill="F5F5F5"/>
-        <w:spacing w:after="0"/>
-      </w:pPr>
-      <w:r>
-        <w:rPr>
-          <w:rFonts w:ascii="Consolas" w:hAnsi="Consolas" w:eastAsia="Consolas" w:cs="Consolas"/>
-          <w:sz w:val="15"/>
-          <w:szCs w:val="15"/>
-          <w:lang w:val="en-US"/>
-        </w:rPr>
-        <w:t xml:space="preserve">    SELECT location_id, COUNT(*) AS num_club_members</w:t>
-      </w:r>
-    </w:p>
-    <w:p xmlns:wp14="http://schemas.microsoft.com/office/word/2010/wordml" wp14:textId="77777777">
-      <w:pPr>
-        <w:shd w:val="clear" w:color="auto" w:fill="F5F5F5"/>
-        <w:spacing w:after="0"/>
-      </w:pPr>
-      <w:r>
-        <w:rPr>
-          <w:rFonts w:ascii="Consolas" w:hAnsi="Consolas" w:eastAsia="Consolas" w:cs="Consolas"/>
-          <w:sz w:val="15"/>
-          <w:szCs w:val="15"/>
-          <w:lang w:val="en-US"/>
-        </w:rPr>
-        <w:t xml:space="preserve">    FROM ClubMember</w:t>
-      </w:r>
-    </w:p>
-    <w:p xmlns:wp14="http://schemas.microsoft.com/office/word/2010/wordml" wp14:textId="77777777">
-      <w:pPr>
-        <w:shd w:val="clear" w:color="auto" w:fill="F5F5F5"/>
-        <w:spacing w:after="0"/>
-      </w:pPr>
-      <w:r>
-        <w:rPr>
-          <w:rFonts w:ascii="Consolas" w:hAnsi="Consolas" w:eastAsia="Consolas" w:cs="Consolas"/>
-          <w:sz w:val="15"/>
-          <w:szCs w:val="15"/>
-          <w:lang w:val="en-US"/>
-        </w:rPr>
-        <w:t xml:space="preserve">    GROUP BY location_id</w:t>
-      </w:r>
-    </w:p>
-    <w:p xmlns:wp14="http://schemas.microsoft.com/office/word/2010/wordml" wp14:textId="77777777">
-      <w:pPr>
-        <w:shd w:val="clear" w:fill="F5F5F5"/>
-        <w:spacing w:after="0"/>
-      </w:pPr>
-      <w:r>
-        <w:rPr>
-          <w:rFonts w:ascii="Consolas" w:hAnsi="Consolas" w:eastAsia="Consolas" w:cs="Consolas"/>
-          <w:sz w:val="15"/>
-          <w:szCs w:val="15"/>
-        </w:rPr>
-        <w:t xml:space="preserve">),</w:t>
-      </w:r>
-    </w:p>
-    <w:p xmlns:wp14="http://schemas.microsoft.com/office/word/2010/wordml" wp14:textId="77777777">
-      <w:pPr>
-        <w:shd w:val="clear" w:color="auto" w:fill="F5F5F5"/>
-        <w:spacing w:after="0"/>
-      </w:pPr>
-      <w:r>
-        <w:rPr>
-          <w:rFonts w:ascii="Consolas" w:hAnsi="Consolas" w:eastAsia="Consolas" w:cs="Consolas"/>
-          <w:sz w:val="15"/>
-          <w:szCs w:val="15"/>
-          <w:lang w:val="en-US"/>
-        </w:rPr>
-        <w:t>FifaMemberCount AS (</w:t>
-      </w:r>
-    </w:p>
-    <w:p xmlns:wp14="http://schemas.microsoft.com/office/word/2010/wordml" wp14:textId="77777777">
-      <w:pPr>
-        <w:shd w:val="clear" w:color="auto" w:fill="F5F5F5"/>
-        <w:spacing w:after="0"/>
-      </w:pPr>
-      <w:r>
-        <w:rPr>
-          <w:rFonts w:ascii="Consolas" w:hAnsi="Consolas" w:eastAsia="Consolas" w:cs="Consolas"/>
-          <w:sz w:val="15"/>
-          <w:szCs w:val="15"/>
-          <w:lang w:val="en-US"/>
-        </w:rPr>
-        <w:t xml:space="preserve">    SELECT cm.location_id, COUNT(DISTINCT fp.membership_number) AS num_fifa_players</w:t>
-      </w:r>
-    </w:p>
-    <w:p xmlns:wp14="http://schemas.microsoft.com/office/word/2010/wordml" wp14:textId="77777777">
-      <w:pPr>
-        <w:shd w:val="clear" w:color="auto" w:fill="F5F5F5"/>
-        <w:spacing w:after="0"/>
-      </w:pPr>
-      <w:r>
-        <w:rPr>
-          <w:rFonts w:ascii="Consolas" w:hAnsi="Consolas" w:eastAsia="Consolas" w:cs="Consolas"/>
-          <w:sz w:val="15"/>
-          <w:szCs w:val="15"/>
-          <w:lang w:val="en-US"/>
-        </w:rPr>
-        <w:t xml:space="preserve">    FROM ClubMember cm</w:t>
-      </w:r>
-    </w:p>
-    <w:p xmlns:wp14="http://schemas.microsoft.com/office/word/2010/wordml" wp14:textId="77777777">
-      <w:pPr>
-        <w:shd w:val="clear" w:color="auto" w:fill="F5F5F5"/>
-        <w:spacing w:after="0"/>
-      </w:pPr>
-      <w:r>
-        <w:rPr>
-          <w:rFonts w:ascii="Consolas" w:hAnsi="Consolas" w:eastAsia="Consolas" w:cs="Consolas"/>
-          <w:sz w:val="15"/>
-          <w:szCs w:val="15"/>
-          <w:lang w:val="en-US"/>
-        </w:rPr>
-        <w:t xml:space="preserve">    JOIN FIFAParticipation fp ON fp.membership_number = cm.membership_number</w:t>
-      </w:r>
-    </w:p>
-    <w:p xmlns:wp14="http://schemas.microsoft.com/office/word/2010/wordml" wp14:textId="77777777">
-      <w:pPr>
-        <w:shd w:val="clear" w:color="auto" w:fill="F5F5F5"/>
-        <w:spacing w:after="0"/>
-      </w:pPr>
-      <w:r>
-        <w:rPr>
-          <w:rFonts w:ascii="Consolas" w:hAnsi="Consolas" w:eastAsia="Consolas" w:cs="Consolas"/>
-          <w:sz w:val="15"/>
-          <w:szCs w:val="15"/>
-          <w:lang w:val="en-US"/>
-        </w:rPr>
-        <w:t xml:space="preserve">    GROUP BY cm.location_id</w:t>
-      </w:r>
-    </w:p>
-    <w:p xmlns:wp14="http://schemas.microsoft.com/office/word/2010/wordml" wp14:textId="77777777">
-      <w:pPr>
-        <w:shd w:val="clear" w:fill="F5F5F5"/>
-        <w:spacing w:after="0"/>
-      </w:pPr>
-      <w:r>
-        <w:rPr>
-          <w:rFonts w:ascii="Consolas" w:hAnsi="Consolas" w:eastAsia="Consolas" w:cs="Consolas"/>
-          <w:sz w:val="15"/>
-          <w:szCs w:val="15"/>
-        </w:rPr>
-        <w:t xml:space="preserve">)</w:t>
-      </w:r>
-    </w:p>
-    <w:p xmlns:wp14="http://schemas.microsoft.com/office/word/2010/wordml" wp14:textId="77777777">
-      <w:pPr>
-        <w:shd w:val="clear" w:fill="F5F5F5"/>
-        <w:spacing w:after="0"/>
-      </w:pPr>
-      <w:r>
-        <w:rPr>
-          <w:rFonts w:ascii="Consolas" w:hAnsi="Consolas" w:eastAsia="Consolas" w:cs="Consolas"/>
-          <w:sz w:val="15"/>
-          <w:szCs w:val="15"/>
-        </w:rPr>
-        <w:t xml:space="preserve">SELECT</w:t>
-      </w:r>
-    </w:p>
-    <w:p xmlns:wp14="http://schemas.microsoft.com/office/word/2010/wordml" wp14:textId="77777777">
-      <w:pPr>
-        <w:shd w:val="clear" w:color="auto" w:fill="F5F5F5"/>
-        <w:spacing w:after="0"/>
-      </w:pPr>
-      <w:r>
-        <w:rPr>
-          <w:rFonts w:ascii="Consolas" w:hAnsi="Consolas" w:eastAsia="Consolas" w:cs="Consolas"/>
-          <w:sz w:val="15"/>
-          <w:szCs w:val="15"/>
-          <w:lang w:val="en-US"/>
-        </w:rPr>
-        <w:t xml:space="preserve">    l.name          AS location_name,</w:t>
-      </w:r>
-    </w:p>
-    <w:p xmlns:wp14="http://schemas.microsoft.com/office/word/2010/wordml" wp14:textId="77777777">
-      <w:pPr>
-        <w:shd w:val="clear" w:color="auto" w:fill="F5F5F5"/>
-        <w:spacing w:after="0"/>
-      </w:pPr>
-      <w:r>
-        <w:rPr>
-          <w:rFonts w:ascii="Consolas" w:hAnsi="Consolas" w:eastAsia="Consolas" w:cs="Consolas"/>
-          <w:sz w:val="15"/>
-          <w:szCs w:val="15"/>
-          <w:lang w:val="en-US"/>
-        </w:rPr>
-        <w:t xml:space="preserve">    l.address,</w:t>
-      </w:r>
-    </w:p>
-    <w:p xmlns:wp14="http://schemas.microsoft.com/office/word/2010/wordml" wp14:textId="77777777">
-      <w:pPr>
-        <w:shd w:val="clear" w:color="auto" w:fill="F5F5F5"/>
-        <w:spacing w:after="0"/>
-      </w:pPr>
-      <w:r>
-        <w:rPr>
-          <w:rFonts w:ascii="Consolas" w:hAnsi="Consolas" w:eastAsia="Consolas" w:cs="Consolas"/>
-          <w:sz w:val="15"/>
-          <w:szCs w:val="15"/>
-          <w:lang w:val="en-US"/>
-        </w:rPr>
-        <w:t xml:space="preserve">    l.city,</w:t>
-      </w:r>
-    </w:p>
-    <w:p xmlns:wp14="http://schemas.microsoft.com/office/word/2010/wordml" wp14:textId="77777777">
-      <w:pPr>
-        <w:shd w:val="clear" w:color="auto" w:fill="F5F5F5"/>
-        <w:spacing w:after="0"/>
-      </w:pPr>
-      <w:r>
-        <w:rPr>
-          <w:rFonts w:ascii="Consolas" w:hAnsi="Consolas" w:eastAsia="Consolas" w:cs="Consolas"/>
-          <w:sz w:val="15"/>
-          <w:szCs w:val="15"/>
-          <w:lang w:val="en-US"/>
-        </w:rPr>
-        <w:t xml:space="preserve">    l.province,</w:t>
-      </w:r>
-    </w:p>
-    <w:p xmlns:wp14="http://schemas.microsoft.com/office/word/2010/wordml" wp14:textId="77777777">
-      <w:pPr>
-        <w:shd w:val="clear" w:color="auto" w:fill="F5F5F5"/>
-        <w:spacing w:after="0"/>
-      </w:pPr>
-      <w:r>
-        <w:rPr>
-          <w:rFonts w:ascii="Consolas" w:hAnsi="Consolas" w:eastAsia="Consolas" w:cs="Consolas"/>
-          <w:sz w:val="15"/>
-          <w:szCs w:val="15"/>
-          <w:lang w:val="en-US"/>
-        </w:rPr>
-        <w:t xml:space="preserve">    l.postal_code,</w:t>
-      </w:r>
-    </w:p>
-    <w:p xmlns:wp14="http://schemas.microsoft.com/office/word/2010/wordml" wp14:textId="77777777">
-      <w:pPr>
-        <w:shd w:val="clear" w:color="auto" w:fill="F5F5F5"/>
-        <w:spacing w:after="0"/>
-      </w:pPr>
-      <w:r>
-        <w:rPr>
-          <w:rFonts w:ascii="Consolas" w:hAnsi="Consolas" w:eastAsia="Consolas" w:cs="Consolas"/>
-          <w:sz w:val="15"/>
-          <w:szCs w:val="15"/>
-          <w:lang w:val="en-US"/>
-        </w:rPr>
-        <w:t xml:space="preserve">    ph.phone_numbers,</w:t>
-      </w:r>
-    </w:p>
-    <w:p xmlns:wp14="http://schemas.microsoft.com/office/word/2010/wordml" wp14:textId="77777777">
-      <w:pPr>
-        <w:shd w:val="clear" w:color="auto" w:fill="F5F5F5"/>
-        <w:spacing w:after="0"/>
-      </w:pPr>
-      <w:r>
-        <w:rPr>
-          <w:rFonts w:ascii="Consolas" w:hAnsi="Consolas" w:eastAsia="Consolas" w:cs="Consolas"/>
-          <w:sz w:val="15"/>
-          <w:szCs w:val="15"/>
-          <w:lang w:val="en-US"/>
-        </w:rPr>
-        <w:t xml:space="preserve">    l.web_address,</w:t>
-      </w:r>
-    </w:p>
-    <w:p xmlns:wp14="http://schemas.microsoft.com/office/word/2010/wordml" wp14:textId="77777777">
-      <w:pPr>
-        <w:shd w:val="clear" w:color="auto" w:fill="F5F5F5"/>
-        <w:spacing w:after="0"/>
-      </w:pPr>
-      <w:r>
-        <w:rPr>
-          <w:rFonts w:ascii="Consolas" w:hAnsi="Consolas" w:eastAsia="Consolas" w:cs="Consolas"/>
-          <w:sz w:val="15"/>
-          <w:szCs w:val="15"/>
-          <w:lang w:val="en-US"/>
-        </w:rPr>
-        <w:t xml:space="preserve">    l.location_type,</w:t>
-      </w:r>
-    </w:p>
-    <w:p xmlns:wp14="http://schemas.microsoft.com/office/word/2010/wordml" wp14:textId="77777777">
-      <w:pPr>
-        <w:shd w:val="clear" w:color="auto" w:fill="F5F5F5"/>
-        <w:spacing w:after="0"/>
-      </w:pPr>
-      <w:r>
-        <w:rPr>
-          <w:rFonts w:ascii="Consolas" w:hAnsi="Consolas" w:eastAsia="Consolas" w:cs="Consolas"/>
-          <w:sz w:val="15"/>
-          <w:szCs w:val="15"/>
-          <w:lang w:val="en-US"/>
-        </w:rPr>
-        <w:t xml:space="preserve">    l.capacity,</w:t>
-      </w:r>
-    </w:p>
-    <w:p xmlns:wp14="http://schemas.microsoft.com/office/word/2010/wordml" wp14:textId="77777777">
-      <w:pPr>
-        <w:shd w:val="clear" w:color="auto" w:fill="F5F5F5"/>
-        <w:spacing w:after="0"/>
-      </w:pPr>
-      <w:r>
-        <w:rPr>
-          <w:rFonts w:ascii="Consolas" w:hAnsi="Consolas" w:eastAsia="Consolas" w:cs="Consolas"/>
-          <w:sz w:val="15"/>
-          <w:szCs w:val="15"/>
-          <w:lang w:val="en-US"/>
-        </w:rPr>
-        <w:t xml:space="preserve">    gm.gm_name       AS general_manager,</w:t>
-      </w:r>
-    </w:p>
-    <w:p xmlns:wp14="http://schemas.microsoft.com/office/word/2010/wordml" wp14:textId="77777777">
-      <w:pPr>
-        <w:shd w:val="clear" w:color="auto" w:fill="F5F5F5"/>
-        <w:spacing w:after="0"/>
-      </w:pPr>
-      <w:r>
-        <w:rPr>
-          <w:rFonts w:ascii="Consolas" w:hAnsi="Consolas" w:eastAsia="Consolas" w:cs="Consolas"/>
-          <w:sz w:val="15"/>
-          <w:szCs w:val="15"/>
-          <w:lang w:val="en-US"/>
-        </w:rPr>
-        <w:t xml:space="preserve">    COALESCE(pc.num_personnel, 0)    AS num_personnel,</w:t>
-      </w:r>
-    </w:p>
-    <w:p xmlns:wp14="http://schemas.microsoft.com/office/word/2010/wordml" wp14:textId="77777777">
-      <w:pPr>
-        <w:shd w:val="clear" w:color="auto" w:fill="F5F5F5"/>
-        <w:spacing w:after="0"/>
-      </w:pPr>
-      <w:r>
-        <w:rPr>
-          <w:rFonts w:ascii="Consolas" w:hAnsi="Consolas" w:eastAsia="Consolas" w:cs="Consolas"/>
-          <w:sz w:val="15"/>
-          <w:szCs w:val="15"/>
-          <w:lang w:val="en-US"/>
-        </w:rPr>
-        <w:t xml:space="preserve">    COALESCE(mc.num_club_members, 0) AS num_club_members,</w:t>
-      </w:r>
-    </w:p>
-    <w:p xmlns:wp14="http://schemas.microsoft.com/office/word/2010/wordml" wp14:textId="77777777">
-      <w:pPr>
-        <w:shd w:val="clear" w:color="auto" w:fill="F5F5F5"/>
-        <w:spacing w:after="0"/>
-      </w:pPr>
-      <w:r>
-        <w:rPr>
-          <w:rFonts w:ascii="Consolas" w:hAnsi="Consolas" w:eastAsia="Consolas" w:cs="Consolas"/>
-          <w:sz w:val="15"/>
-          <w:szCs w:val="15"/>
-          <w:lang w:val="en-US"/>
-        </w:rPr>
-        <w:t xml:space="preserve">    COALESCE(fc.num_fifa_players, 0) AS num_fifa_players</w:t>
-      </w:r>
-    </w:p>
-    <w:p xmlns:wp14="http://schemas.microsoft.com/office/word/2010/wordml" wp14:textId="77777777">
-      <w:pPr>
-        <w:shd w:val="clear" w:fill="F5F5F5"/>
-        <w:spacing w:after="0"/>
-      </w:pPr>
-      <w:r>
-        <w:rPr>
-          <w:rFonts w:ascii="Consolas" w:hAnsi="Consolas" w:eastAsia="Consolas" w:cs="Consolas"/>
-          <w:sz w:val="15"/>
-          <w:szCs w:val="15"/>
-        </w:rPr>
-        <w:t xml:space="preserve">FROM Location l</w:t>
-      </w:r>
-    </w:p>
-    <w:p xmlns:wp14="http://schemas.microsoft.com/office/word/2010/wordml" wp14:textId="77777777">
-      <w:pPr>
-        <w:shd w:val="clear" w:color="auto" w:fill="F5F5F5"/>
-        <w:spacing w:after="0"/>
-      </w:pPr>
-      <w:r>
-        <w:rPr>
-          <w:rFonts w:ascii="Consolas" w:hAnsi="Consolas" w:eastAsia="Consolas" w:cs="Consolas"/>
-          <w:sz w:val="15"/>
-          <w:szCs w:val="15"/>
-          <w:lang w:val="en-US"/>
-        </w:rPr>
-        <w:t>LEFT JOIN Phones ph           ON ph.location_id = l.location_id</w:t>
-      </w:r>
-    </w:p>
-    <w:p xmlns:wp14="http://schemas.microsoft.com/office/word/2010/wordml" wp14:textId="77777777">
-      <w:pPr>
-        <w:shd w:val="clear" w:color="auto" w:fill="F5F5F5"/>
-        <w:spacing w:after="0"/>
-      </w:pPr>
-      <w:r>
-        <w:rPr>
-          <w:rFonts w:ascii="Consolas" w:hAnsi="Consolas" w:eastAsia="Consolas" w:cs="Consolas"/>
-          <w:sz w:val="15"/>
-          <w:szCs w:val="15"/>
-          <w:lang w:val="en-US"/>
-        </w:rPr>
-        <w:t>LEFT JOIN GM gm                ON gm.location_id = l.location_id</w:t>
-      </w:r>
-    </w:p>
-    <w:p xmlns:wp14="http://schemas.microsoft.com/office/word/2010/wordml" wp14:textId="77777777">
-      <w:pPr>
-        <w:shd w:val="clear" w:color="auto" w:fill="F5F5F5"/>
-        <w:spacing w:after="0"/>
-      </w:pPr>
-      <w:r>
-        <w:rPr>
-          <w:rFonts w:ascii="Consolas" w:hAnsi="Consolas" w:eastAsia="Consolas" w:cs="Consolas"/>
-          <w:sz w:val="15"/>
-          <w:szCs w:val="15"/>
-          <w:lang w:val="en-US"/>
-        </w:rPr>
-        <w:t>LEFT JOIN PersonnelCount pc    ON pc.location_id = l.location_id</w:t>
-      </w:r>
-    </w:p>
-    <w:p xmlns:wp14="http://schemas.microsoft.com/office/word/2010/wordml" wp14:textId="77777777">
-      <w:pPr>
-        <w:shd w:val="clear" w:color="auto" w:fill="F5F5F5"/>
-        <w:spacing w:after="0"/>
-      </w:pPr>
-      <w:r>
-        <w:rPr>
-          <w:rFonts w:ascii="Consolas" w:hAnsi="Consolas" w:eastAsia="Consolas" w:cs="Consolas"/>
-          <w:sz w:val="15"/>
-          <w:szCs w:val="15"/>
-          <w:lang w:val="en-US"/>
-        </w:rPr>
-        <w:t>LEFT JOIN MemberCount mc       ON mc.location_id = l.location_id</w:t>
-      </w:r>
-    </w:p>
-    <w:p xmlns:wp14="http://schemas.microsoft.com/office/word/2010/wordml" wp14:textId="77777777">
-      <w:pPr>
-        <w:shd w:val="clear" w:color="auto" w:fill="F5F5F5"/>
-        <w:spacing w:after="0"/>
-      </w:pPr>
-      <w:r>
-        <w:rPr>
-          <w:rFonts w:ascii="Consolas" w:hAnsi="Consolas" w:eastAsia="Consolas" w:cs="Consolas"/>
-          <w:sz w:val="15"/>
-          <w:szCs w:val="15"/>
-          <w:lang w:val="en-US"/>
-        </w:rPr>
-        <w:t>LEFT JOIN FifaMemberCount fc   ON fc.location_id = l.location_id</w:t>
-      </w:r>
-    </w:p>
-    <w:p xmlns:wp14="http://schemas.microsoft.com/office/word/2010/wordml" wp14:textId="77777777">
-      <w:pPr>
-        <w:shd w:val="clear" w:color="auto" w:fill="F5F5F5"/>
-        <w:spacing w:after="0"/>
-      </w:pPr>
-      <w:r>
-        <w:rPr>
-          <w:rFonts w:ascii="Consolas" w:hAnsi="Consolas" w:eastAsia="Consolas" w:cs="Consolas"/>
-          <w:sz w:val="15"/>
-          <w:szCs w:val="15"/>
-          <w:lang w:val="en-US"/>
-        </w:rPr>
-        <w:t>ORDER BY num_club_members ASC;</w:t>
-      </w:r>
-    </w:p>
-    <w:p xmlns:wp14="http://schemas.microsoft.com/office/word/2010/wordml" wp14:textId="77777777">
-      <w:pPr>
-        <w:shd w:val="clear" w:fill="F5F5F5"/>
-        <w:spacing w:after="0"/>
-      </w:pPr>
-      <w:r>
-        <w:rPr>
-          <w:rFonts w:ascii="Consolas" w:hAnsi="Consolas" w:eastAsia="Consolas" w:cs="Consolas"/>
-          <w:sz w:val="15"/>
-          <w:szCs w:val="15"/>
-        </w:rPr>
-        <w:t xml:space="preserve"> </w:t>
-      </w:r>
-    </w:p>
-    <w:p xmlns:wp14="http://schemas.microsoft.com/office/word/2010/wordml" wp14:textId="77777777">
-      <w:pPr>
-        <w:shd w:val="clear" w:fill="F5F5F5"/>
-        <w:spacing w:after="0"/>
-      </w:pPr>
-      <w:r>
-        <w:rPr>
-          <w:rFonts w:ascii="Consolas" w:hAnsi="Consolas" w:eastAsia="Consolas" w:cs="Consolas"/>
-          <w:sz w:val="15"/>
-          <w:szCs w:val="15"/>
-        </w:rPr>
-        <w:t xml:space="preserve"> </w:t>
-      </w:r>
-    </w:p>
-    <w:p xmlns:wp14="http://schemas.microsoft.com/office/word/2010/wordml" wp14:textId="77777777">
-      <w:pPr>
-        <w:shd w:val="clear" w:fill="F5F5F5"/>
-        <w:spacing w:after="0"/>
-      </w:pPr>
-      <w:r>
-        <w:rPr>
-          <w:rFonts w:ascii="Consolas" w:hAnsi="Consolas" w:eastAsia="Consolas" w:cs="Consolas"/>
-          <w:sz w:val="15"/>
-          <w:szCs w:val="15"/>
-        </w:rPr>
-        <w:t xml:space="preserve">-- Query (ii): Major club members who played &gt;= 1 FIFA game</w:t>
-      </w:r>
-    </w:p>
-    <w:p xmlns:wp14="http://schemas.microsoft.com/office/word/2010/wordml" wp14:textId="77777777">
-      <w:pPr>
-        <w:shd w:val="clear" w:fill="F5F5F5"/>
-        <w:spacing w:after="0"/>
-      </w:pPr>
-      <w:r>
-        <w:rPr>
-          <w:rFonts w:ascii="Consolas" w:hAnsi="Consolas" w:eastAsia="Consolas" w:cs="Consolas"/>
-          <w:sz w:val="15"/>
-          <w:szCs w:val="15"/>
-        </w:rPr>
-        <w:t xml:space="preserve"> </w:t>
-      </w:r>
-    </w:p>
-    <w:p xmlns:wp14="http://schemas.microsoft.com/office/word/2010/wordml" wp14:textId="77777777">
-      <w:pPr>
-        <w:shd w:val="clear" w:color="auto" w:fill="F5F5F5"/>
-        <w:spacing w:after="0"/>
-      </w:pPr>
-      <w:r>
-        <w:rPr>
-          <w:rFonts w:ascii="Consolas" w:hAnsi="Consolas" w:eastAsia="Consolas" w:cs="Consolas"/>
-          <w:sz w:val="15"/>
-          <w:szCs w:val="15"/>
-          <w:lang w:val="en-US"/>
-        </w:rPr>
-        <w:t>WITH AgeCalc AS (</w:t>
-      </w:r>
-    </w:p>
-    <w:p xmlns:wp14="http://schemas.microsoft.com/office/word/2010/wordml" wp14:textId="77777777">
-      <w:pPr>
-        <w:shd w:val="clear" w:color="auto" w:fill="F5F5F5"/>
-        <w:spacing w:after="0"/>
-      </w:pPr>
-      <w:r>
-        <w:rPr>
-          <w:rFonts w:ascii="Consolas" w:hAnsi="Consolas" w:eastAsia="Consolas" w:cs="Consolas"/>
-          <w:sz w:val="15"/>
-          <w:szCs w:val="15"/>
-          <w:lang w:val="en-US"/>
-        </w:rPr>
-        <w:t xml:space="preserve">    SELECT membership_number,</w:t>
-      </w:r>
-    </w:p>
-    <w:p xmlns:wp14="http://schemas.microsoft.com/office/word/2010/wordml" wp14:textId="77777777">
-      <w:pPr>
-        <w:shd w:val="clear" w:color="auto" w:fill="F5F5F5"/>
-        <w:spacing w:after="0"/>
-      </w:pPr>
-      <w:r>
-        <w:rPr>
-          <w:rFonts w:ascii="Consolas" w:hAnsi="Consolas" w:eastAsia="Consolas" w:cs="Consolas"/>
-          <w:sz w:val="15"/>
-          <w:szCs w:val="15"/>
-          <w:lang w:val="en-US"/>
-        </w:rPr>
-        <w:t xml:space="preserve">           TIMESTAMPDIFF(YEAR, date_of_birth, CURDATE()) AS age</w:t>
-      </w:r>
-    </w:p>
-    <w:p xmlns:wp14="http://schemas.microsoft.com/office/word/2010/wordml" wp14:textId="77777777">
-      <w:pPr>
-        <w:shd w:val="clear" w:color="auto" w:fill="F5F5F5"/>
-        <w:spacing w:after="0"/>
-      </w:pPr>
-      <w:r>
-        <w:rPr>
-          <w:rFonts w:ascii="Consolas" w:hAnsi="Consolas" w:eastAsia="Consolas" w:cs="Consolas"/>
-          <w:sz w:val="15"/>
-          <w:szCs w:val="15"/>
-          <w:lang w:val="en-US"/>
-        </w:rPr>
-        <w:t xml:space="preserve">    FROM ClubMember</w:t>
-      </w:r>
-    </w:p>
-    <w:p xmlns:wp14="http://schemas.microsoft.com/office/word/2010/wordml" wp14:textId="77777777">
-      <w:pPr>
-        <w:shd w:val="clear" w:fill="F5F5F5"/>
-        <w:spacing w:after="0"/>
-      </w:pPr>
-      <w:r>
-        <w:rPr>
-          <w:rFonts w:ascii="Consolas" w:hAnsi="Consolas" w:eastAsia="Consolas" w:cs="Consolas"/>
-          <w:sz w:val="15"/>
-          <w:szCs w:val="15"/>
-        </w:rPr>
-        <w:t xml:space="preserve">),</w:t>
-      </w:r>
-    </w:p>
-    <w:p xmlns:wp14="http://schemas.microsoft.com/office/word/2010/wordml" wp14:textId="77777777">
-      <w:pPr>
-        <w:shd w:val="clear" w:color="auto" w:fill="F5F5F5"/>
-        <w:spacing w:after="0"/>
-      </w:pPr>
-      <w:r>
-        <w:rPr>
-          <w:rFonts w:ascii="Consolas" w:hAnsi="Consolas" w:eastAsia="Consolas" w:cs="Consolas"/>
-          <w:sz w:val="15"/>
-          <w:szCs w:val="15"/>
-          <w:lang w:val="en-US"/>
-        </w:rPr>
-        <w:t>PrevYearPay AS (</w:t>
-      </w:r>
-    </w:p>
-    <w:p xmlns:wp14="http://schemas.microsoft.com/office/word/2010/wordml" wp14:textId="77777777">
-      <w:pPr>
-        <w:shd w:val="clear" w:color="auto" w:fill="F5F5F5"/>
-        <w:spacing w:after="0"/>
-      </w:pPr>
-      <w:r>
-        <w:rPr>
-          <w:rFonts w:ascii="Consolas" w:hAnsi="Consolas" w:eastAsia="Consolas" w:cs="Consolas"/>
-          <w:sz w:val="15"/>
-          <w:szCs w:val="15"/>
-          <w:lang w:val="en-US"/>
-        </w:rPr>
-        <w:t xml:space="preserve">    SELECT membership_number, SUM(amount) AS total_paid</w:t>
-      </w:r>
-    </w:p>
-    <w:p xmlns:wp14="http://schemas.microsoft.com/office/word/2010/wordml" wp14:textId="77777777">
-      <w:pPr>
-        <w:shd w:val="clear" w:fill="F5F5F5"/>
-        <w:spacing w:after="0"/>
-      </w:pPr>
-      <w:r>
-        <w:rPr>
-          <w:rFonts w:ascii="Consolas" w:hAnsi="Consolas" w:eastAsia="Consolas" w:cs="Consolas"/>
-          <w:sz w:val="15"/>
-          <w:szCs w:val="15"/>
-        </w:rPr>
-        <w:t xml:space="preserve">    FROM Payment</w:t>
-      </w:r>
-    </w:p>
-    <w:p xmlns:wp14="http://schemas.microsoft.com/office/word/2010/wordml" wp14:textId="77777777">
-      <w:pPr>
-        <w:shd w:val="clear" w:color="auto" w:fill="F5F5F5"/>
-        <w:spacing w:after="0"/>
-      </w:pPr>
-      <w:r>
-        <w:rPr>
-          <w:rFonts w:ascii="Consolas" w:hAnsi="Consolas" w:eastAsia="Consolas" w:cs="Consolas"/>
-          <w:sz w:val="15"/>
-          <w:szCs w:val="15"/>
-          <w:lang w:val="en-US"/>
-        </w:rPr>
-        <w:t xml:space="preserve">    WHERE membership_year = YEAR(CURDATE()) - 1</w:t>
-      </w:r>
-    </w:p>
-    <w:p xmlns:wp14="http://schemas.microsoft.com/office/word/2010/wordml" wp14:textId="77777777">
-      <w:pPr>
-        <w:shd w:val="clear" w:color="auto" w:fill="F5F5F5"/>
-        <w:spacing w:after="0"/>
-      </w:pPr>
-      <w:r>
-        <w:rPr>
-          <w:rFonts w:ascii="Consolas" w:hAnsi="Consolas" w:eastAsia="Consolas" w:cs="Consolas"/>
-          <w:sz w:val="15"/>
-          <w:szCs w:val="15"/>
-          <w:lang w:val="en-US"/>
-        </w:rPr>
-        <w:t xml:space="preserve">    GROUP BY membership_number</w:t>
-      </w:r>
-    </w:p>
-    <w:p xmlns:wp14="http://schemas.microsoft.com/office/word/2010/wordml" wp14:textId="77777777">
-      <w:pPr>
-        <w:shd w:val="clear" w:fill="F5F5F5"/>
-        <w:spacing w:after="0"/>
-      </w:pPr>
-      <w:r>
-        <w:rPr>
-          <w:rFonts w:ascii="Consolas" w:hAnsi="Consolas" w:eastAsia="Consolas" w:cs="Consolas"/>
-          <w:sz w:val="15"/>
-          <w:szCs w:val="15"/>
-        </w:rPr>
-        <w:t xml:space="preserve">),</w:t>
-      </w:r>
-    </w:p>
-    <w:p xmlns:wp14="http://schemas.microsoft.com/office/word/2010/wordml" wp14:textId="77777777">
-      <w:pPr>
-        <w:shd w:val="clear" w:color="auto" w:fill="F5F5F5"/>
-        <w:spacing w:after="0"/>
-      </w:pPr>
-      <w:r>
-        <w:rPr>
-          <w:rFonts w:ascii="Consolas" w:hAnsi="Consolas" w:eastAsia="Consolas" w:cs="Consolas"/>
-          <w:sz w:val="15"/>
-          <w:szCs w:val="15"/>
-          <w:lang w:val="en-US"/>
-        </w:rPr>
-        <w:t>GameCounts AS (</w:t>
-      </w:r>
-    </w:p>
-    <w:p xmlns:wp14="http://schemas.microsoft.com/office/word/2010/wordml" wp14:textId="77777777">
-      <w:pPr>
-        <w:shd w:val="clear" w:color="auto" w:fill="F5F5F5"/>
-        <w:spacing w:after="0"/>
-      </w:pPr>
-      <w:r>
-        <w:rPr>
-          <w:rFonts w:ascii="Consolas" w:hAnsi="Consolas" w:eastAsia="Consolas" w:cs="Consolas"/>
-          <w:sz w:val="15"/>
-          <w:szCs w:val="15"/>
-          <w:lang w:val="en-US"/>
-        </w:rPr>
-        <w:t xml:space="preserve">    SELECT membership_number, COUNT(*) AS num_games</w:t>
-      </w:r>
-    </w:p>
-    <w:p xmlns:wp14="http://schemas.microsoft.com/office/word/2010/wordml" wp14:textId="77777777">
-      <w:pPr>
-        <w:shd w:val="clear" w:color="auto" w:fill="F5F5F5"/>
-        <w:spacing w:after="0"/>
-      </w:pPr>
-      <w:r>
-        <w:rPr>
-          <w:rFonts w:ascii="Consolas" w:hAnsi="Consolas" w:eastAsia="Consolas" w:cs="Consolas"/>
-          <w:sz w:val="15"/>
-          <w:szCs w:val="15"/>
-          <w:lang w:val="en-US"/>
-        </w:rPr>
-        <w:t xml:space="preserve">    FROM FIFAParticipation</w:t>
-      </w:r>
-    </w:p>
-    <w:p xmlns:wp14="http://schemas.microsoft.com/office/word/2010/wordml" wp14:textId="77777777">
-      <w:pPr>
-        <w:shd w:val="clear" w:color="auto" w:fill="F5F5F5"/>
-        <w:spacing w:after="0"/>
-      </w:pPr>
-      <w:r>
-        <w:rPr>
-          <w:rFonts w:ascii="Consolas" w:hAnsi="Consolas" w:eastAsia="Consolas" w:cs="Consolas"/>
-          <w:sz w:val="15"/>
-          <w:szCs w:val="15"/>
-          <w:lang w:val="en-US"/>
-        </w:rPr>
-        <w:t xml:space="preserve">    GROUP BY membership_number</w:t>
-      </w:r>
-    </w:p>
-    <w:p xmlns:wp14="http://schemas.microsoft.com/office/word/2010/wordml" wp14:textId="77777777">
-      <w:pPr>
-        <w:shd w:val="clear" w:fill="F5F5F5"/>
-        <w:spacing w:after="0"/>
-      </w:pPr>
-      <w:r>
-        <w:rPr>
-          <w:rFonts w:ascii="Consolas" w:hAnsi="Consolas" w:eastAsia="Consolas" w:cs="Consolas"/>
-          <w:sz w:val="15"/>
-          <w:szCs w:val="15"/>
-        </w:rPr>
-        <w:t xml:space="preserve">)</w:t>
-      </w:r>
-    </w:p>
-    <w:p xmlns:wp14="http://schemas.microsoft.com/office/word/2010/wordml" wp14:textId="77777777">
-      <w:pPr>
-        <w:shd w:val="clear" w:fill="F5F5F5"/>
-        <w:spacing w:after="0"/>
-      </w:pPr>
-      <w:r>
-        <w:rPr>
-          <w:rFonts w:ascii="Consolas" w:hAnsi="Consolas" w:eastAsia="Consolas" w:cs="Consolas"/>
-          <w:sz w:val="15"/>
-          <w:szCs w:val="15"/>
-        </w:rPr>
-        <w:t xml:space="preserve">SELECT</w:t>
-      </w:r>
-    </w:p>
-    <w:p xmlns:wp14="http://schemas.microsoft.com/office/word/2010/wordml" wp14:textId="77777777">
-      <w:pPr>
-        <w:shd w:val="clear" w:color="auto" w:fill="F5F5F5"/>
-        <w:spacing w:after="0"/>
-      </w:pPr>
-      <w:r>
-        <w:rPr>
-          <w:rFonts w:ascii="Consolas" w:hAnsi="Consolas" w:eastAsia="Consolas" w:cs="Consolas"/>
-          <w:sz w:val="15"/>
-          <w:szCs w:val="15"/>
-          <w:lang w:val="en-US"/>
-        </w:rPr>
-        <w:t xml:space="preserve">    l.name AS location_name,</w:t>
-      </w:r>
-    </w:p>
-    <w:p xmlns:wp14="http://schemas.microsoft.com/office/word/2010/wordml" wp14:textId="77777777">
-      <w:pPr>
-        <w:shd w:val="clear" w:color="auto" w:fill="F5F5F5"/>
-        <w:spacing w:after="0"/>
-      </w:pPr>
-      <w:r>
-        <w:rPr>
-          <w:rFonts w:ascii="Consolas" w:hAnsi="Consolas" w:eastAsia="Consolas" w:cs="Consolas"/>
-          <w:sz w:val="15"/>
-          <w:szCs w:val="15"/>
-          <w:lang w:val="en-US"/>
-        </w:rPr>
-        <w:t xml:space="preserve">    cm.membership_number,</w:t>
-      </w:r>
-    </w:p>
-    <w:p xmlns:wp14="http://schemas.microsoft.com/office/word/2010/wordml" wp14:textId="77777777">
-      <w:pPr>
-        <w:shd w:val="clear" w:color="auto" w:fill="F5F5F5"/>
-        <w:spacing w:after="0"/>
-      </w:pPr>
-      <w:r>
-        <w:rPr>
-          <w:rFonts w:ascii="Consolas" w:hAnsi="Consolas" w:eastAsia="Consolas" w:cs="Consolas"/>
-          <w:sz w:val="15"/>
-          <w:szCs w:val="15"/>
-          <w:lang w:val="en-US"/>
-        </w:rPr>
-        <w:t xml:space="preserve">    cm.first_name,</w:t>
-      </w:r>
-    </w:p>
-    <w:p xmlns:wp14="http://schemas.microsoft.com/office/word/2010/wordml" wp14:textId="77777777">
-      <w:pPr>
-        <w:shd w:val="clear" w:color="auto" w:fill="F5F5F5"/>
-        <w:spacing w:after="0"/>
-      </w:pPr>
-      <w:r>
-        <w:rPr>
-          <w:rFonts w:ascii="Consolas" w:hAnsi="Consolas" w:eastAsia="Consolas" w:cs="Consolas"/>
-          <w:sz w:val="15"/>
-          <w:szCs w:val="15"/>
-          <w:lang w:val="en-US"/>
-        </w:rPr>
-        <w:t xml:space="preserve">    cm.last_name,</w:t>
-      </w:r>
-    </w:p>
-    <w:p xmlns:wp14="http://schemas.microsoft.com/office/word/2010/wordml" wp14:textId="77777777">
-      <w:pPr>
-        <w:shd w:val="clear" w:color="auto" w:fill="F5F5F5"/>
-        <w:spacing w:after="0"/>
-      </w:pPr>
-      <w:r>
-        <w:rPr>
-          <w:rFonts w:ascii="Consolas" w:hAnsi="Consolas" w:eastAsia="Consolas" w:cs="Consolas"/>
-          <w:sz w:val="15"/>
-          <w:szCs w:val="15"/>
-          <w:lang w:val="en-US"/>
-        </w:rPr>
-        <w:t xml:space="preserve">    a.age,</w:t>
-      </w:r>
-    </w:p>
-    <w:p xmlns:wp14="http://schemas.microsoft.com/office/word/2010/wordml" wp14:textId="77777777">
-      <w:pPr>
-        <w:shd w:val="clear" w:color="auto" w:fill="F5F5F5"/>
-        <w:spacing w:after="0"/>
-      </w:pPr>
-      <w:r>
-        <w:rPr>
-          <w:rFonts w:ascii="Consolas" w:hAnsi="Consolas" w:eastAsia="Consolas" w:cs="Consolas"/>
-          <w:sz w:val="15"/>
-          <w:szCs w:val="15"/>
-          <w:lang w:val="en-US"/>
-        </w:rPr>
-        <w:t xml:space="preserve">    cm.city,</w:t>
-      </w:r>
-    </w:p>
-    <w:p xmlns:wp14="http://schemas.microsoft.com/office/word/2010/wordml" wp14:textId="77777777">
-      <w:pPr>
-        <w:shd w:val="clear" w:color="auto" w:fill="F5F5F5"/>
-        <w:spacing w:after="0"/>
-      </w:pPr>
-      <w:r>
-        <w:rPr>
-          <w:rFonts w:ascii="Consolas" w:hAnsi="Consolas" w:eastAsia="Consolas" w:cs="Consolas"/>
-          <w:sz w:val="15"/>
-          <w:szCs w:val="15"/>
-          <w:lang w:val="en-US"/>
-        </w:rPr>
-        <w:t xml:space="preserve">    cm.province,</w:t>
-      </w:r>
-    </w:p>
-    <w:p xmlns:wp14="http://schemas.microsoft.com/office/word/2010/wordml" wp14:textId="77777777">
-      <w:pPr>
-        <w:shd w:val="clear" w:color="auto" w:fill="F5F5F5"/>
-        <w:spacing w:after="0"/>
-      </w:pPr>
-      <w:r>
-        <w:rPr>
-          <w:rFonts w:ascii="Consolas" w:hAnsi="Consolas" w:eastAsia="Consolas" w:cs="Consolas"/>
-          <w:sz w:val="15"/>
-          <w:szCs w:val="15"/>
-          <w:lang w:val="en-US"/>
-        </w:rPr>
-        <w:t xml:space="preserve">    CASE WHEN COALESCE(p.total_paid, 0) &gt;= 200 THEN 'Active' ELSE 'Inactive' END AS status,</w:t>
-      </w:r>
-    </w:p>
-    <w:p xmlns:wp14="http://schemas.microsoft.com/office/word/2010/wordml" wp14:textId="77777777">
-      <w:pPr>
-        <w:shd w:val="clear" w:color="auto" w:fill="F5F5F5"/>
-        <w:spacing w:after="0"/>
-      </w:pPr>
-      <w:r>
-        <w:rPr>
-          <w:rFonts w:ascii="Consolas" w:hAnsi="Consolas" w:eastAsia="Consolas" w:cs="Consolas"/>
-          <w:sz w:val="15"/>
-          <w:szCs w:val="15"/>
-          <w:lang w:val="en-US"/>
-        </w:rPr>
-        <w:t xml:space="preserve">    g.num_games</w:t>
-      </w:r>
-    </w:p>
-    <w:p xmlns:wp14="http://schemas.microsoft.com/office/word/2010/wordml" wp14:textId="77777777">
-      <w:pPr>
-        <w:shd w:val="clear" w:color="auto" w:fill="F5F5F5"/>
-        <w:spacing w:after="0"/>
-      </w:pPr>
-      <w:r>
-        <w:rPr>
-          <w:rFonts w:ascii="Consolas" w:hAnsi="Consolas" w:eastAsia="Consolas" w:cs="Consolas"/>
-          <w:sz w:val="15"/>
-          <w:szCs w:val="15"/>
-          <w:lang w:val="en-US"/>
-        </w:rPr>
-        <w:t>FROM ClubMember cm</w:t>
-      </w:r>
-    </w:p>
-    <w:p xmlns:wp14="http://schemas.microsoft.com/office/word/2010/wordml" wp14:textId="77777777">
-      <w:pPr>
-        <w:shd w:val="clear" w:color="auto" w:fill="F5F5F5"/>
-        <w:spacing w:after="0"/>
-      </w:pPr>
-      <w:r>
-        <w:rPr>
-          <w:rFonts w:ascii="Consolas" w:hAnsi="Consolas" w:eastAsia="Consolas" w:cs="Consolas"/>
-          <w:sz w:val="15"/>
-          <w:szCs w:val="15"/>
-          <w:lang w:val="en-US"/>
-        </w:rPr>
-        <w:t>JOIN AgeCalc a      ON a.membership_number = cm.membership_number</w:t>
-      </w:r>
-    </w:p>
-    <w:p xmlns:wp14="http://schemas.microsoft.com/office/word/2010/wordml" wp14:textId="77777777">
-      <w:pPr>
-        <w:shd w:val="clear" w:color="auto" w:fill="F5F5F5"/>
-        <w:spacing w:after="0"/>
-      </w:pPr>
-      <w:r>
-        <w:rPr>
-          <w:rFonts w:ascii="Consolas" w:hAnsi="Consolas" w:eastAsia="Consolas" w:cs="Consolas"/>
-          <w:sz w:val="15"/>
-          <w:szCs w:val="15"/>
-          <w:lang w:val="en-US"/>
-        </w:rPr>
-        <w:t>JOIN Location l     ON l.location_id = cm.location_id</w:t>
-      </w:r>
-    </w:p>
-    <w:p xmlns:wp14="http://schemas.microsoft.com/office/word/2010/wordml" wp14:textId="77777777">
-      <w:pPr>
-        <w:shd w:val="clear" w:color="auto" w:fill="F5F5F5"/>
-        <w:spacing w:after="0"/>
-      </w:pPr>
-      <w:r>
-        <w:rPr>
-          <w:rFonts w:ascii="Consolas" w:hAnsi="Consolas" w:eastAsia="Consolas" w:cs="Consolas"/>
-          <w:sz w:val="15"/>
-          <w:szCs w:val="15"/>
-          <w:lang w:val="en-US"/>
-        </w:rPr>
-        <w:t>JOIN GameCounts g   ON g.membership_number = cm.membership_number</w:t>
-      </w:r>
-    </w:p>
-    <w:p xmlns:wp14="http://schemas.microsoft.com/office/word/2010/wordml" wp14:textId="77777777">
-      <w:pPr>
-        <w:shd w:val="clear" w:color="auto" w:fill="F5F5F5"/>
-        <w:spacing w:after="0"/>
-      </w:pPr>
-      <w:r>
-        <w:rPr>
-          <w:rFonts w:ascii="Consolas" w:hAnsi="Consolas" w:eastAsia="Consolas" w:cs="Consolas"/>
-          <w:sz w:val="15"/>
-          <w:szCs w:val="15"/>
-          <w:lang w:val="en-US"/>
-        </w:rPr>
-        <w:t>LEFT JOIN PrevYearPay p ON p.membership_number = cm.membership_number</w:t>
-      </w:r>
-    </w:p>
-    <w:p xmlns:wp14="http://schemas.microsoft.com/office/word/2010/wordml" wp14:textId="77777777">
-      <w:pPr>
-        <w:shd w:val="clear" w:color="auto" w:fill="F5F5F5"/>
-        <w:spacing w:after="0"/>
-      </w:pPr>
-      <w:r>
-        <w:rPr>
-          <w:rFonts w:ascii="Consolas" w:hAnsi="Consolas" w:eastAsia="Consolas" w:cs="Consolas"/>
-          <w:sz w:val="15"/>
-          <w:szCs w:val="15"/>
-          <w:lang w:val="en-US"/>
-        </w:rPr>
-        <w:t>WHERE a.age &gt;= 18</w:t>
-      </w:r>
-    </w:p>
-    <w:p xmlns:wp14="http://schemas.microsoft.com/office/word/2010/wordml" wp14:textId="77777777">
-      <w:pPr>
-        <w:shd w:val="clear" w:color="auto" w:fill="F5F5F5"/>
-        <w:spacing w:after="0"/>
-      </w:pPr>
-      <w:r>
-        <w:rPr>
-          <w:rFonts w:ascii="Consolas" w:hAnsi="Consolas" w:eastAsia="Consolas" w:cs="Consolas"/>
-          <w:sz w:val="15"/>
-          <w:szCs w:val="15"/>
-          <w:lang w:val="en-US"/>
-        </w:rPr>
-        <w:t>ORDER BY g.num_games ASC;</w:t>
-      </w:r>
-    </w:p>
-    <w:p xmlns:wp14="http://schemas.microsoft.com/office/word/2010/wordml" wp14:textId="77777777">
-      <w:pPr>
-        <w:shd w:val="clear" w:fill="F5F5F5"/>
-        <w:spacing w:after="0"/>
-      </w:pPr>
-      <w:r>
-        <w:rPr>
-          <w:rFonts w:ascii="Consolas" w:hAnsi="Consolas" w:eastAsia="Consolas" w:cs="Consolas"/>
-          <w:sz w:val="15"/>
-          <w:szCs w:val="15"/>
-        </w:rPr>
-        <w:t xml:space="preserve"> </w:t>
-      </w:r>
-    </w:p>
-    <w:p xmlns:wp14="http://schemas.microsoft.com/office/word/2010/wordml" wp14:textId="77777777">
-      <w:pPr>
-        <w:shd w:val="clear" w:fill="F5F5F5"/>
-        <w:spacing w:after="0"/>
-      </w:pPr>
-      <w:r>
-        <w:rPr>
-          <w:rFonts w:ascii="Consolas" w:hAnsi="Consolas" w:eastAsia="Consolas" w:cs="Consolas"/>
-          <w:sz w:val="15"/>
-          <w:szCs w:val="15"/>
-        </w:rPr>
-        <w:t xml:space="preserve"> </w:t>
-      </w:r>
-    </w:p>
-    <w:p xmlns:wp14="http://schemas.microsoft.com/office/word/2010/wordml" wp14:textId="77777777">
-      <w:pPr>
-        <w:shd w:val="clear" w:fill="F5F5F5"/>
-        <w:spacing w:after="0"/>
-      </w:pPr>
-      <w:r>
-        <w:rPr>
-          <w:rFonts w:ascii="Consolas" w:hAnsi="Consolas" w:eastAsia="Consolas" w:cs="Consolas"/>
-          <w:sz w:val="15"/>
-          <w:szCs w:val="15"/>
-        </w:rPr>
-        <w:t xml:space="preserve">-- Query (iii): Club members with &gt;= 4 different hobbies</w:t>
-      </w:r>
-    </w:p>
-    <w:p xmlns:wp14="http://schemas.microsoft.com/office/word/2010/wordml" wp14:textId="77777777">
-      <w:pPr>
-        <w:shd w:val="clear" w:fill="F5F5F5"/>
-        <w:spacing w:after="0"/>
-      </w:pPr>
-      <w:r>
-        <w:rPr>
-          <w:rFonts w:ascii="Consolas" w:hAnsi="Consolas" w:eastAsia="Consolas" w:cs="Consolas"/>
-          <w:sz w:val="15"/>
-          <w:szCs w:val="15"/>
-        </w:rPr>
-        <w:t xml:space="preserve"> </w:t>
-      </w:r>
-    </w:p>
-    <w:p xmlns:wp14="http://schemas.microsoft.com/office/word/2010/wordml" wp14:textId="77777777">
-      <w:pPr>
-        <w:shd w:val="clear" w:color="auto" w:fill="F5F5F5"/>
-        <w:spacing w:after="0"/>
-      </w:pPr>
-      <w:r>
-        <w:rPr>
-          <w:rFonts w:ascii="Consolas" w:hAnsi="Consolas" w:eastAsia="Consolas" w:cs="Consolas"/>
-          <w:sz w:val="15"/>
-          <w:szCs w:val="15"/>
-          <w:lang w:val="en-US"/>
-        </w:rPr>
-        <w:t>WITH AgeCalc AS (</w:t>
-      </w:r>
-    </w:p>
-    <w:p xmlns:wp14="http://schemas.microsoft.com/office/word/2010/wordml" wp14:textId="77777777">
-      <w:pPr>
-        <w:shd w:val="clear" w:color="auto" w:fill="F5F5F5"/>
-        <w:spacing w:after="0"/>
-      </w:pPr>
-      <w:r>
-        <w:rPr>
-          <w:rFonts w:ascii="Consolas" w:hAnsi="Consolas" w:eastAsia="Consolas" w:cs="Consolas"/>
-          <w:sz w:val="15"/>
-          <w:szCs w:val="15"/>
-          <w:lang w:val="en-US"/>
-        </w:rPr>
-        <w:t xml:space="preserve">    SELECT membership_number,</w:t>
-      </w:r>
-    </w:p>
-    <w:p xmlns:wp14="http://schemas.microsoft.com/office/word/2010/wordml" wp14:textId="77777777">
-      <w:pPr>
-        <w:shd w:val="clear" w:color="auto" w:fill="F5F5F5"/>
-        <w:spacing w:after="0"/>
-      </w:pPr>
-      <w:r>
-        <w:rPr>
-          <w:rFonts w:ascii="Consolas" w:hAnsi="Consolas" w:eastAsia="Consolas" w:cs="Consolas"/>
-          <w:sz w:val="15"/>
-          <w:szCs w:val="15"/>
-          <w:lang w:val="en-US"/>
-        </w:rPr>
-        <w:t xml:space="preserve">           TIMESTAMPDIFF(YEAR, date_of_birth, CURDATE()) AS age</w:t>
-      </w:r>
-    </w:p>
-    <w:p xmlns:wp14="http://schemas.microsoft.com/office/word/2010/wordml" wp14:textId="77777777">
-      <w:pPr>
-        <w:shd w:val="clear" w:color="auto" w:fill="F5F5F5"/>
-        <w:spacing w:after="0"/>
-      </w:pPr>
-      <w:r>
-        <w:rPr>
-          <w:rFonts w:ascii="Consolas" w:hAnsi="Consolas" w:eastAsia="Consolas" w:cs="Consolas"/>
-          <w:sz w:val="15"/>
-          <w:szCs w:val="15"/>
-          <w:lang w:val="en-US"/>
-        </w:rPr>
-        <w:t xml:space="preserve">    FROM ClubMember</w:t>
-      </w:r>
-    </w:p>
-    <w:p xmlns:wp14="http://schemas.microsoft.com/office/word/2010/wordml" wp14:textId="77777777">
-      <w:pPr>
-        <w:shd w:val="clear" w:fill="F5F5F5"/>
-        <w:spacing w:after="0"/>
-      </w:pPr>
-      <w:r>
-        <w:rPr>
-          <w:rFonts w:ascii="Consolas" w:hAnsi="Consolas" w:eastAsia="Consolas" w:cs="Consolas"/>
-          <w:sz w:val="15"/>
-          <w:szCs w:val="15"/>
-        </w:rPr>
-        <w:t xml:space="preserve">),</w:t>
-      </w:r>
-    </w:p>
-    <w:p xmlns:wp14="http://schemas.microsoft.com/office/word/2010/wordml" wp14:textId="77777777">
-      <w:pPr>
-        <w:shd w:val="clear" w:color="auto" w:fill="F5F5F5"/>
-        <w:spacing w:after="0"/>
-      </w:pPr>
-      <w:r>
-        <w:rPr>
-          <w:rFonts w:ascii="Consolas" w:hAnsi="Consolas" w:eastAsia="Consolas" w:cs="Consolas"/>
-          <w:sz w:val="15"/>
-          <w:szCs w:val="15"/>
-          <w:lang w:val="en-US"/>
-        </w:rPr>
-        <w:t>PrevYearPay AS (</w:t>
-      </w:r>
-    </w:p>
-    <w:p xmlns:wp14="http://schemas.microsoft.com/office/word/2010/wordml" wp14:textId="77777777">
-      <w:pPr>
-        <w:shd w:val="clear" w:color="auto" w:fill="F5F5F5"/>
-        <w:spacing w:after="0"/>
-      </w:pPr>
-      <w:r>
-        <w:rPr>
-          <w:rFonts w:ascii="Consolas" w:hAnsi="Consolas" w:eastAsia="Consolas" w:cs="Consolas"/>
-          <w:sz w:val="15"/>
-          <w:szCs w:val="15"/>
-          <w:lang w:val="en-US"/>
-        </w:rPr>
-        <w:t xml:space="preserve">    SELECT membership_number, SUM(amount) AS total_paid</w:t>
-      </w:r>
-    </w:p>
-    <w:p xmlns:wp14="http://schemas.microsoft.com/office/word/2010/wordml" wp14:textId="77777777">
-      <w:pPr>
-        <w:shd w:val="clear" w:fill="F5F5F5"/>
-        <w:spacing w:after="0"/>
-      </w:pPr>
-      <w:r>
-        <w:rPr>
-          <w:rFonts w:ascii="Consolas" w:hAnsi="Consolas" w:eastAsia="Consolas" w:cs="Consolas"/>
-          <w:sz w:val="15"/>
-          <w:szCs w:val="15"/>
-        </w:rPr>
-        <w:t xml:space="preserve">    FROM Payment</w:t>
-      </w:r>
-    </w:p>
-    <w:p xmlns:wp14="http://schemas.microsoft.com/office/word/2010/wordml" wp14:textId="77777777">
-      <w:pPr>
-        <w:shd w:val="clear" w:color="auto" w:fill="F5F5F5"/>
-        <w:spacing w:after="0"/>
-      </w:pPr>
-      <w:r>
-        <w:rPr>
-          <w:rFonts w:ascii="Consolas" w:hAnsi="Consolas" w:eastAsia="Consolas" w:cs="Consolas"/>
-          <w:sz w:val="15"/>
-          <w:szCs w:val="15"/>
-          <w:lang w:val="en-US"/>
-        </w:rPr>
-        <w:t xml:space="preserve">    WHERE membership_year = YEAR(CURDATE()) - 1</w:t>
-      </w:r>
-    </w:p>
-    <w:p xmlns:wp14="http://schemas.microsoft.com/office/word/2010/wordml" wp14:textId="77777777">
-      <w:pPr>
-        <w:shd w:val="clear" w:color="auto" w:fill="F5F5F5"/>
-        <w:spacing w:after="0"/>
-      </w:pPr>
-      <w:r>
-        <w:rPr>
-          <w:rFonts w:ascii="Consolas" w:hAnsi="Consolas" w:eastAsia="Consolas" w:cs="Consolas"/>
-          <w:sz w:val="15"/>
-          <w:szCs w:val="15"/>
-          <w:lang w:val="en-US"/>
-        </w:rPr>
-        <w:t xml:space="preserve">    GROUP BY membership_number</w:t>
-      </w:r>
-    </w:p>
-    <w:p xmlns:wp14="http://schemas.microsoft.com/office/word/2010/wordml" wp14:textId="77777777">
-      <w:pPr>
-        <w:shd w:val="clear" w:fill="F5F5F5"/>
-        <w:spacing w:after="0"/>
-      </w:pPr>
-      <w:r>
-        <w:rPr>
-          <w:rFonts w:ascii="Consolas" w:hAnsi="Consolas" w:eastAsia="Consolas" w:cs="Consolas"/>
-          <w:sz w:val="15"/>
-          <w:szCs w:val="15"/>
-        </w:rPr>
-        <w:t xml:space="preserve">),</w:t>
-      </w:r>
-    </w:p>
-    <w:p xmlns:wp14="http://schemas.microsoft.com/office/word/2010/wordml" wp14:textId="77777777">
-      <w:pPr>
-        <w:shd w:val="clear" w:color="auto" w:fill="F5F5F5"/>
-        <w:spacing w:after="0"/>
-      </w:pPr>
-      <w:r>
-        <w:rPr>
-          <w:rFonts w:ascii="Consolas" w:hAnsi="Consolas" w:eastAsia="Consolas" w:cs="Consolas"/>
-          <w:sz w:val="15"/>
-          <w:szCs w:val="15"/>
-          <w:lang w:val="en-US"/>
-        </w:rPr>
-        <w:t>HobbyCounts AS (</w:t>
-      </w:r>
-    </w:p>
-    <w:p xmlns:wp14="http://schemas.microsoft.com/office/word/2010/wordml" wp14:textId="77777777">
-      <w:pPr>
-        <w:shd w:val="clear" w:color="auto" w:fill="F5F5F5"/>
-        <w:spacing w:after="0"/>
-      </w:pPr>
-      <w:r>
-        <w:rPr>
-          <w:rFonts w:ascii="Consolas" w:hAnsi="Consolas" w:eastAsia="Consolas" w:cs="Consolas"/>
-          <w:sz w:val="15"/>
-          <w:szCs w:val="15"/>
-          <w:lang w:val="en-US"/>
-        </w:rPr>
-        <w:t xml:space="preserve">    SELECT membership_number, COUNT(DISTINCT hobby_id) AS num_hobbies</w:t>
-      </w:r>
-    </w:p>
-    <w:p xmlns:wp14="http://schemas.microsoft.com/office/word/2010/wordml" wp14:textId="77777777">
-      <w:pPr>
-        <w:shd w:val="clear" w:color="auto" w:fill="F5F5F5"/>
-        <w:spacing w:after="0"/>
-      </w:pPr>
-      <w:r>
-        <w:rPr>
-          <w:rFonts w:ascii="Consolas" w:hAnsi="Consolas" w:eastAsia="Consolas" w:cs="Consolas"/>
-          <w:sz w:val="15"/>
-          <w:szCs w:val="15"/>
-          <w:lang w:val="en-US"/>
-        </w:rPr>
-        <w:t xml:space="preserve">    FROM ClubMemberHobby</w:t>
-      </w:r>
-    </w:p>
-    <w:p xmlns:wp14="http://schemas.microsoft.com/office/word/2010/wordml" wp14:textId="77777777">
-      <w:pPr>
-        <w:shd w:val="clear" w:color="auto" w:fill="F5F5F5"/>
-        <w:spacing w:after="0"/>
-      </w:pPr>
-      <w:r>
-        <w:rPr>
-          <w:rFonts w:ascii="Consolas" w:hAnsi="Consolas" w:eastAsia="Consolas" w:cs="Consolas"/>
-          <w:sz w:val="15"/>
-          <w:szCs w:val="15"/>
-          <w:lang w:val="en-US"/>
-        </w:rPr>
-        <w:t xml:space="preserve">    GROUP BY membership_number</w:t>
-      </w:r>
-    </w:p>
-    <w:p xmlns:wp14="http://schemas.microsoft.com/office/word/2010/wordml" wp14:textId="77777777">
-      <w:pPr>
-        <w:shd w:val="clear" w:color="auto" w:fill="F5F5F5"/>
-        <w:spacing w:after="0"/>
-      </w:pPr>
-      <w:r>
-        <w:rPr>
-          <w:rFonts w:ascii="Consolas" w:hAnsi="Consolas" w:eastAsia="Consolas" w:cs="Consolas"/>
-          <w:sz w:val="15"/>
-          <w:szCs w:val="15"/>
-          <w:lang w:val="en-US"/>
-        </w:rPr>
-        <w:t xml:space="preserve">    HAVING COUNT(DISTINCT hobby_id) &gt;= 4</w:t>
-      </w:r>
-    </w:p>
-    <w:p xmlns:wp14="http://schemas.microsoft.com/office/word/2010/wordml" wp14:textId="77777777">
-      <w:pPr>
-        <w:shd w:val="clear" w:fill="F5F5F5"/>
-        <w:spacing w:after="0"/>
-      </w:pPr>
-      <w:r>
-        <w:rPr>
-          <w:rFonts w:ascii="Consolas" w:hAnsi="Consolas" w:eastAsia="Consolas" w:cs="Consolas"/>
-          <w:sz w:val="15"/>
-          <w:szCs w:val="15"/>
-        </w:rPr>
-        <w:t xml:space="preserve">)</w:t>
-      </w:r>
-    </w:p>
-    <w:p xmlns:wp14="http://schemas.microsoft.com/office/word/2010/wordml" wp14:textId="77777777">
-      <w:pPr>
-        <w:shd w:val="clear" w:fill="F5F5F5"/>
-        <w:spacing w:after="0"/>
-      </w:pPr>
-      <w:r>
-        <w:rPr>
-          <w:rFonts w:ascii="Consolas" w:hAnsi="Consolas" w:eastAsia="Consolas" w:cs="Consolas"/>
-          <w:sz w:val="15"/>
-          <w:szCs w:val="15"/>
-        </w:rPr>
-        <w:t xml:space="preserve">SELECT</w:t>
-      </w:r>
-    </w:p>
-    <w:p xmlns:wp14="http://schemas.microsoft.com/office/word/2010/wordml" wp14:textId="77777777">
-      <w:pPr>
-        <w:shd w:val="clear" w:color="auto" w:fill="F5F5F5"/>
-        <w:spacing w:after="0"/>
-      </w:pPr>
-      <w:r>
-        <w:rPr>
-          <w:rFonts w:ascii="Consolas" w:hAnsi="Consolas" w:eastAsia="Consolas" w:cs="Consolas"/>
-          <w:sz w:val="15"/>
-          <w:szCs w:val="15"/>
-          <w:lang w:val="en-US"/>
-        </w:rPr>
-        <w:t xml:space="preserve">    l.name AS location_name,</w:t>
-      </w:r>
-    </w:p>
-    <w:p xmlns:wp14="http://schemas.microsoft.com/office/word/2010/wordml" wp14:textId="77777777">
-      <w:pPr>
-        <w:shd w:val="clear" w:color="auto" w:fill="F5F5F5"/>
-        <w:spacing w:after="0"/>
-      </w:pPr>
-      <w:r>
-        <w:rPr>
-          <w:rFonts w:ascii="Consolas" w:hAnsi="Consolas" w:eastAsia="Consolas" w:cs="Consolas"/>
-          <w:sz w:val="15"/>
-          <w:szCs w:val="15"/>
-          <w:lang w:val="en-US"/>
-        </w:rPr>
-        <w:t xml:space="preserve">    cm.membership_number,</w:t>
-      </w:r>
-    </w:p>
-    <w:p xmlns:wp14="http://schemas.microsoft.com/office/word/2010/wordml" wp14:textId="77777777">
-      <w:pPr>
-        <w:shd w:val="clear" w:color="auto" w:fill="F5F5F5"/>
-        <w:spacing w:after="0"/>
-      </w:pPr>
-      <w:r>
-        <w:rPr>
-          <w:rFonts w:ascii="Consolas" w:hAnsi="Consolas" w:eastAsia="Consolas" w:cs="Consolas"/>
-          <w:sz w:val="15"/>
-          <w:szCs w:val="15"/>
-          <w:lang w:val="en-US"/>
-        </w:rPr>
-        <w:t xml:space="preserve">    cm.first_name,</w:t>
-      </w:r>
-    </w:p>
-    <w:p xmlns:wp14="http://schemas.microsoft.com/office/word/2010/wordml" wp14:textId="77777777">
-      <w:pPr>
-        <w:shd w:val="clear" w:color="auto" w:fill="F5F5F5"/>
-        <w:spacing w:after="0"/>
-      </w:pPr>
-      <w:r>
-        <w:rPr>
-          <w:rFonts w:ascii="Consolas" w:hAnsi="Consolas" w:eastAsia="Consolas" w:cs="Consolas"/>
-          <w:sz w:val="15"/>
-          <w:szCs w:val="15"/>
-          <w:lang w:val="en-US"/>
-        </w:rPr>
-        <w:t xml:space="preserve">    cm.last_name,</w:t>
-      </w:r>
-    </w:p>
-    <w:p xmlns:wp14="http://schemas.microsoft.com/office/word/2010/wordml" wp14:textId="77777777">
-      <w:pPr>
-        <w:shd w:val="clear" w:color="auto" w:fill="F5F5F5"/>
-        <w:spacing w:after="0"/>
-      </w:pPr>
-      <w:r>
-        <w:rPr>
-          <w:rFonts w:ascii="Consolas" w:hAnsi="Consolas" w:eastAsia="Consolas" w:cs="Consolas"/>
-          <w:sz w:val="15"/>
-          <w:szCs w:val="15"/>
-          <w:lang w:val="en-US"/>
-        </w:rPr>
-        <w:t xml:space="preserve">    a.age,</w:t>
-      </w:r>
-    </w:p>
-    <w:p xmlns:wp14="http://schemas.microsoft.com/office/word/2010/wordml" wp14:textId="77777777">
-      <w:pPr>
-        <w:shd w:val="clear" w:color="auto" w:fill="F5F5F5"/>
-        <w:spacing w:after="0"/>
-      </w:pPr>
-      <w:r>
-        <w:rPr>
-          <w:rFonts w:ascii="Consolas" w:hAnsi="Consolas" w:eastAsia="Consolas" w:cs="Consolas"/>
-          <w:sz w:val="15"/>
-          <w:szCs w:val="15"/>
-          <w:lang w:val="en-US"/>
-        </w:rPr>
-        <w:t xml:space="preserve">    cm.city,</w:t>
-      </w:r>
-    </w:p>
-    <w:p xmlns:wp14="http://schemas.microsoft.com/office/word/2010/wordml" wp14:textId="77777777">
-      <w:pPr>
-        <w:shd w:val="clear" w:color="auto" w:fill="F5F5F5"/>
-        <w:spacing w:after="0"/>
-      </w:pPr>
-      <w:r>
-        <w:rPr>
-          <w:rFonts w:ascii="Consolas" w:hAnsi="Consolas" w:eastAsia="Consolas" w:cs="Consolas"/>
-          <w:sz w:val="15"/>
-          <w:szCs w:val="15"/>
-          <w:lang w:val="en-US"/>
-        </w:rPr>
-        <w:t xml:space="preserve">    cm.province,</w:t>
-      </w:r>
-    </w:p>
-    <w:p xmlns:wp14="http://schemas.microsoft.com/office/word/2010/wordml" wp14:textId="77777777">
-      <w:pPr>
-        <w:shd w:val="clear" w:fill="F5F5F5"/>
-        <w:spacing w:after="0"/>
-      </w:pPr>
-      <w:r>
-        <w:rPr>
-          <w:rFonts w:ascii="Consolas" w:hAnsi="Consolas" w:eastAsia="Consolas" w:cs="Consolas"/>
-          <w:sz w:val="15"/>
-          <w:szCs w:val="15"/>
-        </w:rPr>
-        <w:t xml:space="preserve">    CASE</w:t>
-      </w:r>
-    </w:p>
-    <w:p xmlns:wp14="http://schemas.microsoft.com/office/word/2010/wordml" wp14:textId="77777777">
-      <w:pPr>
-        <w:shd w:val="clear" w:color="auto" w:fill="F5F5F5"/>
-        <w:spacing w:after="0"/>
-      </w:pPr>
-      <w:r>
-        <w:rPr>
-          <w:rFonts w:ascii="Consolas" w:hAnsi="Consolas" w:eastAsia="Consolas" w:cs="Consolas"/>
-          <w:sz w:val="15"/>
-          <w:szCs w:val="15"/>
-          <w:lang w:val="en-US"/>
-        </w:rPr>
-        <w:t xml:space="preserve">        WHEN COALESCE(p.total_paid, 0) &gt;= (CASE WHEN a.age &gt;= 18 THEN 200 ELSE 100 END)</w:t>
-      </w:r>
-    </w:p>
-    <w:p xmlns:wp14="http://schemas.microsoft.com/office/word/2010/wordml" wp14:textId="77777777">
-      <w:pPr>
-        <w:shd w:val="clear" w:fill="F5F5F5"/>
-        <w:spacing w:after="0"/>
-      </w:pPr>
-      <w:r>
-        <w:rPr>
-          <w:rFonts w:ascii="Consolas" w:hAnsi="Consolas" w:eastAsia="Consolas" w:cs="Consolas"/>
-          <w:sz w:val="15"/>
-          <w:szCs w:val="15"/>
-        </w:rPr>
-        <w:t xml:space="preserve">        THEN 'Active' ELSE 'Inactive'</w:t>
-      </w:r>
-    </w:p>
-    <w:p xmlns:wp14="http://schemas.microsoft.com/office/word/2010/wordml" wp14:textId="77777777">
-      <w:pPr>
-        <w:shd w:val="clear" w:fill="F5F5F5"/>
-        <w:spacing w:after="0"/>
-      </w:pPr>
-      <w:r>
-        <w:rPr>
-          <w:rFonts w:ascii="Consolas" w:hAnsi="Consolas" w:eastAsia="Consolas" w:cs="Consolas"/>
-          <w:sz w:val="15"/>
-          <w:szCs w:val="15"/>
-        </w:rPr>
-        <w:t xml:space="preserve">    END AS status,</w:t>
-      </w:r>
-    </w:p>
-    <w:p xmlns:wp14="http://schemas.microsoft.com/office/word/2010/wordml" wp14:textId="77777777">
-      <w:pPr>
-        <w:shd w:val="clear" w:color="auto" w:fill="F5F5F5"/>
-        <w:spacing w:after="0"/>
-      </w:pPr>
-      <w:r>
-        <w:rPr>
-          <w:rFonts w:ascii="Consolas" w:hAnsi="Consolas" w:eastAsia="Consolas" w:cs="Consolas"/>
-          <w:sz w:val="15"/>
-          <w:szCs w:val="15"/>
-          <w:lang w:val="en-US"/>
-        </w:rPr>
-        <w:t xml:space="preserve">    h.num_hobbies</w:t>
-      </w:r>
-    </w:p>
-    <w:p xmlns:wp14="http://schemas.microsoft.com/office/word/2010/wordml" wp14:textId="77777777">
-      <w:pPr>
-        <w:shd w:val="clear" w:color="auto" w:fill="F5F5F5"/>
-        <w:spacing w:after="0"/>
-      </w:pPr>
-      <w:r>
-        <w:rPr>
-          <w:rFonts w:ascii="Consolas" w:hAnsi="Consolas" w:eastAsia="Consolas" w:cs="Consolas"/>
-          <w:sz w:val="15"/>
-          <w:szCs w:val="15"/>
-          <w:lang w:val="en-US"/>
-        </w:rPr>
-        <w:t>FROM ClubMember cm</w:t>
-      </w:r>
-    </w:p>
-    <w:p xmlns:wp14="http://schemas.microsoft.com/office/word/2010/wordml" wp14:textId="77777777">
-      <w:pPr>
-        <w:shd w:val="clear" w:color="auto" w:fill="F5F5F5"/>
-        <w:spacing w:after="0"/>
-      </w:pPr>
-      <w:r>
-        <w:rPr>
-          <w:rFonts w:ascii="Consolas" w:hAnsi="Consolas" w:eastAsia="Consolas" w:cs="Consolas"/>
-          <w:sz w:val="15"/>
-          <w:szCs w:val="15"/>
-          <w:lang w:val="en-US"/>
-        </w:rPr>
-        <w:t>JOIN AgeCalc a       ON a.membership_number = cm.membership_number</w:t>
-      </w:r>
-    </w:p>
-    <w:p xmlns:wp14="http://schemas.microsoft.com/office/word/2010/wordml" wp14:textId="77777777">
-      <w:pPr>
-        <w:shd w:val="clear" w:color="auto" w:fill="F5F5F5"/>
-        <w:spacing w:after="0"/>
-      </w:pPr>
-      <w:r>
-        <w:rPr>
-          <w:rFonts w:ascii="Consolas" w:hAnsi="Consolas" w:eastAsia="Consolas" w:cs="Consolas"/>
-          <w:sz w:val="15"/>
-          <w:szCs w:val="15"/>
-          <w:lang w:val="en-US"/>
-        </w:rPr>
-        <w:t>JOIN Location l      ON l.location_id = cm.location_id</w:t>
-      </w:r>
-    </w:p>
-    <w:p xmlns:wp14="http://schemas.microsoft.com/office/word/2010/wordml" wp14:textId="77777777">
-      <w:pPr>
-        <w:shd w:val="clear" w:color="auto" w:fill="F5F5F5"/>
-        <w:spacing w:after="0"/>
-      </w:pPr>
-      <w:r>
-        <w:rPr>
-          <w:rFonts w:ascii="Consolas" w:hAnsi="Consolas" w:eastAsia="Consolas" w:cs="Consolas"/>
-          <w:sz w:val="15"/>
-          <w:szCs w:val="15"/>
-          <w:lang w:val="en-US"/>
-        </w:rPr>
-        <w:t>JOIN HobbyCounts h   ON h.membership_number = cm.membership_number</w:t>
-      </w:r>
-    </w:p>
-    <w:p xmlns:wp14="http://schemas.microsoft.com/office/word/2010/wordml" wp14:textId="77777777">
-      <w:pPr>
-        <w:shd w:val="clear" w:color="auto" w:fill="F5F5F5"/>
-        <w:spacing w:after="0"/>
-      </w:pPr>
-      <w:r>
-        <w:rPr>
-          <w:rFonts w:ascii="Consolas" w:hAnsi="Consolas" w:eastAsia="Consolas" w:cs="Consolas"/>
-          <w:sz w:val="15"/>
-          <w:szCs w:val="15"/>
-          <w:lang w:val="en-US"/>
-        </w:rPr>
-        <w:t>LEFT JOIN PrevYearPay p ON p.membership_number = cm.membership_number</w:t>
-      </w:r>
-    </w:p>
-    <w:p xmlns:wp14="http://schemas.microsoft.com/office/word/2010/wordml" wp14:textId="77777777">
-      <w:pPr>
-        <w:shd w:val="clear" w:color="auto" w:fill="F5F5F5"/>
-        <w:spacing w:after="0"/>
-      </w:pPr>
-      <w:r>
-        <w:rPr>
-          <w:rFonts w:ascii="Consolas" w:hAnsi="Consolas" w:eastAsia="Consolas" w:cs="Consolas"/>
-          <w:sz w:val="15"/>
-          <w:szCs w:val="15"/>
-          <w:lang w:val="en-US"/>
-        </w:rPr>
-        <w:t>ORDER BY a.age DESC, l.name ASC;</w:t>
-      </w:r>
-    </w:p>
-    <w:p xmlns:wp14="http://schemas.microsoft.com/office/word/2010/wordml" wp14:textId="77777777">
-      <w:pPr>
-        <w:shd w:val="clear" w:fill="F5F5F5"/>
-        <w:spacing w:after="0"/>
-      </w:pPr>
-      <w:r>
-        <w:rPr>
-          <w:rFonts w:ascii="Consolas" w:hAnsi="Consolas" w:eastAsia="Consolas" w:cs="Consolas"/>
-          <w:sz w:val="15"/>
-          <w:szCs w:val="15"/>
-        </w:rPr>
-        <w:t xml:space="preserve"> </w:t>
-      </w:r>
-    </w:p>
-    <w:p xmlns:wp14="http://schemas.microsoft.com/office/word/2010/wordml" wp14:textId="77777777">
-      <w:pPr>
-        <w:shd w:val="clear" w:fill="F5F5F5"/>
-        <w:spacing w:after="0"/>
-      </w:pPr>
-      <w:r>
-        <w:rPr>
-          <w:rFonts w:ascii="Consolas" w:hAnsi="Consolas" w:eastAsia="Consolas" w:cs="Consolas"/>
-          <w:sz w:val="15"/>
-          <w:szCs w:val="15"/>
-        </w:rPr>
-        <w:t xml:space="preserve"> </w:t>
-      </w:r>
-    </w:p>
-    <w:p xmlns:wp14="http://schemas.microsoft.com/office/word/2010/wordml" wp14:textId="77777777">
-      <w:pPr>
-        <w:shd w:val="clear" w:color="auto" w:fill="F5F5F5"/>
-        <w:spacing w:after="0"/>
-      </w:pPr>
-      <w:r>
-        <w:rPr>
-          <w:rFonts w:ascii="Consolas" w:hAnsi="Consolas" w:eastAsia="Consolas" w:cs="Consolas"/>
-          <w:sz w:val="15"/>
-          <w:szCs w:val="15"/>
-          <w:lang w:val="en-US"/>
-        </w:rPr>
-        <w:t>-- QUERY-4 (iv) Get all major club members (18+) who have never participated in any FIFA game --</w:t>
-      </w:r>
-    </w:p>
-    <w:p xmlns:wp14="http://schemas.microsoft.com/office/word/2010/wordml" wp14:textId="77777777">
-      <w:pPr>
-        <w:shd w:val="clear" w:fill="F5F5F5"/>
-        <w:spacing w:after="0"/>
-      </w:pPr>
-      <w:r>
-        <w:rPr>
-          <w:rFonts w:ascii="Consolas" w:hAnsi="Consolas" w:eastAsia="Consolas" w:cs="Consolas"/>
-          <w:sz w:val="15"/>
-          <w:szCs w:val="15"/>
-        </w:rPr>
-        <w:t xml:space="preserve">SELECT</w:t>
-      </w:r>
-    </w:p>
-    <w:p xmlns:wp14="http://schemas.microsoft.com/office/word/2010/wordml" wp14:textId="77777777">
-      <w:pPr>
-        <w:shd w:val="clear" w:color="auto" w:fill="F5F5F5"/>
-        <w:spacing w:after="0"/>
-      </w:pPr>
-      <w:r>
-        <w:rPr>
-          <w:rFonts w:ascii="Consolas" w:hAnsi="Consolas" w:eastAsia="Consolas" w:cs="Consolas"/>
-          <w:sz w:val="15"/>
-          <w:szCs w:val="15"/>
-          <w:lang w:val="en-US"/>
-        </w:rPr>
-        <w:t xml:space="preserve">    l.name AS location_name,</w:t>
-      </w:r>
-    </w:p>
-    <w:p xmlns:wp14="http://schemas.microsoft.com/office/word/2010/wordml" wp14:textId="77777777">
-      <w:pPr>
-        <w:shd w:val="clear" w:color="auto" w:fill="F5F5F5"/>
-        <w:spacing w:after="0"/>
-      </w:pPr>
-      <w:r>
-        <w:rPr>
-          <w:rFonts w:ascii="Consolas" w:hAnsi="Consolas" w:eastAsia="Consolas" w:cs="Consolas"/>
-          <w:sz w:val="15"/>
-          <w:szCs w:val="15"/>
-          <w:lang w:val="en-US"/>
-        </w:rPr>
-        <w:t xml:space="preserve">    cm.membership_number,</w:t>
-      </w:r>
-    </w:p>
-    <w:p xmlns:wp14="http://schemas.microsoft.com/office/word/2010/wordml" wp14:textId="77777777">
-      <w:pPr>
-        <w:shd w:val="clear" w:color="auto" w:fill="F5F5F5"/>
-        <w:spacing w:after="0"/>
-      </w:pPr>
-      <w:r>
-        <w:rPr>
-          <w:rFonts w:ascii="Consolas" w:hAnsi="Consolas" w:eastAsia="Consolas" w:cs="Consolas"/>
-          <w:sz w:val="15"/>
-          <w:szCs w:val="15"/>
-          <w:lang w:val="en-US"/>
-        </w:rPr>
-        <w:t xml:space="preserve">    cm.first_name,</w:t>
-      </w:r>
-    </w:p>
-    <w:p xmlns:wp14="http://schemas.microsoft.com/office/word/2010/wordml" wp14:textId="77777777">
-      <w:pPr>
-        <w:shd w:val="clear" w:color="auto" w:fill="F5F5F5"/>
-        <w:spacing w:after="0"/>
-      </w:pPr>
-      <w:r>
-        <w:rPr>
-          <w:rFonts w:ascii="Consolas" w:hAnsi="Consolas" w:eastAsia="Consolas" w:cs="Consolas"/>
-          <w:sz w:val="15"/>
-          <w:szCs w:val="15"/>
-          <w:lang w:val="en-US"/>
-        </w:rPr>
-        <w:t xml:space="preserve">    cm.last_name,</w:t>
-      </w:r>
-    </w:p>
-    <w:p xmlns:wp14="http://schemas.microsoft.com/office/word/2010/wordml" wp14:textId="77777777">
-      <w:pPr>
-        <w:shd w:val="clear" w:color="auto" w:fill="F5F5F5"/>
-        <w:spacing w:after="0"/>
-      </w:pPr>
-      <w:r>
-        <w:rPr>
-          <w:rFonts w:ascii="Consolas" w:hAnsi="Consolas" w:eastAsia="Consolas" w:cs="Consolas"/>
-          <w:sz w:val="15"/>
-          <w:szCs w:val="15"/>
-          <w:lang w:val="en-US"/>
-        </w:rPr>
-        <w:t xml:space="preserve">    TIMESTAMPDIFF(YEAR, cm.date_of_birth, CURDATE()) AS age,</w:t>
-      </w:r>
-    </w:p>
-    <w:p xmlns:wp14="http://schemas.microsoft.com/office/word/2010/wordml" wp14:textId="77777777">
-      <w:pPr>
-        <w:shd w:val="clear" w:color="auto" w:fill="F5F5F5"/>
-        <w:spacing w:after="0"/>
-      </w:pPr>
-      <w:r>
-        <w:rPr>
-          <w:rFonts w:ascii="Consolas" w:hAnsi="Consolas" w:eastAsia="Consolas" w:cs="Consolas"/>
-          <w:sz w:val="15"/>
-          <w:szCs w:val="15"/>
-          <w:lang w:val="en-US"/>
-        </w:rPr>
-        <w:t xml:space="preserve">    cm.city,</w:t>
-      </w:r>
-    </w:p>
-    <w:p xmlns:wp14="http://schemas.microsoft.com/office/word/2010/wordml" wp14:textId="77777777">
-      <w:pPr>
-        <w:shd w:val="clear" w:color="auto" w:fill="F5F5F5"/>
-        <w:spacing w:after="0"/>
-      </w:pPr>
-      <w:r>
-        <w:rPr>
-          <w:rFonts w:ascii="Consolas" w:hAnsi="Consolas" w:eastAsia="Consolas" w:cs="Consolas"/>
-          <w:sz w:val="15"/>
-          <w:szCs w:val="15"/>
-          <w:lang w:val="en-US"/>
-        </w:rPr>
-        <w:t xml:space="preserve">    cm.province,</w:t>
-      </w:r>
-    </w:p>
-    <w:p xmlns:wp14="http://schemas.microsoft.com/office/word/2010/wordml" wp14:textId="77777777">
-      <w:pPr>
-        <w:shd w:val="clear" w:fill="F5F5F5"/>
-        <w:spacing w:after="0"/>
-      </w:pPr>
-      <w:r>
-        <w:rPr>
-          <w:rFonts w:ascii="Consolas" w:hAnsi="Consolas" w:eastAsia="Consolas" w:cs="Consolas"/>
-          <w:sz w:val="15"/>
-          <w:szCs w:val="15"/>
-        </w:rPr>
-        <w:t xml:space="preserve"> </w:t>
-      </w:r>
-    </w:p>
-    <w:p xmlns:wp14="http://schemas.microsoft.com/office/word/2010/wordml" wp14:textId="77777777">
-      <w:pPr>
-        <w:shd w:val="clear" w:fill="F5F5F5"/>
-        <w:spacing w:after="0"/>
-      </w:pPr>
-      <w:r>
-        <w:rPr>
-          <w:rFonts w:ascii="Consolas" w:hAnsi="Consolas" w:eastAsia="Consolas" w:cs="Consolas"/>
-          <w:sz w:val="15"/>
-          <w:szCs w:val="15"/>
-        </w:rPr>
-        <w:t xml:space="preserve">    CASE</w:t>
-      </w:r>
-    </w:p>
-    <w:p xmlns:wp14="http://schemas.microsoft.com/office/word/2010/wordml" wp14:textId="77777777">
-      <w:pPr>
-        <w:shd w:val="clear" w:color="auto" w:fill="F5F5F5"/>
-        <w:spacing w:after="0"/>
-      </w:pPr>
-      <w:r>
-        <w:rPr>
-          <w:rFonts w:ascii="Consolas" w:hAnsi="Consolas" w:eastAsia="Consolas" w:cs="Consolas"/>
-          <w:sz w:val="15"/>
-          <w:szCs w:val="15"/>
-          <w:lang w:val="en-US"/>
-        </w:rPr>
-        <w:t xml:space="preserve">        WHEN COALESCE((</w:t>
-      </w:r>
-    </w:p>
-    <w:p xmlns:wp14="http://schemas.microsoft.com/office/word/2010/wordml" wp14:textId="77777777">
-      <w:pPr>
-        <w:shd w:val="clear" w:color="auto" w:fill="F5F5F5"/>
-        <w:spacing w:after="0"/>
-      </w:pPr>
-      <w:r>
-        <w:rPr>
-          <w:rFonts w:ascii="Consolas" w:hAnsi="Consolas" w:eastAsia="Consolas" w:cs="Consolas"/>
-          <w:sz w:val="15"/>
-          <w:szCs w:val="15"/>
-          <w:lang w:val="en-US"/>
-        </w:rPr>
-        <w:t xml:space="preserve">            SELECT SUM(p.amount)</w:t>
-      </w:r>
-    </w:p>
-    <w:p xmlns:wp14="http://schemas.microsoft.com/office/word/2010/wordml" wp14:textId="77777777">
-      <w:pPr>
-        <w:shd w:val="clear" w:fill="F5F5F5"/>
-        <w:spacing w:after="0"/>
-      </w:pPr>
-      <w:r>
-        <w:rPr>
-          <w:rFonts w:ascii="Consolas" w:hAnsi="Consolas" w:eastAsia="Consolas" w:cs="Consolas"/>
-          <w:sz w:val="15"/>
-          <w:szCs w:val="15"/>
-        </w:rPr>
-        <w:t xml:space="preserve">            FROM Payment p</w:t>
-      </w:r>
-    </w:p>
-    <w:p xmlns:wp14="http://schemas.microsoft.com/office/word/2010/wordml" wp14:textId="77777777">
-      <w:pPr>
-        <w:shd w:val="clear" w:color="auto" w:fill="F5F5F5"/>
-        <w:spacing w:after="0"/>
-      </w:pPr>
-      <w:r>
-        <w:rPr>
-          <w:rFonts w:ascii="Consolas" w:hAnsi="Consolas" w:eastAsia="Consolas" w:cs="Consolas"/>
-          <w:sz w:val="15"/>
-          <w:szCs w:val="15"/>
-          <w:lang w:val="en-US"/>
-        </w:rPr>
-        <w:t xml:space="preserve">            WHERE p.membership_number = cm.membership_number</w:t>
-      </w:r>
-    </w:p>
-    <w:p xmlns:wp14="http://schemas.microsoft.com/office/word/2010/wordml" wp14:textId="77777777">
-      <w:pPr>
-        <w:shd w:val="clear" w:color="auto" w:fill="F5F5F5"/>
-        <w:spacing w:after="0"/>
-      </w:pPr>
-      <w:r>
-        <w:rPr>
-          <w:rFonts w:ascii="Consolas" w:hAnsi="Consolas" w:eastAsia="Consolas" w:cs="Consolas"/>
-          <w:sz w:val="15"/>
-          <w:szCs w:val="15"/>
-          <w:lang w:val="en-US"/>
-        </w:rPr>
-        <w:t xml:space="preserve">              AND p.membership_year = YEAR(CURDATE()) - 1</w:t>
-      </w:r>
-    </w:p>
-    <w:p xmlns:wp14="http://schemas.microsoft.com/office/word/2010/wordml" wp14:textId="77777777">
-      <w:pPr>
-        <w:shd w:val="clear" w:fill="F5F5F5"/>
-        <w:spacing w:after="0"/>
-      </w:pPr>
-      <w:r>
-        <w:rPr>
-          <w:rFonts w:ascii="Consolas" w:hAnsi="Consolas" w:eastAsia="Consolas" w:cs="Consolas"/>
-          <w:sz w:val="15"/>
-          <w:szCs w:val="15"/>
-        </w:rPr>
-        <w:t xml:space="preserve">        ), 0) &gt;=</w:t>
-      </w:r>
-    </w:p>
-    <w:p xmlns:wp14="http://schemas.microsoft.com/office/word/2010/wordml" wp14:textId="77777777">
-      <w:pPr>
-        <w:shd w:val="clear" w:fill="F5F5F5"/>
-        <w:spacing w:after="0"/>
-      </w:pPr>
-      <w:r>
-        <w:rPr>
-          <w:rFonts w:ascii="Consolas" w:hAnsi="Consolas" w:eastAsia="Consolas" w:cs="Consolas"/>
-          <w:sz w:val="15"/>
-          <w:szCs w:val="15"/>
-        </w:rPr>
-        <w:t xml:space="preserve">        CASE</w:t>
-      </w:r>
-    </w:p>
-    <w:p xmlns:wp14="http://schemas.microsoft.com/office/word/2010/wordml" wp14:textId="77777777">
-      <w:pPr>
-        <w:shd w:val="clear" w:color="auto" w:fill="F5F5F5"/>
-        <w:spacing w:after="0"/>
-      </w:pPr>
-      <w:r>
-        <w:rPr>
-          <w:rFonts w:ascii="Consolas" w:hAnsi="Consolas" w:eastAsia="Consolas" w:cs="Consolas"/>
-          <w:sz w:val="15"/>
-          <w:szCs w:val="15"/>
-          <w:lang w:val="en-US"/>
-        </w:rPr>
-        <w:t xml:space="preserve">            WHEN TIMESTAMPDIFF(</w:t>
-      </w:r>
-    </w:p>
-    <w:p xmlns:wp14="http://schemas.microsoft.com/office/word/2010/wordml" wp14:textId="77777777">
-      <w:pPr>
-        <w:shd w:val="clear" w:fill="F5F5F5"/>
-        <w:spacing w:after="0"/>
-      </w:pPr>
-      <w:r>
-        <w:rPr>
-          <w:rFonts w:ascii="Consolas" w:hAnsi="Consolas" w:eastAsia="Consolas" w:cs="Consolas"/>
-          <w:sz w:val="15"/>
-          <w:szCs w:val="15"/>
-        </w:rPr>
-        <w:t xml:space="preserve">                YEAR,</w:t>
-      </w:r>
-    </w:p>
-    <w:p xmlns:wp14="http://schemas.microsoft.com/office/word/2010/wordml" wp14:textId="77777777">
-      <w:pPr>
-        <w:shd w:val="clear" w:color="auto" w:fill="F5F5F5"/>
-        <w:spacing w:after="0"/>
-      </w:pPr>
-      <w:r>
-        <w:rPr>
-          <w:rFonts w:ascii="Consolas" w:hAnsi="Consolas" w:eastAsia="Consolas" w:cs="Consolas"/>
-          <w:sz w:val="15"/>
-          <w:szCs w:val="15"/>
-          <w:lang w:val="en-US"/>
-        </w:rPr>
-        <w:t xml:space="preserve">                cm.date_of_birth,</w:t>
-      </w:r>
-    </w:p>
-    <w:p xmlns:wp14="http://schemas.microsoft.com/office/word/2010/wordml" wp14:textId="77777777">
-      <w:pPr>
-        <w:shd w:val="clear" w:color="auto" w:fill="F5F5F5"/>
-        <w:spacing w:after="0"/>
-      </w:pPr>
-      <w:r>
-        <w:rPr>
-          <w:rFonts w:ascii="Consolas" w:hAnsi="Consolas" w:eastAsia="Consolas" w:cs="Consolas"/>
-          <w:sz w:val="15"/>
-          <w:szCs w:val="15"/>
-          <w:lang w:val="en-US"/>
-        </w:rPr>
-        <w:t xml:space="preserve">                STR_TO_DATE(</w:t>
-      </w:r>
-    </w:p>
-    <w:p xmlns:wp14="http://schemas.microsoft.com/office/word/2010/wordml" wp14:textId="77777777">
-      <w:pPr>
-        <w:shd w:val="clear" w:color="auto" w:fill="F5F5F5"/>
-        <w:spacing w:after="0"/>
-      </w:pPr>
-      <w:r>
-        <w:rPr>
-          <w:rFonts w:ascii="Consolas" w:hAnsi="Consolas" w:eastAsia="Consolas" w:cs="Consolas"/>
-          <w:sz w:val="15"/>
-          <w:szCs w:val="15"/>
-          <w:lang w:val="en-US"/>
-        </w:rPr>
-        <w:t xml:space="preserve">                    CONCAT(YEAR(CURDATE()) - 1, '-12-31'),</w:t>
-      </w:r>
-    </w:p>
-    <w:p xmlns:wp14="http://schemas.microsoft.com/office/word/2010/wordml" wp14:textId="77777777">
-      <w:pPr>
-        <w:shd w:val="clear" w:fill="F5F5F5"/>
-        <w:spacing w:after="0"/>
-      </w:pPr>
-      <w:r>
-        <w:rPr>
-          <w:rFonts w:ascii="Consolas" w:hAnsi="Consolas" w:eastAsia="Consolas" w:cs="Consolas"/>
-          <w:sz w:val="15"/>
-          <w:szCs w:val="15"/>
-        </w:rPr>
-        <w:t xml:space="preserve">                    '%Y-%m-%d'</w:t>
-      </w:r>
-    </w:p>
-    <w:p xmlns:wp14="http://schemas.microsoft.com/office/word/2010/wordml" wp14:textId="77777777">
-      <w:pPr>
-        <w:shd w:val="clear" w:fill="F5F5F5"/>
-        <w:spacing w:after="0"/>
-      </w:pPr>
-      <w:r>
-        <w:rPr>
-          <w:rFonts w:ascii="Consolas" w:hAnsi="Consolas" w:eastAsia="Consolas" w:cs="Consolas"/>
-          <w:sz w:val="15"/>
-          <w:szCs w:val="15"/>
-        </w:rPr>
-        <w:t xml:space="preserve">                )</w:t>
-      </w:r>
-    </w:p>
-    <w:p xmlns:wp14="http://schemas.microsoft.com/office/word/2010/wordml" wp14:textId="77777777">
-      <w:pPr>
-        <w:shd w:val="clear" w:fill="F5F5F5"/>
-        <w:spacing w:after="0"/>
-      </w:pPr>
-      <w:r>
-        <w:rPr>
-          <w:rFonts w:ascii="Consolas" w:hAnsi="Consolas" w:eastAsia="Consolas" w:cs="Consolas"/>
-          <w:sz w:val="15"/>
-          <w:szCs w:val="15"/>
-        </w:rPr>
-        <w:t xml:space="preserve">            ) &gt;= 18</w:t>
-      </w:r>
-    </w:p>
-    <w:p xmlns:wp14="http://schemas.microsoft.com/office/word/2010/wordml" wp14:textId="77777777">
-      <w:pPr>
-        <w:shd w:val="clear" w:fill="F5F5F5"/>
-        <w:spacing w:after="0"/>
-      </w:pPr>
-      <w:r>
-        <w:rPr>
-          <w:rFonts w:ascii="Consolas" w:hAnsi="Consolas" w:eastAsia="Consolas" w:cs="Consolas"/>
-          <w:sz w:val="15"/>
-          <w:szCs w:val="15"/>
-        </w:rPr>
-        <w:t xml:space="preserve">            THEN 200</w:t>
-      </w:r>
-    </w:p>
-    <w:p xmlns:wp14="http://schemas.microsoft.com/office/word/2010/wordml" wp14:textId="77777777">
-      <w:pPr>
-        <w:shd w:val="clear" w:fill="F5F5F5"/>
-        <w:spacing w:after="0"/>
-      </w:pPr>
-      <w:r>
-        <w:rPr>
-          <w:rFonts w:ascii="Consolas" w:hAnsi="Consolas" w:eastAsia="Consolas" w:cs="Consolas"/>
-          <w:sz w:val="15"/>
-          <w:szCs w:val="15"/>
-        </w:rPr>
-        <w:t xml:space="preserve">            ELSE 100</w:t>
-      </w:r>
-    </w:p>
-    <w:p xmlns:wp14="http://schemas.microsoft.com/office/word/2010/wordml" wp14:textId="77777777">
-      <w:pPr>
-        <w:shd w:val="clear" w:fill="F5F5F5"/>
-        <w:spacing w:after="0"/>
-      </w:pPr>
-      <w:r>
-        <w:rPr>
-          <w:rFonts w:ascii="Consolas" w:hAnsi="Consolas" w:eastAsia="Consolas" w:cs="Consolas"/>
-          <w:sz w:val="15"/>
-          <w:szCs w:val="15"/>
-        </w:rPr>
-        <w:t xml:space="preserve">        END</w:t>
-      </w:r>
-    </w:p>
-    <w:p xmlns:wp14="http://schemas.microsoft.com/office/word/2010/wordml" wp14:textId="77777777">
-      <w:pPr>
-        <w:shd w:val="clear" w:fill="F5F5F5"/>
-        <w:spacing w:after="0"/>
-      </w:pPr>
-      <w:r>
-        <w:rPr>
-          <w:rFonts w:ascii="Consolas" w:hAnsi="Consolas" w:eastAsia="Consolas" w:cs="Consolas"/>
-          <w:sz w:val="15"/>
-          <w:szCs w:val="15"/>
-        </w:rPr>
-        <w:t xml:space="preserve">        THEN 'Active'</w:t>
-      </w:r>
-    </w:p>
-    <w:p xmlns:wp14="http://schemas.microsoft.com/office/word/2010/wordml" wp14:textId="77777777">
-      <w:pPr>
-        <w:shd w:val="clear" w:fill="F5F5F5"/>
-        <w:spacing w:after="0"/>
-      </w:pPr>
-      <w:r>
-        <w:rPr>
-          <w:rFonts w:ascii="Consolas" w:hAnsi="Consolas" w:eastAsia="Consolas" w:cs="Consolas"/>
-          <w:sz w:val="15"/>
-          <w:szCs w:val="15"/>
-        </w:rPr>
-        <w:t xml:space="preserve">        ELSE 'Inactive'</w:t>
-      </w:r>
-    </w:p>
-    <w:p xmlns:wp14="http://schemas.microsoft.com/office/word/2010/wordml" wp14:textId="77777777">
-      <w:pPr>
-        <w:shd w:val="clear" w:fill="F5F5F5"/>
-        <w:spacing w:after="0"/>
-      </w:pPr>
-      <w:r>
-        <w:rPr>
-          <w:rFonts w:ascii="Consolas" w:hAnsi="Consolas" w:eastAsia="Consolas" w:cs="Consolas"/>
-          <w:sz w:val="15"/>
-          <w:szCs w:val="15"/>
-        </w:rPr>
-        <w:t xml:space="preserve">    END AS status</w:t>
-      </w:r>
-    </w:p>
-    <w:p xmlns:wp14="http://schemas.microsoft.com/office/word/2010/wordml" wp14:textId="77777777">
-      <w:pPr>
-        <w:shd w:val="clear" w:color="auto" w:fill="F5F5F5"/>
-        <w:spacing w:after="0"/>
-      </w:pPr>
-      <w:r>
-        <w:rPr>
-          <w:rFonts w:ascii="Consolas" w:hAnsi="Consolas" w:eastAsia="Consolas" w:cs="Consolas"/>
-          <w:sz w:val="15"/>
-          <w:szCs w:val="15"/>
-          <w:lang w:val="en-US"/>
-        </w:rPr>
-        <w:t>FROM ClubMember cm</w:t>
-      </w:r>
-    </w:p>
-    <w:p xmlns:wp14="http://schemas.microsoft.com/office/word/2010/wordml" wp14:textId="77777777">
-      <w:pPr>
-        <w:shd w:val="clear" w:fill="F5F5F5"/>
-        <w:spacing w:after="0"/>
-      </w:pPr>
-      <w:r>
-        <w:rPr>
-          <w:rFonts w:ascii="Consolas" w:hAnsi="Consolas" w:eastAsia="Consolas" w:cs="Consolas"/>
-          <w:sz w:val="15"/>
-          <w:szCs w:val="15"/>
-        </w:rPr>
-        <w:t xml:space="preserve">JOIN Location l</w:t>
-      </w:r>
-    </w:p>
-    <w:p xmlns:wp14="http://schemas.microsoft.com/office/word/2010/wordml" wp14:textId="77777777">
-      <w:pPr>
-        <w:shd w:val="clear" w:color="auto" w:fill="F5F5F5"/>
-        <w:spacing w:after="0"/>
-      </w:pPr>
-      <w:r>
-        <w:rPr>
-          <w:rFonts w:ascii="Consolas" w:hAnsi="Consolas" w:eastAsia="Consolas" w:cs="Consolas"/>
-          <w:sz w:val="15"/>
-          <w:szCs w:val="15"/>
-          <w:lang w:val="en-US"/>
-        </w:rPr>
-        <w:t xml:space="preserve">    ON l.location_id = cm.location_id</w:t>
-      </w:r>
-    </w:p>
-    <w:p xmlns:wp14="http://schemas.microsoft.com/office/word/2010/wordml" wp14:textId="77777777">
-      <w:pPr>
-        <w:shd w:val="clear" w:color="auto" w:fill="F5F5F5"/>
-        <w:spacing w:after="0"/>
-      </w:pPr>
-      <w:r>
-        <w:rPr>
-          <w:rFonts w:ascii="Consolas" w:hAnsi="Consolas" w:eastAsia="Consolas" w:cs="Consolas"/>
-          <w:sz w:val="15"/>
-          <w:szCs w:val="15"/>
-          <w:lang w:val="en-US"/>
-        </w:rPr>
-        <w:t>WHERE TIMESTAMPDIFF(</w:t>
-      </w:r>
-    </w:p>
-    <w:p xmlns:wp14="http://schemas.microsoft.com/office/word/2010/wordml" wp14:textId="77777777">
-      <w:pPr>
-        <w:shd w:val="clear" w:fill="F5F5F5"/>
-        <w:spacing w:after="0"/>
-      </w:pPr>
-      <w:r>
-        <w:rPr>
-          <w:rFonts w:ascii="Consolas" w:hAnsi="Consolas" w:eastAsia="Consolas" w:cs="Consolas"/>
-          <w:sz w:val="15"/>
-          <w:szCs w:val="15"/>
-        </w:rPr>
-        <w:t xml:space="preserve">          YEAR,</w:t>
-      </w:r>
-    </w:p>
-    <w:p xmlns:wp14="http://schemas.microsoft.com/office/word/2010/wordml" wp14:textId="77777777">
-      <w:pPr>
-        <w:shd w:val="clear" w:color="auto" w:fill="F5F5F5"/>
-        <w:spacing w:after="0"/>
-      </w:pPr>
-      <w:r>
-        <w:rPr>
-          <w:rFonts w:ascii="Consolas" w:hAnsi="Consolas" w:eastAsia="Consolas" w:cs="Consolas"/>
-          <w:sz w:val="15"/>
-          <w:szCs w:val="15"/>
-          <w:lang w:val="en-US"/>
-        </w:rPr>
-        <w:t xml:space="preserve">          cm.date_of_birth,</w:t>
-      </w:r>
-    </w:p>
-    <w:p xmlns:wp14="http://schemas.microsoft.com/office/word/2010/wordml" wp14:textId="77777777">
-      <w:pPr>
-        <w:shd w:val="clear" w:color="auto" w:fill="F5F5F5"/>
-        <w:spacing w:after="0"/>
-      </w:pPr>
-      <w:r>
-        <w:rPr>
-          <w:rFonts w:ascii="Consolas" w:hAnsi="Consolas" w:eastAsia="Consolas" w:cs="Consolas"/>
-          <w:sz w:val="15"/>
-          <w:szCs w:val="15"/>
-          <w:lang w:val="en-US"/>
-        </w:rPr>
-        <w:t xml:space="preserve">          CURDATE()</w:t>
-      </w:r>
-    </w:p>
-    <w:p xmlns:wp14="http://schemas.microsoft.com/office/word/2010/wordml" wp14:textId="77777777">
-      <w:pPr>
-        <w:shd w:val="clear" w:fill="F5F5F5"/>
-        <w:spacing w:after="0"/>
-      </w:pPr>
-      <w:r>
-        <w:rPr>
-          <w:rFonts w:ascii="Consolas" w:hAnsi="Consolas" w:eastAsia="Consolas" w:cs="Consolas"/>
-          <w:sz w:val="15"/>
-          <w:szCs w:val="15"/>
-        </w:rPr>
-        <w:t xml:space="preserve">      ) &gt;= 18</w:t>
-      </w:r>
-    </w:p>
-    <w:p xmlns:wp14="http://schemas.microsoft.com/office/word/2010/wordml" wp14:textId="77777777">
-      <w:pPr>
-        <w:shd w:val="clear" w:fill="F5F5F5"/>
-        <w:spacing w:after="0"/>
-      </w:pPr>
-      <w:r>
-        <w:rPr>
-          <w:rFonts w:ascii="Consolas" w:hAnsi="Consolas" w:eastAsia="Consolas" w:cs="Consolas"/>
-          <w:sz w:val="15"/>
-          <w:szCs w:val="15"/>
-        </w:rPr>
-        <w:t xml:space="preserve">  AND NOT EXISTS (</w:t>
-      </w:r>
-    </w:p>
-    <w:p xmlns:wp14="http://schemas.microsoft.com/office/word/2010/wordml" wp14:textId="77777777">
-      <w:pPr>
-        <w:shd w:val="clear" w:fill="F5F5F5"/>
-        <w:spacing w:after="0"/>
-      </w:pPr>
-      <w:r>
-        <w:rPr>
-          <w:rFonts w:ascii="Consolas" w:hAnsi="Consolas" w:eastAsia="Consolas" w:cs="Consolas"/>
-          <w:sz w:val="15"/>
-          <w:szCs w:val="15"/>
-        </w:rPr>
-        <w:t xml:space="preserve">      SELECT 1</w:t>
-      </w:r>
-    </w:p>
-    <w:p xmlns:wp14="http://schemas.microsoft.com/office/word/2010/wordml" wp14:textId="77777777">
-      <w:pPr>
-        <w:shd w:val="clear" w:color="auto" w:fill="F5F5F5"/>
-        <w:spacing w:after="0"/>
-      </w:pPr>
-      <w:r>
-        <w:rPr>
-          <w:rFonts w:ascii="Consolas" w:hAnsi="Consolas" w:eastAsia="Consolas" w:cs="Consolas"/>
-          <w:sz w:val="15"/>
-          <w:szCs w:val="15"/>
-          <w:lang w:val="en-US"/>
-        </w:rPr>
-        <w:t xml:space="preserve">      FROM FIFAParticipation fp</w:t>
-      </w:r>
-    </w:p>
-    <w:p xmlns:wp14="http://schemas.microsoft.com/office/word/2010/wordml" wp14:textId="77777777">
-      <w:pPr>
-        <w:shd w:val="clear" w:color="auto" w:fill="F5F5F5"/>
-        <w:spacing w:after="0"/>
-      </w:pPr>
-      <w:r>
-        <w:rPr>
-          <w:rFonts w:ascii="Consolas" w:hAnsi="Consolas" w:eastAsia="Consolas" w:cs="Consolas"/>
-          <w:sz w:val="15"/>
-          <w:szCs w:val="15"/>
-          <w:lang w:val="en-US"/>
-        </w:rPr>
-        <w:t xml:space="preserve">      WHERE fp.membership_number = cm.membership_number</w:t>
-      </w:r>
-    </w:p>
-    <w:p xmlns:wp14="http://schemas.microsoft.com/office/word/2010/wordml" wp14:textId="77777777">
-      <w:pPr>
-        <w:shd w:val="clear" w:fill="F5F5F5"/>
-        <w:spacing w:after="0"/>
-      </w:pPr>
-      <w:r>
-        <w:rPr>
-          <w:rFonts w:ascii="Consolas" w:hAnsi="Consolas" w:eastAsia="Consolas" w:cs="Consolas"/>
-          <w:sz w:val="15"/>
-          <w:szCs w:val="15"/>
-        </w:rPr>
-        <w:t xml:space="preserve">  )</w:t>
-      </w:r>
-    </w:p>
-    <w:p xmlns:wp14="http://schemas.microsoft.com/office/word/2010/wordml" wp14:textId="77777777">
-      <w:pPr>
-        <w:shd w:val="clear" w:fill="F5F5F5"/>
-        <w:spacing w:after="0"/>
-      </w:pPr>
-      <w:r>
-        <w:rPr>
-          <w:rFonts w:ascii="Consolas" w:hAnsi="Consolas" w:eastAsia="Consolas" w:cs="Consolas"/>
-          <w:sz w:val="15"/>
-          <w:szCs w:val="15"/>
-        </w:rPr>
-        <w:t xml:space="preserve">ORDER BY</w:t>
-      </w:r>
-    </w:p>
-    <w:p xmlns:wp14="http://schemas.microsoft.com/office/word/2010/wordml" wp14:textId="77777777">
-      <w:pPr>
-        <w:shd w:val="clear" w:color="auto" w:fill="F5F5F5"/>
-        <w:spacing w:after="0"/>
-      </w:pPr>
-      <w:r>
-        <w:rPr>
-          <w:rFonts w:ascii="Consolas" w:hAnsi="Consolas" w:eastAsia="Consolas" w:cs="Consolas"/>
-          <w:sz w:val="15"/>
-          <w:szCs w:val="15"/>
-          <w:lang w:val="en-US"/>
-        </w:rPr>
-        <w:t xml:space="preserve">    location_name ASC,</w:t>
-      </w:r>
-    </w:p>
-    <w:p xmlns:wp14="http://schemas.microsoft.com/office/word/2010/wordml" wp14:textId="77777777">
-      <w:pPr>
-        <w:shd w:val="clear" w:fill="F5F5F5"/>
-        <w:spacing w:after="0"/>
-      </w:pPr>
-      <w:r>
-        <w:rPr>
-          <w:rFonts w:ascii="Consolas" w:hAnsi="Consolas" w:eastAsia="Consolas" w:cs="Consolas"/>
-          <w:sz w:val="15"/>
-          <w:szCs w:val="15"/>
-        </w:rPr>
-        <w:t xml:space="preserve">    age ASC;</w:t>
-      </w:r>
-    </w:p>
-    <w:p xmlns:wp14="http://schemas.microsoft.com/office/word/2010/wordml" wp14:textId="77777777">
-      <w:pPr>
-        <w:shd w:val="clear" w:fill="F5F5F5"/>
-        <w:spacing w:after="0"/>
-      </w:pPr>
-      <w:r>
-        <w:rPr>
-          <w:rFonts w:ascii="Consolas" w:hAnsi="Consolas" w:eastAsia="Consolas" w:cs="Consolas"/>
-          <w:sz w:val="15"/>
-          <w:szCs w:val="15"/>
-        </w:rPr>
-        <w:t xml:space="preserve"> </w:t>
-      </w:r>
-    </w:p>
-    <w:p xmlns:wp14="http://schemas.microsoft.com/office/word/2010/wordml" wp14:textId="77777777">
-      <w:pPr>
-        <w:shd w:val="clear" w:fill="F5F5F5"/>
-        <w:spacing w:after="0"/>
-      </w:pPr>
-      <w:r>
-        <w:rPr>
-          <w:rFonts w:ascii="Consolas" w:hAnsi="Consolas" w:eastAsia="Consolas" w:cs="Consolas"/>
-          <w:sz w:val="15"/>
-          <w:szCs w:val="15"/>
-        </w:rPr>
-        <w:t xml:space="preserve">-- QUERY-5 (v): total number of club members for every age</w:t>
-      </w:r>
-    </w:p>
-    <w:p xmlns:wp14="http://schemas.microsoft.com/office/word/2010/wordml" wp14:textId="77777777">
-      <w:pPr>
-        <w:shd w:val="clear" w:fill="F5F5F5"/>
-        <w:spacing w:after="0"/>
-      </w:pPr>
-      <w:r>
-        <w:rPr>
-          <w:rFonts w:ascii="Consolas" w:hAnsi="Consolas" w:eastAsia="Consolas" w:cs="Consolas"/>
-          <w:sz w:val="15"/>
-          <w:szCs w:val="15"/>
-        </w:rPr>
-        <w:t xml:space="preserve">SELECT</w:t>
-      </w:r>
-    </w:p>
-    <w:p xmlns:wp14="http://schemas.microsoft.com/office/word/2010/wordml" wp14:textId="77777777">
-      <w:pPr>
-        <w:shd w:val="clear" w:color="auto" w:fill="F5F5F5"/>
-        <w:spacing w:after="0"/>
-      </w:pPr>
-      <w:r>
-        <w:rPr>
-          <w:rFonts w:ascii="Consolas" w:hAnsi="Consolas" w:eastAsia="Consolas" w:cs="Consolas"/>
-          <w:sz w:val="15"/>
-          <w:szCs w:val="15"/>
-          <w:lang w:val="en-US"/>
-        </w:rPr>
-        <w:t xml:space="preserve">    TIMESTAMPDIFF(YEAR, date_of_birth, CURDATE()) AS age,</w:t>
-      </w:r>
-    </w:p>
-    <w:p xmlns:wp14="http://schemas.microsoft.com/office/word/2010/wordml" wp14:textId="77777777">
-      <w:pPr>
-        <w:shd w:val="clear" w:color="auto" w:fill="F5F5F5"/>
-        <w:spacing w:after="0"/>
-      </w:pPr>
-      <w:r>
-        <w:rPr>
-          <w:rFonts w:ascii="Consolas" w:hAnsi="Consolas" w:eastAsia="Consolas" w:cs="Consolas"/>
-          <w:sz w:val="15"/>
-          <w:szCs w:val="15"/>
-          <w:lang w:val="en-US"/>
-        </w:rPr>
-        <w:t xml:space="preserve">    COUNT(*) AS total_club_members</w:t>
-      </w:r>
-    </w:p>
-    <w:p xmlns:wp14="http://schemas.microsoft.com/office/word/2010/wordml" wp14:textId="77777777">
-      <w:pPr>
-        <w:shd w:val="clear" w:color="auto" w:fill="F5F5F5"/>
-        <w:spacing w:after="0"/>
-      </w:pPr>
-      <w:r>
-        <w:rPr>
-          <w:rFonts w:ascii="Consolas" w:hAnsi="Consolas" w:eastAsia="Consolas" w:cs="Consolas"/>
-          <w:sz w:val="15"/>
-          <w:szCs w:val="15"/>
-          <w:lang w:val="en-US"/>
-        </w:rPr>
-        <w:t>FROM ClubMember</w:t>
-      </w:r>
-    </w:p>
-    <w:p xmlns:wp14="http://schemas.microsoft.com/office/word/2010/wordml" wp14:textId="77777777">
-      <w:pPr>
-        <w:shd w:val="clear" w:fill="F5F5F5"/>
-        <w:spacing w:after="0"/>
-      </w:pPr>
-      <w:r>
-        <w:rPr>
-          <w:rFonts w:ascii="Consolas" w:hAnsi="Consolas" w:eastAsia="Consolas" w:cs="Consolas"/>
-          <w:sz w:val="15"/>
-          <w:szCs w:val="15"/>
-        </w:rPr>
-        <w:t xml:space="preserve">GROUP BY age</w:t>
-      </w:r>
-    </w:p>
-    <w:p xmlns:wp14="http://schemas.microsoft.com/office/word/2010/wordml" wp14:textId="77777777">
-      <w:pPr>
-        <w:shd w:val="clear" w:fill="F5F5F5"/>
-        <w:spacing w:after="0"/>
-      </w:pPr>
-      <w:r>
-        <w:rPr>
-          <w:rFonts w:ascii="Consolas" w:hAnsi="Consolas" w:eastAsia="Consolas" w:cs="Consolas"/>
-          <w:sz w:val="15"/>
-          <w:szCs w:val="15"/>
-        </w:rPr>
-        <w:t xml:space="preserve">ORDER BY age DESC;</w:t>
-      </w:r>
-    </w:p>
-    <w:p xmlns:wp14="http://schemas.microsoft.com/office/word/2010/wordml" wp14:textId="77777777">
-      <w:pPr>
-        <w:shd w:val="clear" w:fill="F5F5F5"/>
-        <w:spacing w:after="0"/>
-      </w:pPr>
-      <w:r>
-        <w:rPr>
-          <w:rFonts w:ascii="Consolas" w:hAnsi="Consolas" w:eastAsia="Consolas" w:cs="Consolas"/>
-          <w:sz w:val="15"/>
-          <w:szCs w:val="15"/>
-        </w:rPr>
-        <w:t xml:space="preserve"> </w:t>
-      </w:r>
-    </w:p>
-    <w:p xmlns:wp14="http://schemas.microsoft.com/office/word/2010/wordml" wp14:textId="77777777">
-      <w:pPr>
-        <w:shd w:val="clear" w:fill="F5F5F5"/>
-        <w:spacing w:after="0"/>
-      </w:pPr>
-      <w:r>
-        <w:rPr>
-          <w:rFonts w:ascii="Consolas" w:hAnsi="Consolas" w:eastAsia="Consolas" w:cs="Consolas"/>
-          <w:sz w:val="15"/>
-          <w:szCs w:val="15"/>
-        </w:rPr>
-        <w:t xml:space="preserve">-- QUERY-6 (vi): Major members who are also family members</w:t>
-      </w:r>
-    </w:p>
-    <w:p xmlns:wp14="http://schemas.microsoft.com/office/word/2010/wordml" wp14:textId="77777777">
-      <w:pPr>
-        <w:shd w:val="clear" w:fill="F5F5F5"/>
-        <w:spacing w:after="0"/>
-      </w:pPr>
-      <w:r>
-        <w:rPr>
-          <w:rFonts w:ascii="Consolas" w:hAnsi="Consolas" w:eastAsia="Consolas" w:cs="Consolas"/>
-          <w:sz w:val="15"/>
-          <w:szCs w:val="15"/>
-        </w:rPr>
-        <w:t xml:space="preserve">SELECT</w:t>
-      </w:r>
-    </w:p>
-    <w:p xmlns:wp14="http://schemas.microsoft.com/office/word/2010/wordml" wp14:textId="77777777">
-      <w:pPr>
-        <w:shd w:val="clear" w:color="auto" w:fill="F5F5F5"/>
-        <w:spacing w:after="0"/>
-      </w:pPr>
-      <w:r>
-        <w:rPr>
-          <w:rFonts w:ascii="Consolas" w:hAnsi="Consolas" w:eastAsia="Consolas" w:cs="Consolas"/>
-          <w:sz w:val="15"/>
-          <w:szCs w:val="15"/>
-          <w:lang w:val="en-US"/>
-        </w:rPr>
-        <w:t xml:space="preserve">    cm.membership_number                         AS member_number,</w:t>
-      </w:r>
-    </w:p>
-    <w:p xmlns:wp14="http://schemas.microsoft.com/office/word/2010/wordml" wp14:textId="77777777">
-      <w:pPr>
-        <w:shd w:val="clear" w:color="auto" w:fill="F5F5F5"/>
-        <w:spacing w:after="0"/>
-      </w:pPr>
-      <w:r>
-        <w:rPr>
-          <w:rFonts w:ascii="Consolas" w:hAnsi="Consolas" w:eastAsia="Consolas" w:cs="Consolas"/>
-          <w:sz w:val="15"/>
-          <w:szCs w:val="15"/>
-          <w:lang w:val="en-US"/>
-        </w:rPr>
-        <w:t xml:space="preserve">    CONCAT(cm.first_name, ' ', cm.last_name)      AS member_name,</w:t>
-      </w:r>
-    </w:p>
-    <w:p xmlns:wp14="http://schemas.microsoft.com/office/word/2010/wordml" wp14:textId="77777777">
-      <w:pPr>
-        <w:shd w:val="clear" w:color="auto" w:fill="F5F5F5"/>
-        <w:spacing w:after="0"/>
-      </w:pPr>
-      <w:r>
-        <w:rPr>
-          <w:rFonts w:ascii="Consolas" w:hAnsi="Consolas" w:eastAsia="Consolas" w:cs="Consolas"/>
-          <w:sz w:val="15"/>
-          <w:szCs w:val="15"/>
-          <w:lang w:val="en-US"/>
-        </w:rPr>
-        <w:t xml:space="preserve">    child.membership_number                       AS associated_member_number,</w:t>
-      </w:r>
-    </w:p>
-    <w:p xmlns:wp14="http://schemas.microsoft.com/office/word/2010/wordml" wp14:textId="77777777">
-      <w:pPr>
-        <w:shd w:val="clear" w:color="auto" w:fill="F5F5F5"/>
-        <w:spacing w:after="0"/>
-      </w:pPr>
-      <w:r>
-        <w:rPr>
-          <w:rFonts w:ascii="Consolas" w:hAnsi="Consolas" w:eastAsia="Consolas" w:cs="Consolas"/>
-          <w:sz w:val="15"/>
-          <w:szCs w:val="15"/>
-          <w:lang w:val="en-US"/>
-        </w:rPr>
-        <w:t xml:space="preserve">    CONCAT(child.first_name, ' ', child.last_name) AS associated_member_name,</w:t>
-      </w:r>
-    </w:p>
-    <w:p xmlns:wp14="http://schemas.microsoft.com/office/word/2010/wordml" wp14:textId="77777777">
-      <w:pPr>
-        <w:shd w:val="clear" w:color="auto" w:fill="F5F5F5"/>
-        <w:spacing w:after="0"/>
-      </w:pPr>
-      <w:r>
-        <w:rPr>
-          <w:rFonts w:ascii="Consolas" w:hAnsi="Consolas" w:eastAsia="Consolas" w:cs="Consolas"/>
-          <w:sz w:val="15"/>
-          <w:szCs w:val="15"/>
-          <w:lang w:val="en-US"/>
-        </w:rPr>
-        <w:t xml:space="preserve">    child.date_of_birth                            AS associated_dob,</w:t>
-      </w:r>
-    </w:p>
-    <w:p xmlns:wp14="http://schemas.microsoft.com/office/word/2010/wordml" wp14:textId="77777777">
-      <w:pPr>
-        <w:shd w:val="clear" w:color="auto" w:fill="F5F5F5"/>
-        <w:spacing w:after="0"/>
-      </w:pPr>
-      <w:r>
-        <w:rPr>
-          <w:rFonts w:ascii="Consolas" w:hAnsi="Consolas" w:eastAsia="Consolas" w:cs="Consolas"/>
-          <w:sz w:val="15"/>
-          <w:szCs w:val="15"/>
-          <w:lang w:val="en-US"/>
-        </w:rPr>
-        <w:t xml:space="preserve">    child.ssn                                      AS associated_ssn,</w:t>
-      </w:r>
-    </w:p>
-    <w:p xmlns:wp14="http://schemas.microsoft.com/office/word/2010/wordml" wp14:textId="77777777">
-      <w:pPr>
-        <w:shd w:val="clear" w:color="auto" w:fill="F5F5F5"/>
-        <w:spacing w:after="0"/>
-      </w:pPr>
-      <w:r>
-        <w:rPr>
-          <w:rFonts w:ascii="Consolas" w:hAnsi="Consolas" w:eastAsia="Consolas" w:cs="Consolas"/>
-          <w:sz w:val="15"/>
-          <w:szCs w:val="15"/>
-          <w:lang w:val="en-US"/>
-        </w:rPr>
-        <w:t xml:space="preserve">    child.medicare_number                          AS associated_medicare_number,</w:t>
-      </w:r>
-    </w:p>
-    <w:p xmlns:wp14="http://schemas.microsoft.com/office/word/2010/wordml" wp14:textId="77777777">
-      <w:pPr>
-        <w:shd w:val="clear" w:color="auto" w:fill="F5F5F5"/>
-        <w:spacing w:after="0"/>
-      </w:pPr>
-      <w:r>
-        <w:rPr>
-          <w:rFonts w:ascii="Consolas" w:hAnsi="Consolas" w:eastAsia="Consolas" w:cs="Consolas"/>
-          <w:sz w:val="15"/>
-          <w:szCs w:val="15"/>
-          <w:lang w:val="en-US"/>
-        </w:rPr>
-        <w:t xml:space="preserve">    child.phone_number                             AS associated_phone,</w:t>
-      </w:r>
-    </w:p>
-    <w:p xmlns:wp14="http://schemas.microsoft.com/office/word/2010/wordml" wp14:textId="77777777">
-      <w:pPr>
-        <w:shd w:val="clear" w:color="auto" w:fill="F5F5F5"/>
-        <w:spacing w:after="0"/>
-      </w:pPr>
-      <w:r>
-        <w:rPr>
-          <w:rFonts w:ascii="Consolas" w:hAnsi="Consolas" w:eastAsia="Consolas" w:cs="Consolas"/>
-          <w:sz w:val="15"/>
-          <w:szCs w:val="15"/>
-          <w:lang w:val="en-US"/>
-        </w:rPr>
-        <w:t xml:space="preserve">    child.address                                  AS associated_address,</w:t>
-      </w:r>
-    </w:p>
-    <w:p xmlns:wp14="http://schemas.microsoft.com/office/word/2010/wordml" wp14:textId="77777777">
-      <w:pPr>
-        <w:shd w:val="clear" w:color="auto" w:fill="F5F5F5"/>
-        <w:spacing w:after="0"/>
-      </w:pPr>
-      <w:r>
-        <w:rPr>
-          <w:rFonts w:ascii="Consolas" w:hAnsi="Consolas" w:eastAsia="Consolas" w:cs="Consolas"/>
-          <w:sz w:val="15"/>
-          <w:szCs w:val="15"/>
-          <w:lang w:val="en-US"/>
-        </w:rPr>
-        <w:t xml:space="preserve">    child.city                                     AS associated_city,</w:t>
-      </w:r>
-    </w:p>
-    <w:p xmlns:wp14="http://schemas.microsoft.com/office/word/2010/wordml" wp14:textId="77777777">
-      <w:pPr>
-        <w:shd w:val="clear" w:color="auto" w:fill="F5F5F5"/>
-        <w:spacing w:after="0"/>
-      </w:pPr>
-      <w:r>
-        <w:rPr>
-          <w:rFonts w:ascii="Consolas" w:hAnsi="Consolas" w:eastAsia="Consolas" w:cs="Consolas"/>
-          <w:sz w:val="15"/>
-          <w:szCs w:val="15"/>
-          <w:lang w:val="en-US"/>
-        </w:rPr>
-        <w:t xml:space="preserve">    child.province                                 AS associated_province,</w:t>
-      </w:r>
-    </w:p>
-    <w:p xmlns:wp14="http://schemas.microsoft.com/office/word/2010/wordml" wp14:textId="77777777">
-      <w:pPr>
-        <w:shd w:val="clear" w:color="auto" w:fill="F5F5F5"/>
-        <w:spacing w:after="0"/>
-      </w:pPr>
-      <w:r>
-        <w:rPr>
-          <w:rFonts w:ascii="Consolas" w:hAnsi="Consolas" w:eastAsia="Consolas" w:cs="Consolas"/>
-          <w:sz w:val="15"/>
-          <w:szCs w:val="15"/>
-          <w:lang w:val="en-US"/>
-        </w:rPr>
-        <w:t xml:space="preserve">    child.postal_code                              AS associated_postal_code,</w:t>
-      </w:r>
-    </w:p>
-    <w:p xmlns:wp14="http://schemas.microsoft.com/office/word/2010/wordml" wp14:textId="77777777">
-      <w:pPr>
-        <w:shd w:val="clear" w:color="auto" w:fill="F5F5F5"/>
-        <w:spacing w:after="0"/>
-      </w:pPr>
-      <w:r>
-        <w:rPr>
-          <w:rFonts w:ascii="Consolas" w:hAnsi="Consolas" w:eastAsia="Consolas" w:cs="Consolas"/>
-          <w:sz w:val="15"/>
-          <w:szCs w:val="15"/>
-          <w:lang w:val="en-US"/>
-        </w:rPr>
-        <w:t xml:space="preserve">    r.relationship_type,</w:t>
-      </w:r>
-    </w:p>
-    <w:p xmlns:wp14="http://schemas.microsoft.com/office/word/2010/wordml" wp14:textId="77777777">
-      <w:pPr>
-        <w:shd w:val="clear" w:color="auto" w:fill="F5F5F5"/>
-        <w:spacing w:after="0"/>
-      </w:pPr>
-      <w:r>
-        <w:rPr>
-          <w:rFonts w:ascii="Consolas" w:hAnsi="Consolas" w:eastAsia="Consolas" w:cs="Consolas"/>
-          <w:sz w:val="15"/>
-          <w:szCs w:val="15"/>
-          <w:lang w:val="en-US"/>
-        </w:rPr>
-        <w:t xml:space="preserve">    CASE WHEN r.end_date IS NULL THEN 'Active' ELSE 'Ended' END AS status</w:t>
-      </w:r>
-    </w:p>
-    <w:p xmlns:wp14="http://schemas.microsoft.com/office/word/2010/wordml" wp14:textId="77777777">
-      <w:pPr>
-        <w:shd w:val="clear" w:color="auto" w:fill="F5F5F5"/>
-        <w:spacing w:after="0"/>
-      </w:pPr>
-      <w:r>
-        <w:rPr>
-          <w:rFonts w:ascii="Consolas" w:hAnsi="Consolas" w:eastAsia="Consolas" w:cs="Consolas"/>
-          <w:sz w:val="15"/>
-          <w:szCs w:val="15"/>
-          <w:lang w:val="en-US"/>
-        </w:rPr>
-        <w:t>FROM ClubMember cm</w:t>
-      </w:r>
-    </w:p>
-    <w:p xmlns:wp14="http://schemas.microsoft.com/office/word/2010/wordml" wp14:textId="77777777">
-      <w:pPr>
-        <w:shd w:val="clear" w:color="auto" w:fill="F5F5F5"/>
-        <w:spacing w:after="0"/>
-      </w:pPr>
-      <w:r>
-        <w:rPr>
-          <w:rFonts w:ascii="Consolas" w:hAnsi="Consolas" w:eastAsia="Consolas" w:cs="Consolas"/>
-          <w:sz w:val="15"/>
-          <w:szCs w:val="15"/>
-          <w:lang w:val="en-US"/>
-        </w:rPr>
-        <w:t>JOIN FamilyMember fm ON fm.ssn = cm.ssn</w:t>
-      </w:r>
-    </w:p>
-    <w:p xmlns:wp14="http://schemas.microsoft.com/office/word/2010/wordml" wp14:textId="77777777">
-      <w:pPr>
-        <w:shd w:val="clear" w:color="auto" w:fill="F5F5F5"/>
-        <w:spacing w:after="0"/>
-      </w:pPr>
-      <w:r>
-        <w:rPr>
-          <w:rFonts w:ascii="Consolas" w:hAnsi="Consolas" w:eastAsia="Consolas" w:cs="Consolas"/>
-          <w:sz w:val="15"/>
-          <w:szCs w:val="15"/>
-          <w:lang w:val="en-US"/>
-        </w:rPr>
-        <w:t>JOIN ClubMemberFamilyRelation r ON r.family_member_id = fm.family_member_id</w:t>
-      </w:r>
-    </w:p>
-    <w:p xmlns:wp14="http://schemas.microsoft.com/office/word/2010/wordml" wp14:textId="77777777">
-      <w:pPr>
-        <w:shd w:val="clear" w:color="auto" w:fill="F5F5F5"/>
-        <w:spacing w:after="0"/>
-      </w:pPr>
-      <w:r>
-        <w:rPr>
-          <w:rFonts w:ascii="Consolas" w:hAnsi="Consolas" w:eastAsia="Consolas" w:cs="Consolas"/>
-          <w:sz w:val="15"/>
-          <w:szCs w:val="15"/>
-          <w:lang w:val="en-US"/>
-        </w:rPr>
-        <w:t>JOIN ClubMember child ON child.membership_number = r.membership_number</w:t>
-      </w:r>
-    </w:p>
-    <w:p xmlns:wp14="http://schemas.microsoft.com/office/word/2010/wordml" wp14:textId="77777777">
-      <w:pPr>
-        <w:shd w:val="clear" w:color="auto" w:fill="F5F5F5"/>
-        <w:spacing w:after="0"/>
-      </w:pPr>
-      <w:r>
-        <w:rPr>
-          <w:rFonts w:ascii="Consolas" w:hAnsi="Consolas" w:eastAsia="Consolas" w:cs="Consolas"/>
-          <w:sz w:val="15"/>
-          <w:szCs w:val="15"/>
-          <w:lang w:val="en-US"/>
-        </w:rPr>
-        <w:t>WHERE TIMESTAMPDIFF(YEAR, cm.date_of_birth, CURDATE()) &gt;= 18;</w:t>
-      </w:r>
-    </w:p>
-    <w:p xmlns:wp14="http://schemas.microsoft.com/office/word/2010/wordml" wp14:textId="77777777">
-      <w:pPr>
-        <w:shd w:val="clear" w:fill="F5F5F5"/>
-        <w:spacing w:after="0"/>
-      </w:pPr>
-      <w:r>
-        <w:rPr>
-          <w:rFonts w:ascii="Consolas" w:hAnsi="Consolas" w:eastAsia="Consolas" w:cs="Consolas"/>
-          <w:sz w:val="15"/>
-          <w:szCs w:val="15"/>
-        </w:rPr>
-        <w:t xml:space="preserve"> </w:t>
-      </w:r>
-    </w:p>
-    <w:p xmlns:wp14="http://schemas.microsoft.com/office/word/2010/wordml" wp14:textId="77777777">
-      <w:pPr>
-        <w:shd w:val="clear" w:fill="F5F5F5"/>
-        <w:spacing w:after="0"/>
-      </w:pPr>
-      <w:r>
-        <w:rPr>
-          <w:rFonts w:ascii="Consolas" w:hAnsi="Consolas" w:eastAsia="Consolas" w:cs="Consolas"/>
-          <w:sz w:val="15"/>
-          <w:szCs w:val="15"/>
-        </w:rPr>
-        <w:t xml:space="preserve"> </w:t>
-      </w:r>
-    </w:p>
-    <w:p xmlns:wp14="http://schemas.microsoft.com/office/word/2010/wordml" wp14:textId="77777777">
-      <w:pPr>
-        <w:shd w:val="clear" w:fill="F5F5F5"/>
-        <w:spacing w:after="0"/>
-      </w:pPr>
-      <w:r>
-        <w:rPr>
-          <w:rFonts w:ascii="Consolas" w:hAnsi="Consolas" w:eastAsia="Consolas" w:cs="Consolas"/>
-          <w:sz w:val="15"/>
-          <w:szCs w:val="15"/>
-        </w:rPr>
-        <w:t xml:space="preserve">-- QUERY-7 (vii): Fees, major members, 2023-2025</w:t>
-      </w:r>
-    </w:p>
-    <w:p xmlns:wp14="http://schemas.microsoft.com/office/word/2010/wordml" wp14:textId="77777777">
-      <w:pPr>
-        <w:shd w:val="clear" w:fill="F5F5F5"/>
-        <w:spacing w:after="0"/>
-      </w:pPr>
-      <w:r>
-        <w:rPr>
-          <w:rFonts w:ascii="Consolas" w:hAnsi="Consolas" w:eastAsia="Consolas" w:cs="Consolas"/>
-          <w:sz w:val="15"/>
-          <w:szCs w:val="15"/>
-        </w:rPr>
-        <w:t xml:space="preserve">SELECT</w:t>
-      </w:r>
-    </w:p>
-    <w:p xmlns:wp14="http://schemas.microsoft.com/office/word/2010/wordml" wp14:textId="77777777">
-      <w:pPr>
-        <w:shd w:val="clear" w:color="auto" w:fill="F5F5F5"/>
-        <w:spacing w:after="0"/>
-      </w:pPr>
-      <w:r>
-        <w:rPr>
-          <w:rFonts w:ascii="Consolas" w:hAnsi="Consolas" w:eastAsia="Consolas" w:cs="Consolas"/>
-          <w:sz w:val="15"/>
-          <w:szCs w:val="15"/>
-          <w:lang w:val="en-US"/>
-        </w:rPr>
-        <w:t xml:space="preserve">    cm.membership_number,</w:t>
-      </w:r>
-    </w:p>
-    <w:p xmlns:wp14="http://schemas.microsoft.com/office/word/2010/wordml" wp14:textId="77777777">
-      <w:pPr>
-        <w:shd w:val="clear" w:color="auto" w:fill="F5F5F5"/>
-        <w:spacing w:after="0"/>
-      </w:pPr>
-      <w:r>
-        <w:rPr>
-          <w:rFonts w:ascii="Consolas" w:hAnsi="Consolas" w:eastAsia="Consolas" w:cs="Consolas"/>
-          <w:sz w:val="15"/>
-          <w:szCs w:val="15"/>
-          <w:lang w:val="en-US"/>
-        </w:rPr>
-        <w:t xml:space="preserve">    CONCAT(cm.first_name, ' ', cm.last_name) AS member_name,</w:t>
-      </w:r>
-    </w:p>
-    <w:p xmlns:wp14="http://schemas.microsoft.com/office/word/2010/wordml" wp14:textId="77777777">
-      <w:pPr>
-        <w:shd w:val="clear" w:color="auto" w:fill="F5F5F5"/>
-        <w:spacing w:after="0"/>
-      </w:pPr>
-      <w:r>
-        <w:rPr>
-          <w:rFonts w:ascii="Consolas" w:hAnsi="Consolas" w:eastAsia="Consolas" w:cs="Consolas"/>
-          <w:sz w:val="15"/>
-          <w:szCs w:val="15"/>
-          <w:lang w:val="en-US"/>
-        </w:rPr>
-        <w:t xml:space="preserve">    p.membership_year,</w:t>
-      </w:r>
-    </w:p>
-    <w:p xmlns:wp14="http://schemas.microsoft.com/office/word/2010/wordml" wp14:textId="77777777">
-      <w:pPr>
-        <w:shd w:val="clear" w:color="auto" w:fill="F5F5F5"/>
-        <w:spacing w:after="0"/>
-      </w:pPr>
-      <w:r>
-        <w:rPr>
-          <w:rFonts w:ascii="Consolas" w:hAnsi="Consolas" w:eastAsia="Consolas" w:cs="Consolas"/>
-          <w:sz w:val="15"/>
-          <w:szCs w:val="15"/>
-          <w:lang w:val="en-US"/>
-        </w:rPr>
-        <w:t xml:space="preserve">    SUM(p.amount) AS total_paid</w:t>
-      </w:r>
-    </w:p>
-    <w:p xmlns:wp14="http://schemas.microsoft.com/office/word/2010/wordml" wp14:textId="77777777">
-      <w:pPr>
-        <w:shd w:val="clear" w:color="auto" w:fill="F5F5F5"/>
-        <w:spacing w:after="0"/>
-      </w:pPr>
-      <w:r>
-        <w:rPr>
-          <w:rFonts w:ascii="Consolas" w:hAnsi="Consolas" w:eastAsia="Consolas" w:cs="Consolas"/>
-          <w:sz w:val="15"/>
-          <w:szCs w:val="15"/>
-          <w:lang w:val="en-US"/>
-        </w:rPr>
-        <w:t>FROM ClubMember cm</w:t>
-      </w:r>
-    </w:p>
-    <w:p xmlns:wp14="http://schemas.microsoft.com/office/word/2010/wordml" wp14:textId="77777777">
-      <w:pPr>
-        <w:shd w:val="clear" w:color="auto" w:fill="F5F5F5"/>
-        <w:spacing w:after="0"/>
-      </w:pPr>
-      <w:r>
-        <w:rPr>
-          <w:rFonts w:ascii="Consolas" w:hAnsi="Consolas" w:eastAsia="Consolas" w:cs="Consolas"/>
-          <w:sz w:val="15"/>
-          <w:szCs w:val="15"/>
-          <w:lang w:val="en-US"/>
-        </w:rPr>
-        <w:t>JOIN Payment p ON p.membership_number = cm.membership_number</w:t>
-      </w:r>
-    </w:p>
-    <w:p xmlns:wp14="http://schemas.microsoft.com/office/word/2010/wordml" wp14:textId="77777777">
-      <w:pPr>
-        <w:shd w:val="clear" w:color="auto" w:fill="F5F5F5"/>
-        <w:spacing w:after="0"/>
-      </w:pPr>
-      <w:r>
-        <w:rPr>
-          <w:rFonts w:ascii="Consolas" w:hAnsi="Consolas" w:eastAsia="Consolas" w:cs="Consolas"/>
-          <w:sz w:val="15"/>
-          <w:szCs w:val="15"/>
-          <w:lang w:val="en-US"/>
-        </w:rPr>
-        <w:t>WHERE TIMESTAMPDIFF(YEAR, cm.date_of_birth, CURDATE()) &gt;= 18</w:t>
-      </w:r>
-    </w:p>
-    <w:p xmlns:wp14="http://schemas.microsoft.com/office/word/2010/wordml" wp14:textId="77777777">
-      <w:pPr>
-        <w:shd w:val="clear" w:color="auto" w:fill="F5F5F5"/>
-        <w:spacing w:after="0"/>
-      </w:pPr>
-      <w:r>
-        <w:rPr>
-          <w:rFonts w:ascii="Consolas" w:hAnsi="Consolas" w:eastAsia="Consolas" w:cs="Consolas"/>
-          <w:sz w:val="15"/>
-          <w:szCs w:val="15"/>
-          <w:lang w:val="en-US"/>
-        </w:rPr>
-        <w:t xml:space="preserve">  AND p.membership_year BETWEEN 2023 AND 2025</w:t>
-      </w:r>
-    </w:p>
-    <w:p xmlns:wp14="http://schemas.microsoft.com/office/word/2010/wordml" wp14:textId="77777777">
-      <w:pPr>
-        <w:shd w:val="clear" w:color="auto" w:fill="F5F5F5"/>
-        <w:spacing w:after="0"/>
-      </w:pPr>
-      <w:r>
-        <w:rPr>
-          <w:rFonts w:ascii="Consolas" w:hAnsi="Consolas" w:eastAsia="Consolas" w:cs="Consolas"/>
-          <w:sz w:val="15"/>
-          <w:szCs w:val="15"/>
-          <w:lang w:val="en-US"/>
-        </w:rPr>
-        <w:t>GROUP BY cm.membership_number, member_name, p.membership_year</w:t>
-      </w:r>
-    </w:p>
-    <w:p xmlns:wp14="http://schemas.microsoft.com/office/word/2010/wordml" wp14:textId="77777777">
-      <w:pPr>
-        <w:shd w:val="clear" w:color="auto" w:fill="F5F5F5"/>
-        <w:spacing w:after="0"/>
-      </w:pPr>
-      <w:r>
-        <w:rPr>
-          <w:rFonts w:ascii="Consolas" w:hAnsi="Consolas" w:eastAsia="Consolas" w:cs="Consolas"/>
-          <w:sz w:val="15"/>
-          <w:szCs w:val="15"/>
-          <w:lang w:val="en-US"/>
-        </w:rPr>
-        <w:t>ORDER BY cm.membership_number, p.membership_year;</w:t>
-      </w:r>
-    </w:p>
-    <w:p xmlns:wp14="http://schemas.microsoft.com/office/word/2010/wordml" wp14:textId="77777777">
-      <w:pPr>
-        <w:shd w:val="clear" w:fill="F5F5F5"/>
-        <w:spacing w:after="0"/>
-      </w:pPr>
-      <w:r>
-        <w:rPr>
-          <w:rFonts w:ascii="Consolas" w:hAnsi="Consolas" w:eastAsia="Consolas" w:cs="Consolas"/>
-          <w:sz w:val="15"/>
-          <w:szCs w:val="15"/>
-        </w:rPr>
-        <w:t xml:space="preserve"> </w:t>
-      </w:r>
-    </w:p>
-    <w:p xmlns:wp14="http://schemas.microsoft.com/office/word/2010/wordml" wp14:textId="77777777">
-      <w:pPr>
-        <w:shd w:val="clear" w:fill="F5F5F5"/>
-        <w:spacing w:after="0"/>
-      </w:pPr>
-      <w:r>
-        <w:rPr>
-          <w:rFonts w:ascii="Consolas" w:hAnsi="Consolas" w:eastAsia="Consolas" w:cs="Consolas"/>
-          <w:sz w:val="15"/>
-          <w:szCs w:val="15"/>
-        </w:rPr>
-        <w:t xml:space="preserve"> </w:t>
-      </w:r>
-    </w:p>
-    <w:p xmlns:wp14="http://schemas.microsoft.com/office/word/2010/wordml" wp14:textId="77777777">
-      <w:pPr>
-        <w:shd w:val="clear" w:fill="F5F5F5"/>
-        <w:spacing w:after="0"/>
-      </w:pPr>
-      <w:r>
-        <w:rPr>
-          <w:rFonts w:ascii="Consolas" w:hAnsi="Consolas" w:eastAsia="Consolas" w:cs="Consolas"/>
-          <w:sz w:val="15"/>
-          <w:szCs w:val="15"/>
-        </w:rPr>
-        <w:t xml:space="preserve">-- QUERY-8 (viii): Members with &gt;=4 FIFA games (all members)</w:t>
-      </w:r>
-    </w:p>
-    <w:p xmlns:wp14="http://schemas.microsoft.com/office/word/2010/wordml" wp14:textId="77777777">
-      <w:pPr>
-        <w:shd w:val="clear" w:fill="F5F5F5"/>
-        <w:spacing w:after="0"/>
-      </w:pPr>
-      <w:r>
-        <w:rPr>
-          <w:rFonts w:ascii="Consolas" w:hAnsi="Consolas" w:eastAsia="Consolas" w:cs="Consolas"/>
-          <w:sz w:val="15"/>
-          <w:szCs w:val="15"/>
-        </w:rPr>
-        <w:t xml:space="preserve">SELECT</w:t>
-      </w:r>
-    </w:p>
-    <w:p xmlns:wp14="http://schemas.microsoft.com/office/word/2010/wordml" wp14:textId="77777777">
-      <w:pPr>
-        <w:shd w:val="clear" w:color="auto" w:fill="F5F5F5"/>
-        <w:spacing w:after="0"/>
-      </w:pPr>
-      <w:r>
-        <w:rPr>
-          <w:rFonts w:ascii="Consolas" w:hAnsi="Consolas" w:eastAsia="Consolas" w:cs="Consolas"/>
-          <w:sz w:val="15"/>
-          <w:szCs w:val="15"/>
-          <w:lang w:val="en-US"/>
-        </w:rPr>
-        <w:t xml:space="preserve">    cm.membership_number,</w:t>
-      </w:r>
-    </w:p>
-    <w:p xmlns:wp14="http://schemas.microsoft.com/office/word/2010/wordml" wp14:textId="77777777">
-      <w:pPr>
-        <w:shd w:val="clear" w:color="auto" w:fill="F5F5F5"/>
-        <w:spacing w:after="0"/>
-      </w:pPr>
-      <w:r>
-        <w:rPr>
-          <w:rFonts w:ascii="Consolas" w:hAnsi="Consolas" w:eastAsia="Consolas" w:cs="Consolas"/>
-          <w:sz w:val="15"/>
-          <w:szCs w:val="15"/>
-          <w:lang w:val="en-US"/>
-        </w:rPr>
-        <w:t xml:space="preserve">    CONCAT(cm.first_name, ' ', cm.last_name) AS member_name,</w:t>
-      </w:r>
-    </w:p>
-    <w:p xmlns:wp14="http://schemas.microsoft.com/office/word/2010/wordml" wp14:textId="77777777">
-      <w:pPr>
-        <w:shd w:val="clear" w:color="auto" w:fill="F5F5F5"/>
-        <w:spacing w:after="0"/>
-      </w:pPr>
-      <w:r>
-        <w:rPr>
-          <w:rFonts w:ascii="Consolas" w:hAnsi="Consolas" w:eastAsia="Consolas" w:cs="Consolas"/>
-          <w:sz w:val="15"/>
-          <w:szCs w:val="15"/>
-          <w:lang w:val="en-US"/>
-        </w:rPr>
-        <w:t xml:space="preserve">    COUNT(fp.game_id) AS games_played</w:t>
-      </w:r>
-    </w:p>
-    <w:p xmlns:wp14="http://schemas.microsoft.com/office/word/2010/wordml" wp14:textId="77777777">
-      <w:pPr>
-        <w:shd w:val="clear" w:color="auto" w:fill="F5F5F5"/>
-        <w:spacing w:after="0"/>
-      </w:pPr>
-      <w:r>
-        <w:rPr>
-          <w:rFonts w:ascii="Consolas" w:hAnsi="Consolas" w:eastAsia="Consolas" w:cs="Consolas"/>
-          <w:sz w:val="15"/>
-          <w:szCs w:val="15"/>
-          <w:lang w:val="en-US"/>
-        </w:rPr>
-        <w:t>FROM ClubMember cm</w:t>
-      </w:r>
-    </w:p>
-    <w:p xmlns:wp14="http://schemas.microsoft.com/office/word/2010/wordml" wp14:textId="77777777">
-      <w:pPr>
-        <w:shd w:val="clear" w:color="auto" w:fill="F5F5F5"/>
-        <w:spacing w:after="0"/>
-      </w:pPr>
-      <w:r>
-        <w:rPr>
-          <w:rFonts w:ascii="Consolas" w:hAnsi="Consolas" w:eastAsia="Consolas" w:cs="Consolas"/>
-          <w:sz w:val="15"/>
-          <w:szCs w:val="15"/>
-          <w:lang w:val="en-US"/>
-        </w:rPr>
-        <w:t>JOIN FIFAParticipation fp ON fp.membership_number = cm.membership_number</w:t>
-      </w:r>
-    </w:p>
-    <w:p xmlns:wp14="http://schemas.microsoft.com/office/word/2010/wordml" wp14:textId="77777777">
-      <w:pPr>
-        <w:shd w:val="clear" w:color="auto" w:fill="F5F5F5"/>
-        <w:spacing w:after="0"/>
-      </w:pPr>
-      <w:r>
-        <w:rPr>
-          <w:rFonts w:ascii="Consolas" w:hAnsi="Consolas" w:eastAsia="Consolas" w:cs="Consolas"/>
-          <w:sz w:val="15"/>
-          <w:szCs w:val="15"/>
-          <w:lang w:val="en-US"/>
-        </w:rPr>
-        <w:t>GROUP BY cm.membership_number, member_name</w:t>
-      </w:r>
-    </w:p>
-    <w:p xmlns:wp14="http://schemas.microsoft.com/office/word/2010/wordml" wp14:textId="77777777">
-      <w:pPr>
-        <w:shd w:val="clear" w:color="auto" w:fill="F5F5F5"/>
-        <w:spacing w:after="0"/>
-      </w:pPr>
-      <w:r>
-        <w:rPr>
-          <w:rFonts w:ascii="Consolas" w:hAnsi="Consolas" w:eastAsia="Consolas" w:cs="Consolas"/>
-          <w:sz w:val="15"/>
-          <w:szCs w:val="15"/>
-          <w:lang w:val="en-US"/>
-        </w:rPr>
-        <w:t>HAVING COUNT(fp.game_id) &gt;= 4;</w:t>
-      </w:r>
-    </w:p>
-    <w:p xmlns:wp14="http://schemas.microsoft.com/office/word/2010/wordml" wp14:textId="77777777">
       <w:r>
         <w:br w:type="page"/>
       </w:r>
+    </w:p>
+    <w:p>
+      <w:pPr>
+        <w:pStyle w:val="Heading1"/>
+        <w:spacing w:before="400" w:after="200"/>
+      </w:pPr>
+      <w:r>
+        <w:drawing>
+          <wp:inline wp14:editId="1D04568E" wp14:anchorId="589F2D60">
+            <wp:extent cx="6400800" cy="4810125"/>
+            <wp:effectExtent l="0" t="0" r="0" b="0"/>
+            <wp:docPr id="676957827" name="drawing"/>
+            <wp:cNvGraphicFramePr>
+              <a:graphicFrameLocks noChangeAspect="1"/>
+            </wp:cNvGraphicFramePr>
+            <a:graphic>
+              <a:graphicData xmlns:a="http://schemas.openxmlformats.org/drawingml/2006/main" uri="http://schemas.openxmlformats.org/drawingml/2006/picture">
+                <pic:pic xmlns:pic="http://schemas.openxmlformats.org/drawingml/2006/picture">
+                  <pic:nvPicPr>
+                    <pic:cNvPr id="676957827" name="Picture 676957827"/>
+                    <pic:cNvPicPr/>
+                  </pic:nvPicPr>
+                  <pic:blipFill>
+                    <a:blip xmlns:r="http://schemas.openxmlformats.org/officeDocument/2006/relationships" r:embed="rId1109971809">
+                      <a:extLst>
+                        <a:ext uri="{28A0092B-C50C-407E-A947-70E740481C1C}">
+                          <a14:useLocalDpi xmlns:a14="http://schemas.microsoft.com/office/drawing/2010/main"/>
+                        </a:ext>
+                      </a:extLst>
+                    </a:blip>
+                    <a:stretch>
+                      <a:fillRect/>
+                    </a:stretch>
+                  </pic:blipFill>
+                  <pic:spPr>
+                    <a:xfrm>
+                      <a:off x="0" y="0"/>
+                      <a:ext cx="6400800" cy="4810125"/>
+                    </a:xfrm>
+                    <a:prstGeom prst="rect">
+                      <a:avLst/>
+                    </a:prstGeom>
+                  </pic:spPr>
+                </pic:pic>
+              </a:graphicData>
+            </a:graphic>
+          </wp:inline>
+        </w:drawing>
+      </w:r>
+    </w:p>
+    <w:p>
+      <w:pPr>
+        <w:pStyle w:val="Heading1"/>
+        <w:spacing w:before="400" w:after="200"/>
+      </w:pPr>
+      <w:r>
+        <w:drawing>
+          <wp:inline wp14:editId="7A24D587" wp14:anchorId="03A1AD41">
+            <wp:extent cx="6400800" cy="5610225"/>
+            <wp:effectExtent l="0" t="0" r="0" b="0"/>
+            <wp:docPr id="1494434824" name="drawing"/>
+            <wp:cNvGraphicFramePr>
+              <a:graphicFrameLocks noChangeAspect="1"/>
+            </wp:cNvGraphicFramePr>
+            <a:graphic>
+              <a:graphicData xmlns:a="http://schemas.openxmlformats.org/drawingml/2006/main" uri="http://schemas.openxmlformats.org/drawingml/2006/picture">
+                <pic:pic xmlns:pic="http://schemas.openxmlformats.org/drawingml/2006/picture">
+                  <pic:nvPicPr>
+                    <pic:cNvPr id="1494434824" name="Picture 1494434824"/>
+                    <pic:cNvPicPr/>
+                  </pic:nvPicPr>
+                  <pic:blipFill>
+                    <a:blip xmlns:r="http://schemas.openxmlformats.org/officeDocument/2006/relationships" r:embed="rId990522009">
+                      <a:extLst>
+                        <a:ext uri="{28A0092B-C50C-407E-A947-70E740481C1C}">
+                          <a14:useLocalDpi xmlns:a14="http://schemas.microsoft.com/office/drawing/2010/main"/>
+                        </a:ext>
+                      </a:extLst>
+                    </a:blip>
+                    <a:stretch>
+                      <a:fillRect/>
+                    </a:stretch>
+                  </pic:blipFill>
+                  <pic:spPr>
+                    <a:xfrm>
+                      <a:off x="0" y="0"/>
+                      <a:ext cx="6400800" cy="5610225"/>
+                    </a:xfrm>
+                    <a:prstGeom prst="rect">
+                      <a:avLst/>
+                    </a:prstGeom>
+                  </pic:spPr>
+                </pic:pic>
+              </a:graphicData>
+            </a:graphic>
+          </wp:inline>
+        </w:drawing>
+      </w:r>
+    </w:p>
+    <w:p>
+      <w:pPr>
+        <w:pStyle w:val="Normal"/>
+      </w:pPr>
+      <w:r>
+        <w:drawing>
+          <wp:inline wp14:editId="4E16A934" wp14:anchorId="0A491435">
+            <wp:extent cx="4064209" cy="2844946"/>
+            <wp:effectExtent l="0" t="0" r="0" b="0"/>
+            <wp:docPr id="659494926" name="drawing"/>
+            <wp:cNvGraphicFramePr>
+              <a:graphicFrameLocks noChangeAspect="1"/>
+            </wp:cNvGraphicFramePr>
+            <a:graphic>
+              <a:graphicData xmlns:a="http://schemas.openxmlformats.org/drawingml/2006/main" uri="http://schemas.openxmlformats.org/drawingml/2006/picture">
+                <pic:pic xmlns:pic="http://schemas.openxmlformats.org/drawingml/2006/picture">
+                  <pic:nvPicPr>
+                    <pic:cNvPr id="659494926" name="Picture 659494926"/>
+                    <pic:cNvPicPr/>
+                  </pic:nvPicPr>
+                  <pic:blipFill>
+                    <a:blip xmlns:r="http://schemas.openxmlformats.org/officeDocument/2006/relationships" r:embed="rId1280761025">
+                      <a:extLst>
+                        <a:ext uri="{28A0092B-C50C-407E-A947-70E740481C1C}">
+                          <a14:useLocalDpi xmlns:a14="http://schemas.microsoft.com/office/drawing/2010/main"/>
+                        </a:ext>
+                      </a:extLst>
+                    </a:blip>
+                    <a:stretch>
+                      <a:fillRect/>
+                    </a:stretch>
+                  </pic:blipFill>
+                  <pic:spPr>
+                    <a:xfrm>
+                      <a:off x="0" y="0"/>
+                      <a:ext cx="4064209" cy="2844946"/>
+                    </a:xfrm>
+                    <a:prstGeom prst="rect">
+                      <a:avLst/>
+                    </a:prstGeom>
+                  </pic:spPr>
+                </pic:pic>
+              </a:graphicData>
+            </a:graphic>
+          </wp:inline>
+        </w:drawing>
+      </w:r>
+    </w:p>
+    <w:p>
+      <w:pPr>
+        <w:pStyle w:val="Heading1"/>
+        <w:spacing w:before="400" w:after="200"/>
+      </w:pPr>
+      <w:r>
+        <w:drawing>
+          <wp:inline wp14:editId="3B2EADC9" wp14:anchorId="26455752">
+            <wp:extent cx="6400800" cy="1219200"/>
+            <wp:effectExtent l="0" t="0" r="0" b="0"/>
+            <wp:docPr id="1452446744" name="drawing"/>
+            <wp:cNvGraphicFramePr>
+              <a:graphicFrameLocks noChangeAspect="1"/>
+            </wp:cNvGraphicFramePr>
+            <a:graphic>
+              <a:graphicData xmlns:a="http://schemas.openxmlformats.org/drawingml/2006/main" uri="http://schemas.openxmlformats.org/drawingml/2006/picture">
+                <pic:pic xmlns:pic="http://schemas.openxmlformats.org/drawingml/2006/picture">
+                  <pic:nvPicPr>
+                    <pic:cNvPr id="1452446744" name="Picture 1452446744"/>
+                    <pic:cNvPicPr/>
+                  </pic:nvPicPr>
+                  <pic:blipFill>
+                    <a:blip xmlns:r="http://schemas.openxmlformats.org/officeDocument/2006/relationships" r:embed="rId1916536038">
+                      <a:extLst>
+                        <a:ext uri="{28A0092B-C50C-407E-A947-70E740481C1C}">
+                          <a14:useLocalDpi xmlns:a14="http://schemas.microsoft.com/office/drawing/2010/main"/>
+                        </a:ext>
+                      </a:extLst>
+                    </a:blip>
+                    <a:stretch>
+                      <a:fillRect/>
+                    </a:stretch>
+                  </pic:blipFill>
+                  <pic:spPr>
+                    <a:xfrm>
+                      <a:off x="0" y="0"/>
+                      <a:ext cx="6400800" cy="1219200"/>
+                    </a:xfrm>
+                    <a:prstGeom prst="rect">
+                      <a:avLst/>
+                    </a:prstGeom>
+                  </pic:spPr>
+                </pic:pic>
+              </a:graphicData>
+            </a:graphic>
+          </wp:inline>
+        </w:drawing>
+      </w:r>
+    </w:p>
+    <w:p>
+      <w:pPr>
+        <w:pStyle w:val="Heading1"/>
+        <w:spacing w:before="400" w:after="200"/>
+      </w:pPr>
+      <w:r>
+        <w:drawing>
+          <wp:inline wp14:editId="6781361E" wp14:anchorId="00F00F8A">
+            <wp:extent cx="4711942" cy="3606985"/>
+            <wp:effectExtent l="0" t="0" r="0" b="0"/>
+            <wp:docPr id="1948765067" name="drawing"/>
+            <wp:cNvGraphicFramePr>
+              <a:graphicFrameLocks noChangeAspect="1"/>
+            </wp:cNvGraphicFramePr>
+            <a:graphic>
+              <a:graphicData xmlns:a="http://schemas.openxmlformats.org/drawingml/2006/main" uri="http://schemas.openxmlformats.org/drawingml/2006/picture">
+                <pic:pic xmlns:pic="http://schemas.openxmlformats.org/drawingml/2006/picture">
+                  <pic:nvPicPr>
+                    <pic:cNvPr id="1948765067" name="Picture 1948765067"/>
+                    <pic:cNvPicPr/>
+                  </pic:nvPicPr>
+                  <pic:blipFill>
+                    <a:blip xmlns:r="http://schemas.openxmlformats.org/officeDocument/2006/relationships" r:embed="rId1774789344">
+                      <a:extLst>
+                        <a:ext uri="{28A0092B-C50C-407E-A947-70E740481C1C}">
+                          <a14:useLocalDpi xmlns:a14="http://schemas.microsoft.com/office/drawing/2010/main"/>
+                        </a:ext>
+                      </a:extLst>
+                    </a:blip>
+                    <a:stretch>
+                      <a:fillRect/>
+                    </a:stretch>
+                  </pic:blipFill>
+                  <pic:spPr>
+                    <a:xfrm>
+                      <a:off x="0" y="0"/>
+                      <a:ext cx="4711942" cy="3606985"/>
+                    </a:xfrm>
+                    <a:prstGeom prst="rect">
+                      <a:avLst/>
+                    </a:prstGeom>
+                  </pic:spPr>
+                </pic:pic>
+              </a:graphicData>
+            </a:graphic>
+          </wp:inline>
+        </w:drawing>
+      </w:r>
+    </w:p>
+    <w:p>
+      <w:pPr>
+        <w:pStyle w:val="Heading1"/>
+        <w:spacing w:before="400" w:after="200"/>
+      </w:pPr>
+      <w:r>
+        <w:drawing>
+          <wp:inline wp14:editId="2C0FC979" wp14:anchorId="36C12C10">
+            <wp:extent cx="4965955" cy="2133710"/>
+            <wp:effectExtent l="0" t="0" r="0" b="0"/>
+            <wp:docPr id="1806373459" name="drawing"/>
+            <wp:cNvGraphicFramePr>
+              <a:graphicFrameLocks noChangeAspect="1"/>
+            </wp:cNvGraphicFramePr>
+            <a:graphic>
+              <a:graphicData xmlns:a="http://schemas.openxmlformats.org/drawingml/2006/main" uri="http://schemas.openxmlformats.org/drawingml/2006/picture">
+                <pic:pic xmlns:pic="http://schemas.openxmlformats.org/drawingml/2006/picture">
+                  <pic:nvPicPr>
+                    <pic:cNvPr id="1806373459" name="Picture 1806373459"/>
+                    <pic:cNvPicPr/>
+                  </pic:nvPicPr>
+                  <pic:blipFill>
+                    <a:blip xmlns:r="http://schemas.openxmlformats.org/officeDocument/2006/relationships" r:embed="rId1550245307">
+                      <a:extLst>
+                        <a:ext uri="{28A0092B-C50C-407E-A947-70E740481C1C}">
+                          <a14:useLocalDpi xmlns:a14="http://schemas.microsoft.com/office/drawing/2010/main"/>
+                        </a:ext>
+                      </a:extLst>
+                    </a:blip>
+                    <a:stretch>
+                      <a:fillRect/>
+                    </a:stretch>
+                  </pic:blipFill>
+                  <pic:spPr>
+                    <a:xfrm>
+                      <a:off x="0" y="0"/>
+                      <a:ext cx="4965955" cy="2133710"/>
+                    </a:xfrm>
+                    <a:prstGeom prst="rect">
+                      <a:avLst/>
+                    </a:prstGeom>
+                  </pic:spPr>
+                </pic:pic>
+              </a:graphicData>
+            </a:graphic>
+          </wp:inline>
+        </w:drawing>
+      </w:r>
+    </w:p>
+    <w:p>
+      <w:pPr>
+        <w:pStyle w:val="Normal"/>
+      </w:pPr>
+    </w:p>
+    <w:p>
+      <w:pPr>
+        <w:pStyle w:val="Normal"/>
+      </w:pPr>
+    </w:p>
+    <w:p>
+      <w:pPr>
+        <w:pStyle w:val="Normal"/>
+      </w:pPr>
+    </w:p>
+    <w:p>
+      <w:pPr>
+        <w:pStyle w:val="Normal"/>
+      </w:pPr>
+    </w:p>
+    <w:p>
+      <w:pPr>
+        <w:pStyle w:val="Normal"/>
+      </w:pPr>
+    </w:p>
+    <w:p>
+      <w:pPr>
+        <w:pStyle w:val="Normal"/>
+      </w:pPr>
+    </w:p>
+    <w:p>
+      <w:pPr>
+        <w:pStyle w:val="Normal"/>
+      </w:pPr>
+    </w:p>
+    <w:p>
+      <w:pPr>
+        <w:pStyle w:val="Normal"/>
+      </w:pPr>
+    </w:p>
+    <w:p>
+      <w:pPr>
+        <w:pStyle w:val="Normal"/>
+      </w:pPr>
+    </w:p>
+    <w:p>
+      <w:pPr>
+        <w:pStyle w:val="Normal"/>
+      </w:pPr>
+    </w:p>
+    <w:p>
+      <w:pPr>
+        <w:pStyle w:val="Normal"/>
+      </w:pPr>
+    </w:p>
+    <w:p>
+      <w:pPr>
+        <w:pStyle w:val="Normal"/>
+      </w:pPr>
+    </w:p>
+    <w:p>
+      <w:pPr>
+        <w:pStyle w:val="Normal"/>
+      </w:pPr>
+    </w:p>
+    <w:p>
+      <w:pPr>
+        <w:pStyle w:val="Normal"/>
+      </w:pPr>
+    </w:p>
+    <w:p>
+      <w:pPr>
+        <w:pStyle w:val="Normal"/>
+      </w:pPr>
+    </w:p>
+    <w:p>
+      <w:pPr>
+        <w:pStyle w:val="Normal"/>
+      </w:pPr>
+    </w:p>
+    <w:p>
+      <w:pPr>
+        <w:pStyle w:val="Normal"/>
+      </w:pPr>
+    </w:p>
+    <w:p>
+      <w:pPr>
+        <w:pStyle w:val="Normal"/>
+      </w:pPr>
+    </w:p>
+    <w:p>
+      <w:pPr>
+        <w:pStyle w:val="Normal"/>
+      </w:pPr>
+    </w:p>
+    <w:p>
+      <w:pPr>
+        <w:pStyle w:val="Normal"/>
+      </w:pPr>
+    </w:p>
+    <w:p>
+      <w:pPr>
+        <w:pStyle w:val="Normal"/>
+      </w:pPr>
+    </w:p>
+    <w:p>
+      <w:pPr>
+        <w:pStyle w:val="Normal"/>
+      </w:pPr>
+    </w:p>
+    <w:p>
+      <w:pPr>
+        <w:pStyle w:val="Normal"/>
+      </w:pPr>
+    </w:p>
+    <w:p>
+      <w:pPr>
+        <w:pStyle w:val="Normal"/>
+      </w:pPr>
+    </w:p>
+    <w:p>
+      <w:pPr>
+        <w:pStyle w:val="Normal"/>
+      </w:pPr>
+    </w:p>
+    <w:p>
+      <w:pPr>
+        <w:pStyle w:val="Normal"/>
+      </w:pPr>
+    </w:p>
+    <w:p>
+      <w:pPr>
+        <w:pStyle w:val="Normal"/>
+      </w:pPr>
+    </w:p>
+    <w:p>
+      <w:pPr>
+        <w:pStyle w:val="Normal"/>
+      </w:pPr>
+    </w:p>
+    <w:p>
+      <w:pPr>
+        <w:pStyle w:val="Normal"/>
+      </w:pPr>
+    </w:p>
+    <w:p>
+      <w:pPr>
+        <w:pStyle w:val="Normal"/>
+      </w:pPr>
+    </w:p>
+    <w:p>
+      <w:pPr>
+        <w:pStyle w:val="Normal"/>
+      </w:pPr>
+    </w:p>
+    <w:p>
+      <w:pPr>
+        <w:pStyle w:val="Normal"/>
+      </w:pPr>
+    </w:p>
+    <w:p>
+      <w:pPr>
+        <w:pStyle w:val="Normal"/>
+      </w:pPr>
+    </w:p>
+    <w:p>
+      <w:pPr>
+        <w:pStyle w:val="Normal"/>
+      </w:pPr>
+    </w:p>
+    <w:p>
+      <w:pPr>
+        <w:pStyle w:val="Normal"/>
+      </w:pPr>
+    </w:p>
+    <w:p>
+      <w:pPr>
+        <w:pStyle w:val="Normal"/>
+      </w:pPr>
+    </w:p>
+    <w:p>
+      <w:pPr>
+        <w:pStyle w:val="Heading1"/>
+        <w:spacing w:before="400" w:after="200"/>
+      </w:pPr>
     </w:p>
     <w:p xmlns:wp14="http://schemas.microsoft.com/office/word/2010/wordml" wp14:textId="77777777">
       <w:pPr>
@@ -35013,7 +32218,7 @@
         <w:t>UNION ALL SELECT 'FIFAGame', COUNT(*) FROM FIFAGame</w:t>
       </w:r>
     </w:p>
-    <w:p xmlns:wp14="http://schemas.microsoft.com/office/word/2010/wordml" wp14:textId="7144EC8B">
+    <w:p>
       <w:pPr>
         <w:shd w:val="clear" w:color="auto" w:fill="F5F5F5"/>
         <w:spacing w:before="300" w:after="0"/>
@@ -35025,7 +32230,7 @@
           <w:szCs w:val="15"/>
           <w:lang w:val="en-US"/>
         </w:rPr>
-        <w:t>UNION ALL SELECT '</w:t>
+        <w:t xml:space="preserve">UNION ALL </w:t>
       </w:r>
       <w:r>
         <w:rPr>
@@ -35034,7 +32239,7 @@
           <w:szCs w:val="15"/>
           <w:lang w:val="en-US"/>
         </w:rPr>
-        <w:t>FIFAParticipation</w:t>
+        <w:t>SELECT '</w:t>
       </w:r>
       <w:r>
         <w:rPr>
@@ -35043,7 +32248,7 @@
           <w:szCs w:val="15"/>
           <w:lang w:val="en-US"/>
         </w:rPr>
-        <w:t xml:space="preserve">', </w:t>
+        <w:t>FIF</w:t>
       </w:r>
       <w:r>
         <w:rPr>
@@ -35052,7 +32257,7 @@
           <w:szCs w:val="15"/>
           <w:lang w:val="en-US"/>
         </w:rPr>
-        <w:t>COUNT(</w:t>
+        <w:t>AParti</w:t>
       </w:r>
       <w:r>
         <w:rPr>
@@ -35061,7 +32266,52 @@
           <w:szCs w:val="15"/>
           <w:lang w:val="en-US"/>
         </w:rPr>
-        <w:t xml:space="preserve">*) FROM </w:t>
+        <w:t>cipation</w:t>
+      </w:r>
+      <w:r>
+        <w:rPr>
+          <w:rFonts w:ascii="Consolas" w:hAnsi="Consolas" w:eastAsia="Consolas" w:cs="Consolas"/>
+          <w:sz w:val="15"/>
+          <w:szCs w:val="15"/>
+          <w:lang w:val="en-US"/>
+        </w:rPr>
+        <w:t xml:space="preserve">', </w:t>
+      </w:r>
+      <w:r>
+        <w:rPr>
+          <w:rFonts w:ascii="Consolas" w:hAnsi="Consolas" w:eastAsia="Consolas" w:cs="Consolas"/>
+          <w:sz w:val="15"/>
+          <w:szCs w:val="15"/>
+          <w:lang w:val="en-US"/>
+        </w:rPr>
+        <w:t>COUNT(</w:t>
+      </w:r>
+      <w:r>
+        <w:rPr>
+          <w:rFonts w:ascii="Consolas" w:hAnsi="Consolas" w:eastAsia="Consolas" w:cs="Consolas"/>
+          <w:sz w:val="15"/>
+          <w:szCs w:val="15"/>
+          <w:lang w:val="en-US"/>
+        </w:rPr>
+        <w:t>*)</w:t>
+      </w:r>
+      <w:r>
+        <w:rPr>
+          <w:rFonts w:ascii="Consolas" w:hAnsi="Consolas" w:eastAsia="Consolas" w:cs="Consolas"/>
+          <w:sz w:val="15"/>
+          <w:szCs w:val="15"/>
+          <w:lang w:val="en-US"/>
+        </w:rPr>
+        <w:t xml:space="preserve"> FR</w:t>
+      </w:r>
+      <w:r>
+        <w:rPr>
+          <w:rFonts w:ascii="Consolas" w:hAnsi="Consolas" w:eastAsia="Consolas" w:cs="Consolas"/>
+          <w:sz w:val="15"/>
+          <w:szCs w:val="15"/>
+          <w:lang w:val="en-US"/>
+        </w:rPr>
+        <w:t xml:space="preserve">OM </w:t>
       </w:r>
       <w:r>
         <w:rPr>

</xml_diff>